<commit_message>
docs: integrate enterprise Data Guard practices into SHAMS
</commit_message>
<xml_diff>
--- a/artifacts/shams_project/SHAMS_PROJECT_RUN_SHEET_VARIANTI.docx
+++ b/artifacts/shams_project/SHAMS_PROJECT_RUN_SHEET_VARIANTI.docx
@@ -2,11 +2,52 @@
 <file path=word/document.xml><?xml version="1.0" encoding="utf-8"?>
 <w:document xmlns:wpc="http://schemas.microsoft.com/office/word/2010/wordprocessingCanvas" xmlns:cx="http://schemas.microsoft.com/office/drawing/2014/chartex" xmlns:cx1="http://schemas.microsoft.com/office/drawing/2015/9/8/chartex" xmlns:cx2="http://schemas.microsoft.com/office/drawing/2015/10/21/chartex" xmlns:cx3="http://schemas.microsoft.com/office/drawing/2016/5/9/chartex" xmlns:cx4="http://schemas.microsoft.com/office/drawing/2016/5/10/chartex" xmlns:cx5="http://schemas.microsoft.com/office/drawing/2016/5/11/chartex" xmlns:cx6="http://schemas.microsoft.com/office/drawing/2016/5/12/chartex" xmlns:cx7="http://schemas.microsoft.com/office/drawing/2016/5/13/chartex" xmlns:cx8="http://schemas.microsoft.com/office/drawing/2016/5/14/chartex" xmlns:mc="http://schemas.openxmlformats.org/markup-compatibility/2006" xmlns:aink="http://schemas.microsoft.com/office/drawing/2016/ink" xmlns:am3d="http://schemas.microsoft.com/office/drawing/2017/model3d" xmlns:o="urn:schemas-microsoft-com:office:office" xmlns:oel="http://schemas.microsoft.com/office/2019/extlst" xmlns:r="http://schemas.openxmlformats.org/officeDocument/2006/relationships" xmlns:m="http://schemas.openxmlformats.org/officeDocument/2006/math" xmlns:v="urn:schemas-microsoft-com:vml" xmlns:wp14="http://schemas.microsoft.com/office/word/2010/wordprocessingDrawing" xmlns:wp="http://schemas.openxmlformats.org/drawingml/2006/wordprocessingDrawing" xmlns:w10="urn:schemas-microsoft-com:office:word" xmlns:w="http://schemas.openxmlformats.org/wordprocessingml/2006/main" xmlns:w14="http://schemas.microsoft.com/office/word/2010/wordml" xmlns:w15="http://schemas.microsoft.com/office/word/2012/wordml" xmlns:w16cex="http://schemas.microsoft.com/office/word/2018/wordml/cex" xmlns:w16cid="http://schemas.microsoft.com/office/word/2016/wordml/cid" xmlns:w16="http://schemas.microsoft.com/office/word/2018/wordml" xmlns:w16du="http://schemas.microsoft.com/office/word/2023/wordml/word16du" xmlns:w16sdtdh="http://schemas.microsoft.com/office/word/2020/wordml/sdtdatahash" xmlns:w16sdtfl="http://schemas.microsoft.com/office/word/2024/wordml/sdtformatlock" xmlns:w16se="http://schemas.microsoft.com/office/word/2015/wordml/symex" xmlns:wpg="http://schemas.microsoft.com/office/word/2010/wordprocessingGroup" xmlns:wpi="http://schemas.microsoft.com/office/word/2010/wordprocessingInk" xmlns:wne="http://schemas.microsoft.com/office/word/2006/wordml" xmlns:wps="http://schemas.microsoft.com/office/word/2010/wordprocessingShape" mc:Ignorable="w14 w15 w16se w16cid w16 w16cex w16sdtdh w16sdtfl w16du wp14">
   <w:body>
+    <w:p/>
+    <w:p/>
+    <w:p/>
+    <w:p>
+      <w:pPr>
+        <w:pStyle w:val="Heading2"/>
+      </w:pPr>
+      <w:r>
+        <w:t>SHAMS PROJECT</w:t>
+      </w:r>
+    </w:p>
     <w:p>
       <w:pPr>
         <w:pStyle w:val="Title"/>
       </w:pPr>
       <w:r>
+        <w:t>SHAMS PROJECT - Run Sheet Scelta Blueprint</w:t>
+      </w:r>
+    </w:p>
+    <w:p>
+      <w:pPr>
+        <w:pStyle w:val="Heading2"/>
+      </w:pPr>
+      <w:r>
+        <w:t>Oracle Database 19c | Data Guard Enterprise Blueprint</w:t>
+      </w:r>
+    </w:p>
+    <w:p>
+      <w:r>
+        <w:t>Documento operativo PEYTECH - verificare sempre blueprint, ambiente, licenze e placeholder prima dell'esecuzione.</w:t>
+      </w:r>
+    </w:p>
+    <w:p>
+      <w:pPr>
+        <w:spacing w:after="160" w:line="278" w:lineRule="auto"/>
+      </w:pPr>
+      <w:r>
+        <w:br w:type="page"/>
+      </w:r>
+    </w:p>
+    <w:p>
+      <w:pPr>
+        <w:pStyle w:val="Title"/>
+      </w:pPr>
+      <w:r>
+        <w:lastRenderedPageBreak/>
         <w:t>SHAMS PROJECT: Run Sheet Scelta Blueprint</w:t>
       </w:r>
     </w:p>
@@ -39,30 +80,42 @@
     <w:tbl>
       <w:tblPr>
         <w:tblStyle w:val="TableGrid"/>
-        <w:tblW w:w="5000" w:type="pct"/>
+        <w:tblW w:w="9360" w:type="dxa"/>
+        <w:tblLayout w:type="fixed"/>
+        <w:tblCellMar>
+          <w:top w:w="80" w:type="dxa"/>
+          <w:left w:w="120" w:type="dxa"/>
+          <w:bottom w:w="80" w:type="dxa"/>
+          <w:right w:w="120" w:type="dxa"/>
+        </w:tblCellMar>
         <w:tblLook w:val="04A0" w:firstRow="1" w:lastRow="0" w:firstColumn="1" w:lastColumn="0" w:noHBand="0" w:noVBand="1"/>
       </w:tblPr>
       <w:tblGrid>
-        <w:gridCol w:w="2494"/>
-        <w:gridCol w:w="2494"/>
-        <w:gridCol w:w="2494"/>
-        <w:gridCol w:w="2494"/>
+        <w:gridCol w:w="2340"/>
+        <w:gridCol w:w="2340"/>
+        <w:gridCol w:w="2340"/>
+        <w:gridCol w:w="2340"/>
       </w:tblGrid>
       <w:tr>
-        <w:tc>
-          <w:tcPr>
-            <w:tcW w:w="1250" w:type="pct"/>
+        <w:trPr>
+          <w:tblHeader/>
+        </w:trPr>
+        <w:tc>
+          <w:tcPr>
+            <w:tcW w:w="2340" w:type="dxa"/>
             <w:shd w:val="clear" w:color="auto" w:fill="E6E6E6"/>
           </w:tcPr>
           <w:p>
             <w:pPr>
               <w:rPr>
+                <w:rFonts w:ascii="Aptos" w:hAnsi="Aptos"/>
                 <w:b/>
                 <w:sz w:val="15"/>
               </w:rPr>
             </w:pPr>
             <w:r>
               <w:rPr>
+                <w:rFonts w:ascii="Aptos" w:hAnsi="Aptos"/>
                 <w:b/>
                 <w:sz w:val="15"/>
               </w:rPr>
@@ -72,18 +125,20 @@
         </w:tc>
         <w:tc>
           <w:tcPr>
-            <w:tcW w:w="1250" w:type="pct"/>
+            <w:tcW w:w="2340" w:type="dxa"/>
             <w:shd w:val="clear" w:color="auto" w:fill="E6E6E6"/>
           </w:tcPr>
           <w:p>
             <w:pPr>
               <w:rPr>
+                <w:rFonts w:ascii="Aptos" w:hAnsi="Aptos"/>
                 <w:b/>
                 <w:sz w:val="15"/>
               </w:rPr>
             </w:pPr>
             <w:r>
               <w:rPr>
+                <w:rFonts w:ascii="Aptos" w:hAnsi="Aptos"/>
                 <w:b/>
                 <w:sz w:val="15"/>
               </w:rPr>
@@ -93,18 +148,20 @@
         </w:tc>
         <w:tc>
           <w:tcPr>
-            <w:tcW w:w="1250" w:type="pct"/>
+            <w:tcW w:w="2340" w:type="dxa"/>
             <w:shd w:val="clear" w:color="auto" w:fill="E6E6E6"/>
           </w:tcPr>
           <w:p>
             <w:pPr>
               <w:rPr>
+                <w:rFonts w:ascii="Aptos" w:hAnsi="Aptos"/>
                 <w:b/>
                 <w:sz w:val="15"/>
               </w:rPr>
             </w:pPr>
             <w:r>
               <w:rPr>
+                <w:rFonts w:ascii="Aptos" w:hAnsi="Aptos"/>
                 <w:b/>
                 <w:sz w:val="15"/>
               </w:rPr>
@@ -114,18 +171,20 @@
         </w:tc>
         <w:tc>
           <w:tcPr>
-            <w:tcW w:w="1250" w:type="pct"/>
+            <w:tcW w:w="2340" w:type="dxa"/>
             <w:shd w:val="clear" w:color="auto" w:fill="E6E6E6"/>
           </w:tcPr>
           <w:p>
             <w:pPr>
               <w:rPr>
+                <w:rFonts w:ascii="Aptos" w:hAnsi="Aptos"/>
                 <w:b/>
                 <w:sz w:val="15"/>
               </w:rPr>
             </w:pPr>
             <w:r>
               <w:rPr>
+                <w:rFonts w:ascii="Aptos" w:hAnsi="Aptos"/>
                 <w:b/>
                 <w:sz w:val="15"/>
               </w:rPr>
@@ -137,16 +196,18 @@
       <w:tr>
         <w:tc>
           <w:tcPr>
-            <w:tcW w:w="1250" w:type="pct"/>
-          </w:tcPr>
-          <w:p>
-            <w:pPr>
-              <w:rPr>
-                <w:sz w:val="15"/>
-              </w:rPr>
-            </w:pPr>
-            <w:r>
-              <w:rPr>
+            <w:tcW w:w="2340" w:type="dxa"/>
+          </w:tcPr>
+          <w:p>
+            <w:pPr>
+              <w:rPr>
+                <w:rFonts w:ascii="Aptos" w:hAnsi="Aptos"/>
+                <w:sz w:val="15"/>
+              </w:rPr>
+            </w:pPr>
+            <w:r>
+              <w:rPr>
+                <w:rFonts w:ascii="Aptos" w:hAnsi="Aptos"/>
                 <w:sz w:val="15"/>
               </w:rPr>
               <w:t>S1</w:t>
@@ -155,16 +216,18 @@
         </w:tc>
         <w:tc>
           <w:tcPr>
-            <w:tcW w:w="1250" w:type="pct"/>
-          </w:tcPr>
-          <w:p>
-            <w:pPr>
-              <w:rPr>
-                <w:sz w:val="15"/>
-              </w:rPr>
-            </w:pPr>
-            <w:r>
-              <w:rPr>
+            <w:tcW w:w="2340" w:type="dxa"/>
+          </w:tcPr>
+          <w:p>
+            <w:pPr>
+              <w:rPr>
+                <w:rFonts w:ascii="Aptos" w:hAnsi="Aptos"/>
+                <w:sz w:val="15"/>
+              </w:rPr>
+            </w:pPr>
+            <w:r>
+              <w:rPr>
+                <w:rFonts w:ascii="Aptos" w:hAnsi="Aptos"/>
                 <w:sz w:val="15"/>
               </w:rPr>
               <w:t>Single non-CDB</w:t>
@@ -173,16 +236,18 @@
         </w:tc>
         <w:tc>
           <w:tcPr>
-            <w:tcW w:w="1250" w:type="pct"/>
-          </w:tcPr>
-          <w:p>
-            <w:pPr>
-              <w:rPr>
-                <w:sz w:val="15"/>
-              </w:rPr>
-            </w:pPr>
-            <w:r>
-              <w:rPr>
+            <w:tcW w:w="2340" w:type="dxa"/>
+          </w:tcPr>
+          <w:p>
+            <w:pPr>
+              <w:rPr>
+                <w:rFonts w:ascii="Aptos" w:hAnsi="Aptos"/>
+                <w:sz w:val="15"/>
+              </w:rPr>
+            </w:pPr>
+            <w:r>
+              <w:rPr>
+                <w:rFonts w:ascii="Aptos" w:hAnsi="Aptos"/>
                 <w:sz w:val="15"/>
               </w:rPr>
               <w:t>Guida S1</w:t>
@@ -191,16 +256,18 @@
         </w:tc>
         <w:tc>
           <w:tcPr>
-            <w:tcW w:w="1250" w:type="pct"/>
-          </w:tcPr>
-          <w:p>
-            <w:pPr>
-              <w:rPr>
-                <w:sz w:val="15"/>
-              </w:rPr>
-            </w:pPr>
-            <w:r>
-              <w:rPr>
+            <w:tcW w:w="2340" w:type="dxa"/>
+          </w:tcPr>
+          <w:p>
+            <w:pPr>
+              <w:rPr>
+                <w:rFonts w:ascii="Aptos" w:hAnsi="Aptos"/>
+                <w:sz w:val="15"/>
+              </w:rPr>
+            </w:pPr>
+            <w:r>
+              <w:rPr>
+                <w:rFonts w:ascii="Aptos" w:hAnsi="Aptos"/>
                 <w:sz w:val="15"/>
               </w:rPr>
               <w:t>&lt;SI/NO&gt;</w:t>
@@ -211,16 +278,18 @@
       <w:tr>
         <w:tc>
           <w:tcPr>
-            <w:tcW w:w="1250" w:type="pct"/>
-          </w:tcPr>
-          <w:p>
-            <w:pPr>
-              <w:rPr>
-                <w:sz w:val="15"/>
-              </w:rPr>
-            </w:pPr>
-            <w:r>
-              <w:rPr>
+            <w:tcW w:w="2340" w:type="dxa"/>
+          </w:tcPr>
+          <w:p>
+            <w:pPr>
+              <w:rPr>
+                <w:rFonts w:ascii="Aptos" w:hAnsi="Aptos"/>
+                <w:sz w:val="15"/>
+              </w:rPr>
+            </w:pPr>
+            <w:r>
+              <w:rPr>
+                <w:rFonts w:ascii="Aptos" w:hAnsi="Aptos"/>
                 <w:sz w:val="15"/>
               </w:rPr>
               <w:t>S2</w:t>
@@ -229,16 +298,18 @@
         </w:tc>
         <w:tc>
           <w:tcPr>
-            <w:tcW w:w="1250" w:type="pct"/>
-          </w:tcPr>
-          <w:p>
-            <w:pPr>
-              <w:rPr>
-                <w:sz w:val="15"/>
-              </w:rPr>
-            </w:pPr>
-            <w:r>
-              <w:rPr>
+            <w:tcW w:w="2340" w:type="dxa"/>
+          </w:tcPr>
+          <w:p>
+            <w:pPr>
+              <w:rPr>
+                <w:rFonts w:ascii="Aptos" w:hAnsi="Aptos"/>
+                <w:sz w:val="15"/>
+              </w:rPr>
+            </w:pPr>
+            <w:r>
+              <w:rPr>
+                <w:rFonts w:ascii="Aptos" w:hAnsi="Aptos"/>
                 <w:sz w:val="15"/>
               </w:rPr>
               <w:t>Single CDB/PDB</w:t>
@@ -247,16 +318,18 @@
         </w:tc>
         <w:tc>
           <w:tcPr>
-            <w:tcW w:w="1250" w:type="pct"/>
-          </w:tcPr>
-          <w:p>
-            <w:pPr>
-              <w:rPr>
-                <w:sz w:val="15"/>
-              </w:rPr>
-            </w:pPr>
-            <w:r>
-              <w:rPr>
+            <w:tcW w:w="2340" w:type="dxa"/>
+          </w:tcPr>
+          <w:p>
+            <w:pPr>
+              <w:rPr>
+                <w:rFonts w:ascii="Aptos" w:hAnsi="Aptos"/>
+                <w:sz w:val="15"/>
+              </w:rPr>
+            </w:pPr>
+            <w:r>
+              <w:rPr>
+                <w:rFonts w:ascii="Aptos" w:hAnsi="Aptos"/>
                 <w:sz w:val="15"/>
               </w:rPr>
               <w:t>Guida S2</w:t>
@@ -265,16 +338,18 @@
         </w:tc>
         <w:tc>
           <w:tcPr>
-            <w:tcW w:w="1250" w:type="pct"/>
-          </w:tcPr>
-          <w:p>
-            <w:pPr>
-              <w:rPr>
-                <w:sz w:val="15"/>
-              </w:rPr>
-            </w:pPr>
-            <w:r>
-              <w:rPr>
+            <w:tcW w:w="2340" w:type="dxa"/>
+          </w:tcPr>
+          <w:p>
+            <w:pPr>
+              <w:rPr>
+                <w:rFonts w:ascii="Aptos" w:hAnsi="Aptos"/>
+                <w:sz w:val="15"/>
+              </w:rPr>
+            </w:pPr>
+            <w:r>
+              <w:rPr>
+                <w:rFonts w:ascii="Aptos" w:hAnsi="Aptos"/>
                 <w:sz w:val="15"/>
               </w:rPr>
               <w:t>&lt;SI/NO&gt;</w:t>
@@ -285,16 +360,18 @@
       <w:tr>
         <w:tc>
           <w:tcPr>
-            <w:tcW w:w="1250" w:type="pct"/>
-          </w:tcPr>
-          <w:p>
-            <w:pPr>
-              <w:rPr>
-                <w:sz w:val="15"/>
-              </w:rPr>
-            </w:pPr>
-            <w:r>
-              <w:rPr>
+            <w:tcW w:w="2340" w:type="dxa"/>
+          </w:tcPr>
+          <w:p>
+            <w:pPr>
+              <w:rPr>
+                <w:rFonts w:ascii="Aptos" w:hAnsi="Aptos"/>
+                <w:sz w:val="15"/>
+              </w:rPr>
+            </w:pPr>
+            <w:r>
+              <w:rPr>
+                <w:rFonts w:ascii="Aptos" w:hAnsi="Aptos"/>
                 <w:sz w:val="15"/>
               </w:rPr>
               <w:t>S3</w:t>
@@ -303,16 +380,18 @@
         </w:tc>
         <w:tc>
           <w:tcPr>
-            <w:tcW w:w="1250" w:type="pct"/>
-          </w:tcPr>
-          <w:p>
-            <w:pPr>
-              <w:rPr>
-                <w:sz w:val="15"/>
-              </w:rPr>
-            </w:pPr>
-            <w:r>
-              <w:rPr>
+            <w:tcW w:w="2340" w:type="dxa"/>
+          </w:tcPr>
+          <w:p>
+            <w:pPr>
+              <w:rPr>
+                <w:rFonts w:ascii="Aptos" w:hAnsi="Aptos"/>
+                <w:sz w:val="15"/>
+              </w:rPr>
+            </w:pPr>
+            <w:r>
+              <w:rPr>
+                <w:rFonts w:ascii="Aptos" w:hAnsi="Aptos"/>
                 <w:sz w:val="15"/>
               </w:rPr>
               <w:t>RAC non-CDB</w:t>
@@ -321,16 +400,18 @@
         </w:tc>
         <w:tc>
           <w:tcPr>
-            <w:tcW w:w="1250" w:type="pct"/>
-          </w:tcPr>
-          <w:p>
-            <w:pPr>
-              <w:rPr>
-                <w:sz w:val="15"/>
-              </w:rPr>
-            </w:pPr>
-            <w:r>
-              <w:rPr>
+            <w:tcW w:w="2340" w:type="dxa"/>
+          </w:tcPr>
+          <w:p>
+            <w:pPr>
+              <w:rPr>
+                <w:rFonts w:ascii="Aptos" w:hAnsi="Aptos"/>
+                <w:sz w:val="15"/>
+              </w:rPr>
+            </w:pPr>
+            <w:r>
+              <w:rPr>
+                <w:rFonts w:ascii="Aptos" w:hAnsi="Aptos"/>
                 <w:sz w:val="15"/>
               </w:rPr>
               <w:t>Guida S3</w:t>
@@ -339,16 +420,18 @@
         </w:tc>
         <w:tc>
           <w:tcPr>
-            <w:tcW w:w="1250" w:type="pct"/>
-          </w:tcPr>
-          <w:p>
-            <w:pPr>
-              <w:rPr>
-                <w:sz w:val="15"/>
-              </w:rPr>
-            </w:pPr>
-            <w:r>
-              <w:rPr>
+            <w:tcW w:w="2340" w:type="dxa"/>
+          </w:tcPr>
+          <w:p>
+            <w:pPr>
+              <w:rPr>
+                <w:rFonts w:ascii="Aptos" w:hAnsi="Aptos"/>
+                <w:sz w:val="15"/>
+              </w:rPr>
+            </w:pPr>
+            <w:r>
+              <w:rPr>
+                <w:rFonts w:ascii="Aptos" w:hAnsi="Aptos"/>
                 <w:sz w:val="15"/>
               </w:rPr>
               <w:t>&lt;SI/NO&gt;</w:t>
@@ -359,16 +442,18 @@
       <w:tr>
         <w:tc>
           <w:tcPr>
-            <w:tcW w:w="1250" w:type="pct"/>
-          </w:tcPr>
-          <w:p>
-            <w:pPr>
-              <w:rPr>
-                <w:sz w:val="15"/>
-              </w:rPr>
-            </w:pPr>
-            <w:r>
-              <w:rPr>
+            <w:tcW w:w="2340" w:type="dxa"/>
+          </w:tcPr>
+          <w:p>
+            <w:pPr>
+              <w:rPr>
+                <w:rFonts w:ascii="Aptos" w:hAnsi="Aptos"/>
+                <w:sz w:val="15"/>
+              </w:rPr>
+            </w:pPr>
+            <w:r>
+              <w:rPr>
+                <w:rFonts w:ascii="Aptos" w:hAnsi="Aptos"/>
                 <w:sz w:val="15"/>
               </w:rPr>
               <w:t>S4</w:t>
@@ -377,16 +462,18 @@
         </w:tc>
         <w:tc>
           <w:tcPr>
-            <w:tcW w:w="1250" w:type="pct"/>
-          </w:tcPr>
-          <w:p>
-            <w:pPr>
-              <w:rPr>
-                <w:sz w:val="15"/>
-              </w:rPr>
-            </w:pPr>
-            <w:r>
-              <w:rPr>
+            <w:tcW w:w="2340" w:type="dxa"/>
+          </w:tcPr>
+          <w:p>
+            <w:pPr>
+              <w:rPr>
+                <w:rFonts w:ascii="Aptos" w:hAnsi="Aptos"/>
+                <w:sz w:val="15"/>
+              </w:rPr>
+            </w:pPr>
+            <w:r>
+              <w:rPr>
+                <w:rFonts w:ascii="Aptos" w:hAnsi="Aptos"/>
                 <w:sz w:val="15"/>
               </w:rPr>
               <w:t>RAC CDB/PDB</w:t>
@@ -395,16 +482,18 @@
         </w:tc>
         <w:tc>
           <w:tcPr>
-            <w:tcW w:w="1250" w:type="pct"/>
-          </w:tcPr>
-          <w:p>
-            <w:pPr>
-              <w:rPr>
-                <w:sz w:val="15"/>
-              </w:rPr>
-            </w:pPr>
-            <w:r>
-              <w:rPr>
+            <w:tcW w:w="2340" w:type="dxa"/>
+          </w:tcPr>
+          <w:p>
+            <w:pPr>
+              <w:rPr>
+                <w:rFonts w:ascii="Aptos" w:hAnsi="Aptos"/>
+                <w:sz w:val="15"/>
+              </w:rPr>
+            </w:pPr>
+            <w:r>
+              <w:rPr>
+                <w:rFonts w:ascii="Aptos" w:hAnsi="Aptos"/>
                 <w:sz w:val="15"/>
               </w:rPr>
               <w:t>Guida S4</w:t>
@@ -413,16 +502,18 @@
         </w:tc>
         <w:tc>
           <w:tcPr>
-            <w:tcW w:w="1250" w:type="pct"/>
-          </w:tcPr>
-          <w:p>
-            <w:pPr>
-              <w:rPr>
-                <w:sz w:val="15"/>
-              </w:rPr>
-            </w:pPr>
-            <w:r>
-              <w:rPr>
+            <w:tcW w:w="2340" w:type="dxa"/>
+          </w:tcPr>
+          <w:p>
+            <w:pPr>
+              <w:rPr>
+                <w:rFonts w:ascii="Aptos" w:hAnsi="Aptos"/>
+                <w:sz w:val="15"/>
+              </w:rPr>
+            </w:pPr>
+            <w:r>
+              <w:rPr>
+                <w:rFonts w:ascii="Aptos" w:hAnsi="Aptos"/>
                 <w:sz w:val="15"/>
               </w:rPr>
               <w:t>&lt;SI/NO&gt;</w:t>
@@ -471,28 +562,41 @@
     <w:tbl>
       <w:tblPr>
         <w:tblStyle w:val="TableGrid"/>
-        <w:tblW w:w="5000" w:type="pct"/>
+        <w:tblW w:w="9360" w:type="dxa"/>
+        <w:tblInd w:w="-5" w:type="dxa"/>
+        <w:tblLayout w:type="fixed"/>
+        <w:tblCellMar>
+          <w:top w:w="80" w:type="dxa"/>
+          <w:left w:w="120" w:type="dxa"/>
+          <w:bottom w:w="80" w:type="dxa"/>
+          <w:right w:w="120" w:type="dxa"/>
+        </w:tblCellMar>
         <w:tblLook w:val="04A0" w:firstRow="1" w:lastRow="0" w:firstColumn="1" w:lastColumn="0" w:noHBand="0" w:noVBand="1"/>
       </w:tblPr>
       <w:tblGrid>
-        <w:gridCol w:w="4988"/>
-        <w:gridCol w:w="4988"/>
+        <w:gridCol w:w="4680"/>
+        <w:gridCol w:w="4680"/>
       </w:tblGrid>
       <w:tr>
-        <w:tc>
-          <w:tcPr>
-            <w:tcW w:w="2500" w:type="pct"/>
+        <w:trPr>
+          <w:tblHeader/>
+        </w:trPr>
+        <w:tc>
+          <w:tcPr>
+            <w:tcW w:w="4680" w:type="dxa"/>
             <w:shd w:val="clear" w:color="auto" w:fill="E6E6E6"/>
           </w:tcPr>
           <w:p>
             <w:pPr>
               <w:rPr>
+                <w:rFonts w:ascii="Aptos" w:hAnsi="Aptos"/>
                 <w:b/>
                 <w:sz w:val="15"/>
               </w:rPr>
             </w:pPr>
             <w:r>
               <w:rPr>
+                <w:rFonts w:ascii="Aptos" w:hAnsi="Aptos"/>
                 <w:b/>
                 <w:sz w:val="15"/>
               </w:rPr>
@@ -502,18 +606,20 @@
         </w:tc>
         <w:tc>
           <w:tcPr>
-            <w:tcW w:w="2500" w:type="pct"/>
+            <w:tcW w:w="4680" w:type="dxa"/>
             <w:shd w:val="clear" w:color="auto" w:fill="E6E6E6"/>
           </w:tcPr>
           <w:p>
             <w:pPr>
               <w:rPr>
+                <w:rFonts w:ascii="Aptos" w:hAnsi="Aptos"/>
                 <w:b/>
                 <w:sz w:val="15"/>
               </w:rPr>
             </w:pPr>
             <w:r>
               <w:rPr>
+                <w:rFonts w:ascii="Aptos" w:hAnsi="Aptos"/>
                 <w:b/>
                 <w:sz w:val="15"/>
               </w:rPr>
@@ -525,16 +631,18 @@
       <w:tr>
         <w:tc>
           <w:tcPr>
-            <w:tcW w:w="2500" w:type="pct"/>
-          </w:tcPr>
-          <w:p>
-            <w:pPr>
-              <w:rPr>
-                <w:sz w:val="15"/>
-              </w:rPr>
-            </w:pPr>
-            <w:r>
-              <w:rPr>
+            <w:tcW w:w="4680" w:type="dxa"/>
+          </w:tcPr>
+          <w:p>
+            <w:pPr>
+              <w:rPr>
+                <w:rFonts w:ascii="Aptos" w:hAnsi="Aptos"/>
+                <w:sz w:val="15"/>
+              </w:rPr>
+            </w:pPr>
+            <w:r>
+              <w:rPr>
+                <w:rFonts w:ascii="Aptos" w:hAnsi="Aptos"/>
                 <w:sz w:val="15"/>
               </w:rPr>
               <w:t>naming PE/SE e ambiente C</w:t>
@@ -543,16 +651,18 @@
         </w:tc>
         <w:tc>
           <w:tcPr>
-            <w:tcW w:w="2500" w:type="pct"/>
-          </w:tcPr>
-          <w:p>
-            <w:pPr>
-              <w:rPr>
-                <w:sz w:val="15"/>
-              </w:rPr>
-            </w:pPr>
-            <w:r>
-              <w:rPr>
+            <w:tcW w:w="4680" w:type="dxa"/>
+          </w:tcPr>
+          <w:p>
+            <w:pPr>
+              <w:rPr>
+                <w:rFonts w:ascii="Aptos" w:hAnsi="Aptos"/>
+                <w:sz w:val="15"/>
+              </w:rPr>
+            </w:pPr>
+            <w:r>
+              <w:rPr>
+                <w:rFonts w:ascii="Aptos" w:hAnsi="Aptos"/>
                 <w:sz w:val="15"/>
               </w:rPr>
               <w:t>&lt;OK/KO&gt;</w:t>
@@ -563,16 +673,18 @@
       <w:tr>
         <w:tc>
           <w:tcPr>
-            <w:tcW w:w="2500" w:type="pct"/>
-          </w:tcPr>
-          <w:p>
-            <w:pPr>
-              <w:rPr>
-                <w:sz w:val="15"/>
-              </w:rPr>
-            </w:pPr>
-            <w:r>
-              <w:rPr>
+            <w:tcW w:w="4680" w:type="dxa"/>
+          </w:tcPr>
+          <w:p>
+            <w:pPr>
+              <w:rPr>
+                <w:rFonts w:ascii="Aptos" w:hAnsi="Aptos"/>
+                <w:sz w:val="15"/>
+              </w:rPr>
+            </w:pPr>
+            <w:r>
+              <w:rPr>
+                <w:rFonts w:ascii="Aptos" w:hAnsi="Aptos"/>
                 <w:sz w:val="15"/>
               </w:rPr>
               <w:t>Global Database Name primary M24SHAMSPEC[.&lt;DB_DOMAIN&gt;]</w:t>
@@ -581,16 +693,18 @@
         </w:tc>
         <w:tc>
           <w:tcPr>
-            <w:tcW w:w="2500" w:type="pct"/>
-          </w:tcPr>
-          <w:p>
-            <w:pPr>
-              <w:rPr>
-                <w:sz w:val="15"/>
-              </w:rPr>
-            </w:pPr>
-            <w:r>
-              <w:rPr>
+            <w:tcW w:w="4680" w:type="dxa"/>
+          </w:tcPr>
+          <w:p>
+            <w:pPr>
+              <w:rPr>
+                <w:rFonts w:ascii="Aptos" w:hAnsi="Aptos"/>
+                <w:sz w:val="15"/>
+              </w:rPr>
+            </w:pPr>
+            <w:r>
+              <w:rPr>
+                <w:rFonts w:ascii="Aptos" w:hAnsi="Aptos"/>
                 <w:sz w:val="15"/>
               </w:rPr>
               <w:t>&lt;OK/KO&gt;</w:t>
@@ -601,16 +715,18 @@
       <w:tr>
         <w:tc>
           <w:tcPr>
-            <w:tcW w:w="2500" w:type="pct"/>
-          </w:tcPr>
-          <w:p>
-            <w:pPr>
-              <w:rPr>
-                <w:sz w:val="15"/>
-              </w:rPr>
-            </w:pPr>
-            <w:r>
-              <w:rPr>
+            <w:tcW w:w="4680" w:type="dxa"/>
+          </w:tcPr>
+          <w:p>
+            <w:pPr>
+              <w:rPr>
+                <w:rFonts w:ascii="Aptos" w:hAnsi="Aptos"/>
+                <w:sz w:val="15"/>
+              </w:rPr>
+            </w:pPr>
+            <w:r>
+              <w:rPr>
+                <w:rFonts w:ascii="Aptos" w:hAnsi="Aptos"/>
                 <w:sz w:val="15"/>
               </w:rPr>
               <w:t>DB_NAME=M24SHAMS, DB_UNIQUE_NAME=M24SHAMSPEC</w:t>
@@ -619,16 +735,18 @@
         </w:tc>
         <w:tc>
           <w:tcPr>
-            <w:tcW w:w="2500" w:type="pct"/>
-          </w:tcPr>
-          <w:p>
-            <w:pPr>
-              <w:rPr>
-                <w:sz w:val="15"/>
-              </w:rPr>
-            </w:pPr>
-            <w:r>
-              <w:rPr>
+            <w:tcW w:w="4680" w:type="dxa"/>
+          </w:tcPr>
+          <w:p>
+            <w:pPr>
+              <w:rPr>
+                <w:rFonts w:ascii="Aptos" w:hAnsi="Aptos"/>
+                <w:sz w:val="15"/>
+              </w:rPr>
+            </w:pPr>
+            <w:r>
+              <w:rPr>
+                <w:rFonts w:ascii="Aptos" w:hAnsi="Aptos"/>
                 <w:sz w:val="15"/>
               </w:rPr>
               <w:t>&lt;OK/KO&gt;</w:t>
@@ -639,16 +757,18 @@
       <w:tr>
         <w:tc>
           <w:tcPr>
-            <w:tcW w:w="2500" w:type="pct"/>
-          </w:tcPr>
-          <w:p>
-            <w:pPr>
-              <w:rPr>
-                <w:sz w:val="15"/>
-              </w:rPr>
-            </w:pPr>
-            <w:r>
-              <w:rPr>
+            <w:tcW w:w="4680" w:type="dxa"/>
+          </w:tcPr>
+          <w:p>
+            <w:pPr>
+              <w:rPr>
+                <w:rFonts w:ascii="Aptos" w:hAnsi="Aptos"/>
+                <w:sz w:val="15"/>
+              </w:rPr>
+            </w:pPr>
+            <w:r>
+              <w:rPr>
+                <w:rFonts w:ascii="Aptos" w:hAnsi="Aptos"/>
                 <w:sz w:val="15"/>
               </w:rPr>
               <w:t>RPO, RTO e latenza</w:t>
@@ -657,16 +777,18 @@
         </w:tc>
         <w:tc>
           <w:tcPr>
-            <w:tcW w:w="2500" w:type="pct"/>
-          </w:tcPr>
-          <w:p>
-            <w:pPr>
-              <w:rPr>
-                <w:sz w:val="15"/>
-              </w:rPr>
-            </w:pPr>
-            <w:r>
-              <w:rPr>
+            <w:tcW w:w="4680" w:type="dxa"/>
+          </w:tcPr>
+          <w:p>
+            <w:pPr>
+              <w:rPr>
+                <w:rFonts w:ascii="Aptos" w:hAnsi="Aptos"/>
+                <w:sz w:val="15"/>
+              </w:rPr>
+            </w:pPr>
+            <w:r>
+              <w:rPr>
+                <w:rFonts w:ascii="Aptos" w:hAnsi="Aptos"/>
                 <w:sz w:val="15"/>
               </w:rPr>
               <w:t>&lt;OK/KO&gt;</w:t>
@@ -677,34 +799,39 @@
       <w:tr>
         <w:tc>
           <w:tcPr>
-            <w:tcW w:w="2500" w:type="pct"/>
-          </w:tcPr>
-          <w:p>
-            <w:pPr>
-              <w:rPr>
-                <w:sz w:val="15"/>
-              </w:rPr>
-            </w:pPr>
-            <w:r>
-              <w:rPr>
-                <w:sz w:val="15"/>
-              </w:rPr>
+            <w:tcW w:w="4680" w:type="dxa"/>
+          </w:tcPr>
+          <w:p>
+            <w:pPr>
+              <w:rPr>
+                <w:rFonts w:ascii="Aptos" w:hAnsi="Aptos"/>
+                <w:sz w:val="15"/>
+              </w:rPr>
+            </w:pPr>
+            <w:r>
+              <w:rPr>
+                <w:rFonts w:ascii="Aptos" w:hAnsi="Aptos"/>
+                <w:sz w:val="15"/>
+              </w:rPr>
+              <w:lastRenderedPageBreak/>
               <w:t>storage DATA/FRA</w:t>
             </w:r>
           </w:p>
         </w:tc>
         <w:tc>
           <w:tcPr>
-            <w:tcW w:w="2500" w:type="pct"/>
-          </w:tcPr>
-          <w:p>
-            <w:pPr>
-              <w:rPr>
-                <w:sz w:val="15"/>
-              </w:rPr>
-            </w:pPr>
-            <w:r>
-              <w:rPr>
+            <w:tcW w:w="4680" w:type="dxa"/>
+          </w:tcPr>
+          <w:p>
+            <w:pPr>
+              <w:rPr>
+                <w:rFonts w:ascii="Aptos" w:hAnsi="Aptos"/>
+                <w:sz w:val="15"/>
+              </w:rPr>
+            </w:pPr>
+            <w:r>
+              <w:rPr>
+                <w:rFonts w:ascii="Aptos" w:hAnsi="Aptos"/>
                 <w:sz w:val="15"/>
               </w:rPr>
               <w:t>&lt;OK/KO&gt;</w:t>
@@ -715,16 +842,18 @@
       <w:tr>
         <w:tc>
           <w:tcPr>
-            <w:tcW w:w="2500" w:type="pct"/>
-          </w:tcPr>
-          <w:p>
-            <w:pPr>
-              <w:rPr>
-                <w:sz w:val="15"/>
-              </w:rPr>
-            </w:pPr>
-            <w:r>
-              <w:rPr>
+            <w:tcW w:w="4680" w:type="dxa"/>
+          </w:tcPr>
+          <w:p>
+            <w:pPr>
+              <w:rPr>
+                <w:rFonts w:ascii="Aptos" w:hAnsi="Aptos"/>
+                <w:sz w:val="15"/>
+              </w:rPr>
+            </w:pPr>
+            <w:r>
+              <w:rPr>
+                <w:rFonts w:ascii="Aptos" w:hAnsi="Aptos"/>
                 <w:sz w:val="15"/>
               </w:rPr>
               <w:t>RU Grid e DB Home</w:t>
@@ -733,16 +862,18 @@
         </w:tc>
         <w:tc>
           <w:tcPr>
-            <w:tcW w:w="2500" w:type="pct"/>
-          </w:tcPr>
-          <w:p>
-            <w:pPr>
-              <w:rPr>
-                <w:sz w:val="15"/>
-              </w:rPr>
-            </w:pPr>
-            <w:r>
-              <w:rPr>
+            <w:tcW w:w="4680" w:type="dxa"/>
+          </w:tcPr>
+          <w:p>
+            <w:pPr>
+              <w:rPr>
+                <w:rFonts w:ascii="Aptos" w:hAnsi="Aptos"/>
+                <w:sz w:val="15"/>
+              </w:rPr>
+            </w:pPr>
+            <w:r>
+              <w:rPr>
+                <w:rFonts w:ascii="Aptos" w:hAnsi="Aptos"/>
                 <w:sz w:val="15"/>
               </w:rPr>
               <w:t>&lt;OK/KO&gt;</w:t>
@@ -753,34 +884,38 @@
       <w:tr>
         <w:tc>
           <w:tcPr>
-            <w:tcW w:w="2500" w:type="pct"/>
-          </w:tcPr>
-          <w:p>
-            <w:pPr>
-              <w:rPr>
-                <w:sz w:val="15"/>
-              </w:rPr>
-            </w:pPr>
-            <w:r>
-              <w:rPr>
-                <w:sz w:val="15"/>
-              </w:rPr>
-              <w:t>licenza Active Data Guard</w:t>
-            </w:r>
-          </w:p>
-        </w:tc>
-        <w:tc>
-          <w:tcPr>
-            <w:tcW w:w="2500" w:type="pct"/>
-          </w:tcPr>
-          <w:p>
-            <w:pPr>
-              <w:rPr>
-                <w:sz w:val="15"/>
-              </w:rPr>
-            </w:pPr>
-            <w:r>
-              <w:rPr>
+            <w:tcW w:w="4680" w:type="dxa"/>
+          </w:tcPr>
+          <w:p>
+            <w:pPr>
+              <w:rPr>
+                <w:rFonts w:ascii="Aptos" w:hAnsi="Aptos"/>
+                <w:sz w:val="15"/>
+              </w:rPr>
+            </w:pPr>
+            <w:r>
+              <w:rPr>
+                <w:rFonts w:ascii="Aptos" w:hAnsi="Aptos"/>
+                <w:sz w:val="15"/>
+              </w:rPr>
+              <w:t>ADG disattivo oppure gate licenza/lab personale</w:t>
+            </w:r>
+          </w:p>
+        </w:tc>
+        <w:tc>
+          <w:tcPr>
+            <w:tcW w:w="4680" w:type="dxa"/>
+          </w:tcPr>
+          <w:p>
+            <w:pPr>
+              <w:rPr>
+                <w:rFonts w:ascii="Aptos" w:hAnsi="Aptos"/>
+                <w:sz w:val="15"/>
+              </w:rPr>
+            </w:pPr>
+            <w:r>
+              <w:rPr>
+                <w:rFonts w:ascii="Aptos" w:hAnsi="Aptos"/>
                 <w:sz w:val="15"/>
               </w:rPr>
               <w:t>&lt;OK/KO&gt;</w:t>
@@ -791,16 +926,18 @@
       <w:tr>
         <w:tc>
           <w:tcPr>
-            <w:tcW w:w="2500" w:type="pct"/>
-          </w:tcPr>
-          <w:p>
-            <w:pPr>
-              <w:rPr>
-                <w:sz w:val="15"/>
-              </w:rPr>
-            </w:pPr>
-            <w:r>
-              <w:rPr>
+            <w:tcW w:w="4680" w:type="dxa"/>
+          </w:tcPr>
+          <w:p>
+            <w:pPr>
+              <w:rPr>
+                <w:rFonts w:ascii="Aptos" w:hAnsi="Aptos"/>
+                <w:sz w:val="15"/>
+              </w:rPr>
+            </w:pPr>
+            <w:r>
+              <w:rPr>
+                <w:rFonts w:ascii="Aptos" w:hAnsi="Aptos"/>
                 <w:sz w:val="15"/>
               </w:rPr>
               <w:t>decisione TDE</w:t>
@@ -809,16 +946,18 @@
         </w:tc>
         <w:tc>
           <w:tcPr>
-            <w:tcW w:w="2500" w:type="pct"/>
-          </w:tcPr>
-          <w:p>
-            <w:pPr>
-              <w:rPr>
-                <w:sz w:val="15"/>
-              </w:rPr>
-            </w:pPr>
-            <w:r>
-              <w:rPr>
+            <w:tcW w:w="4680" w:type="dxa"/>
+          </w:tcPr>
+          <w:p>
+            <w:pPr>
+              <w:rPr>
+                <w:rFonts w:ascii="Aptos" w:hAnsi="Aptos"/>
+                <w:sz w:val="15"/>
+              </w:rPr>
+            </w:pPr>
+            <w:r>
+              <w:rPr>
+                <w:rFonts w:ascii="Aptos" w:hAnsi="Aptos"/>
                 <w:sz w:val="15"/>
               </w:rPr>
               <w:t>&lt;OK/KO&gt;</w:t>
@@ -829,16 +968,18 @@
       <w:tr>
         <w:tc>
           <w:tcPr>
-            <w:tcW w:w="2500" w:type="pct"/>
-          </w:tcPr>
-          <w:p>
-            <w:pPr>
-              <w:rPr>
-                <w:sz w:val="15"/>
-              </w:rPr>
-            </w:pPr>
-            <w:r>
-              <w:rPr>
+            <w:tcW w:w="4680" w:type="dxa"/>
+          </w:tcPr>
+          <w:p>
+            <w:pPr>
+              <w:rPr>
+                <w:rFonts w:ascii="Aptos" w:hAnsi="Aptos"/>
+                <w:sz w:val="15"/>
+              </w:rPr>
+            </w:pPr>
+            <w:r>
+              <w:rPr>
+                <w:rFonts w:ascii="Aptos" w:hAnsi="Aptos"/>
                 <w:sz w:val="15"/>
               </w:rPr>
               <w:t>recovery catalog RMAN</w:t>
@@ -847,16 +988,18 @@
         </w:tc>
         <w:tc>
           <w:tcPr>
-            <w:tcW w:w="2500" w:type="pct"/>
-          </w:tcPr>
-          <w:p>
-            <w:pPr>
-              <w:rPr>
-                <w:sz w:val="15"/>
-              </w:rPr>
-            </w:pPr>
-            <w:r>
-              <w:rPr>
+            <w:tcW w:w="4680" w:type="dxa"/>
+          </w:tcPr>
+          <w:p>
+            <w:pPr>
+              <w:rPr>
+                <w:rFonts w:ascii="Aptos" w:hAnsi="Aptos"/>
+                <w:sz w:val="15"/>
+              </w:rPr>
+            </w:pPr>
+            <w:r>
+              <w:rPr>
+                <w:rFonts w:ascii="Aptos" w:hAnsi="Aptos"/>
                 <w:sz w:val="15"/>
               </w:rPr>
               <w:t>&lt;OK/KO&gt;</w:t>
@@ -877,28 +1020,41 @@
     <w:tbl>
       <w:tblPr>
         <w:tblStyle w:val="TableGrid"/>
-        <w:tblW w:w="5000" w:type="pct"/>
+        <w:tblW w:w="9360" w:type="dxa"/>
+        <w:tblInd w:w="-5" w:type="dxa"/>
+        <w:tblLayout w:type="fixed"/>
+        <w:tblCellMar>
+          <w:top w:w="80" w:type="dxa"/>
+          <w:left w:w="120" w:type="dxa"/>
+          <w:bottom w:w="80" w:type="dxa"/>
+          <w:right w:w="120" w:type="dxa"/>
+        </w:tblCellMar>
         <w:tblLook w:val="04A0" w:firstRow="1" w:lastRow="0" w:firstColumn="1" w:lastColumn="0" w:noHBand="0" w:noVBand="1"/>
       </w:tblPr>
       <w:tblGrid>
-        <w:gridCol w:w="4988"/>
-        <w:gridCol w:w="4988"/>
+        <w:gridCol w:w="4680"/>
+        <w:gridCol w:w="4680"/>
       </w:tblGrid>
       <w:tr>
-        <w:tc>
-          <w:tcPr>
-            <w:tcW w:w="2500" w:type="pct"/>
+        <w:trPr>
+          <w:tblHeader/>
+        </w:trPr>
+        <w:tc>
+          <w:tcPr>
+            <w:tcW w:w="4680" w:type="dxa"/>
             <w:shd w:val="clear" w:color="auto" w:fill="E6E6E6"/>
           </w:tcPr>
           <w:p>
             <w:pPr>
               <w:rPr>
+                <w:rFonts w:ascii="Aptos" w:hAnsi="Aptos"/>
                 <w:b/>
                 <w:sz w:val="15"/>
               </w:rPr>
             </w:pPr>
             <w:r>
               <w:rPr>
+                <w:rFonts w:ascii="Aptos" w:hAnsi="Aptos"/>
                 <w:b/>
                 <w:sz w:val="15"/>
               </w:rPr>
@@ -908,18 +1064,20 @@
         </w:tc>
         <w:tc>
           <w:tcPr>
-            <w:tcW w:w="2500" w:type="pct"/>
+            <w:tcW w:w="4680" w:type="dxa"/>
             <w:shd w:val="clear" w:color="auto" w:fill="E6E6E6"/>
           </w:tcPr>
           <w:p>
             <w:pPr>
               <w:rPr>
+                <w:rFonts w:ascii="Aptos" w:hAnsi="Aptos"/>
                 <w:b/>
                 <w:sz w:val="15"/>
               </w:rPr>
             </w:pPr>
             <w:r>
               <w:rPr>
+                <w:rFonts w:ascii="Aptos" w:hAnsi="Aptos"/>
                 <w:b/>
                 <w:sz w:val="15"/>
               </w:rPr>
@@ -931,16 +1089,18 @@
       <w:tr>
         <w:tc>
           <w:tcPr>
-            <w:tcW w:w="2500" w:type="pct"/>
-          </w:tcPr>
-          <w:p>
-            <w:pPr>
-              <w:rPr>
-                <w:sz w:val="15"/>
-              </w:rPr>
-            </w:pPr>
-            <w:r>
-              <w:rPr>
+            <w:tcW w:w="4680" w:type="dxa"/>
+          </w:tcPr>
+          <w:p>
+            <w:pPr>
+              <w:rPr>
+                <w:rFonts w:ascii="Aptos" w:hAnsi="Aptos"/>
+                <w:sz w:val="15"/>
+              </w:rPr>
+            </w:pPr>
+            <w:r>
+              <w:rPr>
+                <w:rFonts w:ascii="Aptos" w:hAnsi="Aptos"/>
                 <w:sz w:val="15"/>
               </w:rPr>
               <w:t>S1, S2</w:t>
@@ -949,16 +1109,18 @@
         </w:tc>
         <w:tc>
           <w:tcPr>
-            <w:tcW w:w="2500" w:type="pct"/>
-          </w:tcPr>
-          <w:p>
-            <w:pPr>
-              <w:rPr>
-                <w:sz w:val="15"/>
-              </w:rPr>
-            </w:pPr>
-            <w:r>
-              <w:rPr>
+            <w:tcW w:w="4680" w:type="dxa"/>
+          </w:tcPr>
+          <w:p>
+            <w:pPr>
+              <w:rPr>
+                <w:rFonts w:ascii="Aptos" w:hAnsi="Aptos"/>
+                <w:sz w:val="15"/>
+              </w:rPr>
+            </w:pPr>
+            <w:r>
+              <w:rPr>
+                <w:rFonts w:ascii="Aptos" w:hAnsi="Aptos"/>
                 <w:sz w:val="15"/>
               </w:rPr>
               <w:t>Host single</w:t>
@@ -969,16 +1131,18 @@
       <w:tr>
         <w:tc>
           <w:tcPr>
-            <w:tcW w:w="2500" w:type="pct"/>
-          </w:tcPr>
-          <w:p>
-            <w:pPr>
-              <w:rPr>
-                <w:sz w:val="15"/>
-              </w:rPr>
-            </w:pPr>
-            <w:r>
-              <w:rPr>
+            <w:tcW w:w="4680" w:type="dxa"/>
+          </w:tcPr>
+          <w:p>
+            <w:pPr>
+              <w:rPr>
+                <w:rFonts w:ascii="Aptos" w:hAnsi="Aptos"/>
+                <w:sz w:val="15"/>
+              </w:rPr>
+            </w:pPr>
+            <w:r>
+              <w:rPr>
+                <w:rFonts w:ascii="Aptos" w:hAnsi="Aptos"/>
                 <w:sz w:val="15"/>
               </w:rPr>
               <w:t>S3, S4</w:t>
@@ -987,16 +1151,18 @@
         </w:tc>
         <w:tc>
           <w:tcPr>
-            <w:tcW w:w="2500" w:type="pct"/>
-          </w:tcPr>
-          <w:p>
-            <w:pPr>
-              <w:rPr>
-                <w:sz w:val="15"/>
-              </w:rPr>
-            </w:pPr>
-            <w:r>
-              <w:rPr>
+            <w:tcW w:w="4680" w:type="dxa"/>
+          </w:tcPr>
+          <w:p>
+            <w:pPr>
+              <w:rPr>
+                <w:rFonts w:ascii="Aptos" w:hAnsi="Aptos"/>
+                <w:sz w:val="15"/>
+              </w:rPr>
+            </w:pPr>
+            <w:r>
+              <w:rPr>
+                <w:rFonts w:ascii="Aptos" w:hAnsi="Aptos"/>
                 <w:sz w:val="15"/>
               </w:rPr>
               <w:t>Host RAC</w:t>
@@ -1017,29 +1183,42 @@
     <w:tbl>
       <w:tblPr>
         <w:tblStyle w:val="TableGrid"/>
-        <w:tblW w:w="5000" w:type="pct"/>
+        <w:tblW w:w="9360" w:type="dxa"/>
+        <w:tblInd w:w="-5" w:type="dxa"/>
+        <w:tblLayout w:type="fixed"/>
+        <w:tblCellMar>
+          <w:top w:w="80" w:type="dxa"/>
+          <w:left w:w="120" w:type="dxa"/>
+          <w:bottom w:w="80" w:type="dxa"/>
+          <w:right w:w="120" w:type="dxa"/>
+        </w:tblCellMar>
         <w:tblLook w:val="04A0" w:firstRow="1" w:lastRow="0" w:firstColumn="1" w:lastColumn="0" w:noHBand="0" w:noVBand="1"/>
       </w:tblPr>
       <w:tblGrid>
-        <w:gridCol w:w="3324"/>
-        <w:gridCol w:w="3326"/>
-        <w:gridCol w:w="3326"/>
+        <w:gridCol w:w="3120"/>
+        <w:gridCol w:w="3120"/>
+        <w:gridCol w:w="3120"/>
       </w:tblGrid>
       <w:tr>
-        <w:tc>
-          <w:tcPr>
-            <w:tcW w:w="1666" w:type="pct"/>
+        <w:trPr>
+          <w:tblHeader/>
+        </w:trPr>
+        <w:tc>
+          <w:tcPr>
+            <w:tcW w:w="3120" w:type="dxa"/>
             <w:shd w:val="clear" w:color="auto" w:fill="E6E6E6"/>
           </w:tcPr>
           <w:p>
             <w:pPr>
               <w:rPr>
+                <w:rFonts w:ascii="Aptos" w:hAnsi="Aptos"/>
                 <w:b/>
                 <w:sz w:val="15"/>
               </w:rPr>
             </w:pPr>
             <w:r>
               <w:rPr>
+                <w:rFonts w:ascii="Aptos" w:hAnsi="Aptos"/>
                 <w:b/>
                 <w:sz w:val="15"/>
               </w:rPr>
@@ -1049,18 +1228,20 @@
         </w:tc>
         <w:tc>
           <w:tcPr>
-            <w:tcW w:w="1667" w:type="pct"/>
+            <w:tcW w:w="3120" w:type="dxa"/>
             <w:shd w:val="clear" w:color="auto" w:fill="E6E6E6"/>
           </w:tcPr>
           <w:p>
             <w:pPr>
               <w:rPr>
+                <w:rFonts w:ascii="Aptos" w:hAnsi="Aptos"/>
                 <w:b/>
                 <w:sz w:val="15"/>
               </w:rPr>
             </w:pPr>
             <w:r>
               <w:rPr>
+                <w:rFonts w:ascii="Aptos" w:hAnsi="Aptos"/>
                 <w:b/>
                 <w:sz w:val="15"/>
               </w:rPr>
@@ -1070,18 +1251,20 @@
         </w:tc>
         <w:tc>
           <w:tcPr>
-            <w:tcW w:w="1667" w:type="pct"/>
+            <w:tcW w:w="3120" w:type="dxa"/>
             <w:shd w:val="clear" w:color="auto" w:fill="E6E6E6"/>
           </w:tcPr>
           <w:p>
             <w:pPr>
               <w:rPr>
+                <w:rFonts w:ascii="Aptos" w:hAnsi="Aptos"/>
                 <w:b/>
                 <w:sz w:val="15"/>
               </w:rPr>
             </w:pPr>
             <w:r>
               <w:rPr>
+                <w:rFonts w:ascii="Aptos" w:hAnsi="Aptos"/>
                 <w:b/>
                 <w:sz w:val="15"/>
               </w:rPr>
@@ -1093,16 +1276,18 @@
       <w:tr>
         <w:tc>
           <w:tcPr>
-            <w:tcW w:w="1666" w:type="pct"/>
-          </w:tcPr>
-          <w:p>
-            <w:pPr>
-              <w:rPr>
-                <w:sz w:val="15"/>
-              </w:rPr>
-            </w:pPr>
-            <w:r>
-              <w:rPr>
+            <w:tcW w:w="3120" w:type="dxa"/>
+          </w:tcPr>
+          <w:p>
+            <w:pPr>
+              <w:rPr>
+                <w:rFonts w:ascii="Aptos" w:hAnsi="Aptos"/>
+                <w:sz w:val="15"/>
+              </w:rPr>
+            </w:pPr>
+            <w:r>
+              <w:rPr>
+                <w:rFonts w:ascii="Aptos" w:hAnsi="Aptos"/>
                 <w:sz w:val="15"/>
               </w:rPr>
               <w:t>istanze</w:t>
@@ -1111,16 +1296,18 @@
         </w:tc>
         <w:tc>
           <w:tcPr>
-            <w:tcW w:w="1667" w:type="pct"/>
-          </w:tcPr>
-          <w:p>
-            <w:pPr>
-              <w:rPr>
-                <w:sz w:val="15"/>
-              </w:rPr>
-            </w:pPr>
-            <w:r>
-              <w:rPr>
+            <w:tcW w:w="3120" w:type="dxa"/>
+          </w:tcPr>
+          <w:p>
+            <w:pPr>
+              <w:rPr>
+                <w:rFonts w:ascii="Aptos" w:hAnsi="Aptos"/>
+                <w:sz w:val="15"/>
+              </w:rPr>
+            </w:pPr>
+            <w:r>
+              <w:rPr>
+                <w:rFonts w:ascii="Aptos" w:hAnsi="Aptos"/>
                 <w:sz w:val="15"/>
               </w:rPr>
               <w:t>una per sito</w:t>
@@ -1129,16 +1316,18 @@
         </w:tc>
         <w:tc>
           <w:tcPr>
-            <w:tcW w:w="1667" w:type="pct"/>
-          </w:tcPr>
-          <w:p>
-            <w:pPr>
-              <w:rPr>
-                <w:sz w:val="15"/>
-              </w:rPr>
-            </w:pPr>
-            <w:r>
-              <w:rPr>
+            <w:tcW w:w="3120" w:type="dxa"/>
+          </w:tcPr>
+          <w:p>
+            <w:pPr>
+              <w:rPr>
+                <w:rFonts w:ascii="Aptos" w:hAnsi="Aptos"/>
+                <w:sz w:val="15"/>
+              </w:rPr>
+            </w:pPr>
+            <w:r>
+              <w:rPr>
+                <w:rFonts w:ascii="Aptos" w:hAnsi="Aptos"/>
                 <w:sz w:val="15"/>
               </w:rPr>
               <w:t>due per sito</w:t>
@@ -1149,16 +1338,18 @@
       <w:tr>
         <w:tc>
           <w:tcPr>
-            <w:tcW w:w="1666" w:type="pct"/>
-          </w:tcPr>
-          <w:p>
-            <w:pPr>
-              <w:rPr>
-                <w:sz w:val="15"/>
-              </w:rPr>
-            </w:pPr>
-            <w:r>
-              <w:rPr>
+            <w:tcW w:w="3120" w:type="dxa"/>
+          </w:tcPr>
+          <w:p>
+            <w:pPr>
+              <w:rPr>
+                <w:rFonts w:ascii="Aptos" w:hAnsi="Aptos"/>
+                <w:sz w:val="15"/>
+              </w:rPr>
+            </w:pPr>
+            <w:r>
+              <w:rPr>
+                <w:rFonts w:ascii="Aptos" w:hAnsi="Aptos"/>
                 <w:sz w:val="15"/>
               </w:rPr>
               <w:t>redo thread</w:t>
@@ -1167,16 +1358,18 @@
         </w:tc>
         <w:tc>
           <w:tcPr>
-            <w:tcW w:w="1667" w:type="pct"/>
-          </w:tcPr>
-          <w:p>
-            <w:pPr>
-              <w:rPr>
-                <w:sz w:val="15"/>
-              </w:rPr>
-            </w:pPr>
-            <w:r>
-              <w:rPr>
+            <w:tcW w:w="3120" w:type="dxa"/>
+          </w:tcPr>
+          <w:p>
+            <w:pPr>
+              <w:rPr>
+                <w:rFonts w:ascii="Aptos" w:hAnsi="Aptos"/>
+                <w:sz w:val="15"/>
+              </w:rPr>
+            </w:pPr>
+            <w:r>
+              <w:rPr>
+                <w:rFonts w:ascii="Aptos" w:hAnsi="Aptos"/>
                 <w:sz w:val="15"/>
               </w:rPr>
               <w:t>THREAD 1</w:t>
@@ -1185,16 +1378,18 @@
         </w:tc>
         <w:tc>
           <w:tcPr>
-            <w:tcW w:w="1667" w:type="pct"/>
-          </w:tcPr>
-          <w:p>
-            <w:pPr>
-              <w:rPr>
-                <w:sz w:val="15"/>
-              </w:rPr>
-            </w:pPr>
-            <w:r>
-              <w:rPr>
+            <w:tcW w:w="3120" w:type="dxa"/>
+          </w:tcPr>
+          <w:p>
+            <w:pPr>
+              <w:rPr>
+                <w:rFonts w:ascii="Aptos" w:hAnsi="Aptos"/>
+                <w:sz w:val="15"/>
+              </w:rPr>
+            </w:pPr>
+            <w:r>
+              <w:rPr>
+                <w:rFonts w:ascii="Aptos" w:hAnsi="Aptos"/>
                 <w:sz w:val="15"/>
               </w:rPr>
               <w:t>THREAD 1, THREAD 2</w:t>
@@ -1205,16 +1400,18 @@
       <w:tr>
         <w:tc>
           <w:tcPr>
-            <w:tcW w:w="1666" w:type="pct"/>
-          </w:tcPr>
-          <w:p>
-            <w:pPr>
-              <w:rPr>
-                <w:sz w:val="15"/>
-              </w:rPr>
-            </w:pPr>
-            <w:r>
-              <w:rPr>
+            <w:tcW w:w="3120" w:type="dxa"/>
+          </w:tcPr>
+          <w:p>
+            <w:pPr>
+              <w:rPr>
+                <w:rFonts w:ascii="Aptos" w:hAnsi="Aptos"/>
+                <w:sz w:val="15"/>
+              </w:rPr>
+            </w:pPr>
+            <w:r>
+              <w:rPr>
+                <w:rFonts w:ascii="Aptos" w:hAnsi="Aptos"/>
                 <w:sz w:val="15"/>
               </w:rPr>
               <w:t>SRL</w:t>
@@ -1223,16 +1420,18 @@
         </w:tc>
         <w:tc>
           <w:tcPr>
-            <w:tcW w:w="1667" w:type="pct"/>
-          </w:tcPr>
-          <w:p>
-            <w:pPr>
-              <w:rPr>
-                <w:sz w:val="15"/>
-              </w:rPr>
-            </w:pPr>
-            <w:r>
-              <w:rPr>
+            <w:tcW w:w="3120" w:type="dxa"/>
+          </w:tcPr>
+          <w:p>
+            <w:pPr>
+              <w:rPr>
+                <w:rFonts w:ascii="Aptos" w:hAnsi="Aptos"/>
+                <w:sz w:val="15"/>
+              </w:rPr>
+            </w:pPr>
+            <w:r>
+              <w:rPr>
+                <w:rFonts w:ascii="Aptos" w:hAnsi="Aptos"/>
                 <w:sz w:val="15"/>
               </w:rPr>
               <w:t>online group + 1</w:t>
@@ -1241,16 +1440,18 @@
         </w:tc>
         <w:tc>
           <w:tcPr>
-            <w:tcW w:w="1667" w:type="pct"/>
-          </w:tcPr>
-          <w:p>
-            <w:pPr>
-              <w:rPr>
-                <w:sz w:val="15"/>
-              </w:rPr>
-            </w:pPr>
-            <w:r>
-              <w:rPr>
+            <w:tcW w:w="3120" w:type="dxa"/>
+          </w:tcPr>
+          <w:p>
+            <w:pPr>
+              <w:rPr>
+                <w:rFonts w:ascii="Aptos" w:hAnsi="Aptos"/>
+                <w:sz w:val="15"/>
+              </w:rPr>
+            </w:pPr>
+            <w:r>
+              <w:rPr>
+                <w:rFonts w:ascii="Aptos" w:hAnsi="Aptos"/>
                 <w:sz w:val="15"/>
               </w:rPr>
               <w:t>online group + 1 per thread</w:t>
@@ -1261,16 +1462,18 @@
       <w:tr>
         <w:tc>
           <w:tcPr>
-            <w:tcW w:w="1666" w:type="pct"/>
-          </w:tcPr>
-          <w:p>
-            <w:pPr>
-              <w:rPr>
-                <w:sz w:val="15"/>
-              </w:rPr>
-            </w:pPr>
-            <w:r>
-              <w:rPr>
+            <w:tcW w:w="3120" w:type="dxa"/>
+          </w:tcPr>
+          <w:p>
+            <w:pPr>
+              <w:rPr>
+                <w:rFonts w:ascii="Aptos" w:hAnsi="Aptos"/>
+                <w:sz w:val="15"/>
+              </w:rPr>
+            </w:pPr>
+            <w:r>
+              <w:rPr>
+                <w:rFonts w:ascii="Aptos" w:hAnsi="Aptos"/>
                 <w:sz w:val="15"/>
               </w:rPr>
               <w:t>gestione</w:t>
@@ -1279,16 +1482,18 @@
         </w:tc>
         <w:tc>
           <w:tcPr>
-            <w:tcW w:w="1667" w:type="pct"/>
-          </w:tcPr>
-          <w:p>
-            <w:pPr>
-              <w:rPr>
-                <w:sz w:val="15"/>
-              </w:rPr>
-            </w:pPr>
-            <w:r>
-              <w:rPr>
+            <w:tcW w:w="3120" w:type="dxa"/>
+          </w:tcPr>
+          <w:p>
+            <w:pPr>
+              <w:rPr>
+                <w:rFonts w:ascii="Aptos" w:hAnsi="Aptos"/>
+                <w:sz w:val="15"/>
+              </w:rPr>
+            </w:pPr>
+            <w:r>
+              <w:rPr>
+                <w:rFonts w:ascii="Aptos" w:hAnsi="Aptos"/>
                 <w:sz w:val="15"/>
               </w:rPr>
               <w:t>Oracle Restart</w:t>
@@ -1297,16 +1502,18 @@
         </w:tc>
         <w:tc>
           <w:tcPr>
-            <w:tcW w:w="1667" w:type="pct"/>
-          </w:tcPr>
-          <w:p>
-            <w:pPr>
-              <w:rPr>
-                <w:sz w:val="15"/>
-              </w:rPr>
-            </w:pPr>
-            <w:r>
-              <w:rPr>
+            <w:tcW w:w="3120" w:type="dxa"/>
+          </w:tcPr>
+          <w:p>
+            <w:pPr>
+              <w:rPr>
+                <w:rFonts w:ascii="Aptos" w:hAnsi="Aptos"/>
+                <w:sz w:val="15"/>
+              </w:rPr>
+            </w:pPr>
+            <w:r>
+              <w:rPr>
+                <w:rFonts w:ascii="Aptos" w:hAnsi="Aptos"/>
                 <w:sz w:val="15"/>
               </w:rPr>
               <w:t>Clusterware RAC</w:t>
@@ -1317,16 +1524,18 @@
       <w:tr>
         <w:tc>
           <w:tcPr>
-            <w:tcW w:w="1666" w:type="pct"/>
-          </w:tcPr>
-          <w:p>
-            <w:pPr>
-              <w:rPr>
-                <w:sz w:val="15"/>
-              </w:rPr>
-            </w:pPr>
-            <w:r>
-              <w:rPr>
+            <w:tcW w:w="3120" w:type="dxa"/>
+          </w:tcPr>
+          <w:p>
+            <w:pPr>
+              <w:rPr>
+                <w:rFonts w:ascii="Aptos" w:hAnsi="Aptos"/>
+                <w:sz w:val="15"/>
+              </w:rPr>
+            </w:pPr>
+            <w:r>
+              <w:rPr>
+                <w:rFonts w:ascii="Aptos" w:hAnsi="Aptos"/>
                 <w:sz w:val="15"/>
               </w:rPr>
               <w:t>endpoint client</w:t>
@@ -1335,16 +1544,18 @@
         </w:tc>
         <w:tc>
           <w:tcPr>
-            <w:tcW w:w="1667" w:type="pct"/>
-          </w:tcPr>
-          <w:p>
-            <w:pPr>
-              <w:rPr>
-                <w:sz w:val="15"/>
-              </w:rPr>
-            </w:pPr>
-            <w:r>
-              <w:rPr>
+            <w:tcW w:w="3120" w:type="dxa"/>
+          </w:tcPr>
+          <w:p>
+            <w:pPr>
+              <w:rPr>
+                <w:rFonts w:ascii="Aptos" w:hAnsi="Aptos"/>
+                <w:sz w:val="15"/>
+              </w:rPr>
+            </w:pPr>
+            <w:r>
+              <w:rPr>
+                <w:rFonts w:ascii="Aptos" w:hAnsi="Aptos"/>
                 <w:sz w:val="15"/>
               </w:rPr>
               <w:t>listener</w:t>
@@ -1353,16 +1564,18 @@
         </w:tc>
         <w:tc>
           <w:tcPr>
-            <w:tcW w:w="1667" w:type="pct"/>
-          </w:tcPr>
-          <w:p>
-            <w:pPr>
-              <w:rPr>
-                <w:sz w:val="15"/>
-              </w:rPr>
-            </w:pPr>
-            <w:r>
-              <w:rPr>
+            <w:tcW w:w="3120" w:type="dxa"/>
+          </w:tcPr>
+          <w:p>
+            <w:pPr>
+              <w:rPr>
+                <w:rFonts w:ascii="Aptos" w:hAnsi="Aptos"/>
+                <w:sz w:val="15"/>
+              </w:rPr>
+            </w:pPr>
+            <w:r>
+              <w:rPr>
+                <w:rFonts w:ascii="Aptos" w:hAnsi="Aptos"/>
                 <w:sz w:val="15"/>
               </w:rPr>
               <w:t>SCAN</w:t>
@@ -1373,16 +1586,18 @@
       <w:tr>
         <w:tc>
           <w:tcPr>
-            <w:tcW w:w="1666" w:type="pct"/>
-          </w:tcPr>
-          <w:p>
-            <w:pPr>
-              <w:rPr>
-                <w:sz w:val="15"/>
-              </w:rPr>
-            </w:pPr>
-            <w:r>
-              <w:rPr>
+            <w:tcW w:w="3120" w:type="dxa"/>
+          </w:tcPr>
+          <w:p>
+            <w:pPr>
+              <w:rPr>
+                <w:rFonts w:ascii="Aptos" w:hAnsi="Aptos"/>
+                <w:sz w:val="15"/>
+              </w:rPr>
+            </w:pPr>
+            <w:r>
+              <w:rPr>
+                <w:rFonts w:ascii="Aptos" w:hAnsi="Aptos"/>
                 <w:sz w:val="15"/>
               </w:rPr>
               <w:t>SID primary PE</w:t>
@@ -1391,16 +1606,18 @@
         </w:tc>
         <w:tc>
           <w:tcPr>
-            <w:tcW w:w="1667" w:type="pct"/>
-          </w:tcPr>
-          <w:p>
-            <w:pPr>
-              <w:rPr>
-                <w:sz w:val="15"/>
-              </w:rPr>
-            </w:pPr>
-            <w:r>
-              <w:rPr>
+            <w:tcW w:w="3120" w:type="dxa"/>
+          </w:tcPr>
+          <w:p>
+            <w:pPr>
+              <w:rPr>
+                <w:rFonts w:ascii="Aptos" w:hAnsi="Aptos"/>
+                <w:sz w:val="15"/>
+              </w:rPr>
+            </w:pPr>
+            <w:r>
+              <w:rPr>
+                <w:rFonts w:ascii="Aptos" w:hAnsi="Aptos"/>
                 <w:sz w:val="15"/>
               </w:rPr>
               <w:t>M24SHAMSPEC</w:t>
@@ -1409,16 +1626,18 @@
         </w:tc>
         <w:tc>
           <w:tcPr>
-            <w:tcW w:w="1667" w:type="pct"/>
-          </w:tcPr>
-          <w:p>
-            <w:pPr>
-              <w:rPr>
-                <w:sz w:val="15"/>
-              </w:rPr>
-            </w:pPr>
-            <w:r>
-              <w:rPr>
+            <w:tcW w:w="3120" w:type="dxa"/>
+          </w:tcPr>
+          <w:p>
+            <w:pPr>
+              <w:rPr>
+                <w:rFonts w:ascii="Aptos" w:hAnsi="Aptos"/>
+                <w:sz w:val="15"/>
+              </w:rPr>
+            </w:pPr>
+            <w:r>
+              <w:rPr>
+                <w:rFonts w:ascii="Aptos" w:hAnsi="Aptos"/>
                 <w:sz w:val="15"/>
               </w:rPr>
               <w:t>M24SHAMSPEC1, M24SHAMSPEC2</w:t>
@@ -1429,16 +1648,18 @@
       <w:tr>
         <w:tc>
           <w:tcPr>
-            <w:tcW w:w="1666" w:type="pct"/>
-          </w:tcPr>
-          <w:p>
-            <w:pPr>
-              <w:rPr>
-                <w:sz w:val="15"/>
-              </w:rPr>
-            </w:pPr>
-            <w:r>
-              <w:rPr>
+            <w:tcW w:w="3120" w:type="dxa"/>
+          </w:tcPr>
+          <w:p>
+            <w:pPr>
+              <w:rPr>
+                <w:rFonts w:ascii="Aptos" w:hAnsi="Aptos"/>
+                <w:sz w:val="15"/>
+              </w:rPr>
+            </w:pPr>
+            <w:r>
+              <w:rPr>
+                <w:rFonts w:ascii="Aptos" w:hAnsi="Aptos"/>
                 <w:sz w:val="15"/>
               </w:rPr>
               <w:t>SID standby SE</w:t>
@@ -1447,16 +1668,18 @@
         </w:tc>
         <w:tc>
           <w:tcPr>
-            <w:tcW w:w="1667" w:type="pct"/>
-          </w:tcPr>
-          <w:p>
-            <w:pPr>
-              <w:rPr>
-                <w:sz w:val="15"/>
-              </w:rPr>
-            </w:pPr>
-            <w:r>
-              <w:rPr>
+            <w:tcW w:w="3120" w:type="dxa"/>
+          </w:tcPr>
+          <w:p>
+            <w:pPr>
+              <w:rPr>
+                <w:rFonts w:ascii="Aptos" w:hAnsi="Aptos"/>
+                <w:sz w:val="15"/>
+              </w:rPr>
+            </w:pPr>
+            <w:r>
+              <w:rPr>
+                <w:rFonts w:ascii="Aptos" w:hAnsi="Aptos"/>
                 <w:sz w:val="15"/>
               </w:rPr>
               <w:t>M24SHAMSSEC</w:t>
@@ -1465,16 +1688,18 @@
         </w:tc>
         <w:tc>
           <w:tcPr>
-            <w:tcW w:w="1667" w:type="pct"/>
-          </w:tcPr>
-          <w:p>
-            <w:pPr>
-              <w:rPr>
-                <w:sz w:val="15"/>
-              </w:rPr>
-            </w:pPr>
-            <w:r>
-              <w:rPr>
+            <w:tcW w:w="3120" w:type="dxa"/>
+          </w:tcPr>
+          <w:p>
+            <w:pPr>
+              <w:rPr>
+                <w:rFonts w:ascii="Aptos" w:hAnsi="Aptos"/>
+                <w:sz w:val="15"/>
+              </w:rPr>
+            </w:pPr>
+            <w:r>
+              <w:rPr>
+                <w:rFonts w:ascii="Aptos" w:hAnsi="Aptos"/>
                 <w:sz w:val="15"/>
               </w:rPr>
               <w:t>M24SHAMSSEC1, M24SHAMSSEC2</w:t>
@@ -1487,29 +1712,42 @@
     <w:tbl>
       <w:tblPr>
         <w:tblStyle w:val="TableGrid"/>
-        <w:tblW w:w="5000" w:type="pct"/>
+        <w:tblW w:w="9360" w:type="dxa"/>
+        <w:tblInd w:w="-5" w:type="dxa"/>
+        <w:tblLayout w:type="fixed"/>
+        <w:tblCellMar>
+          <w:top w:w="80" w:type="dxa"/>
+          <w:left w:w="120" w:type="dxa"/>
+          <w:bottom w:w="80" w:type="dxa"/>
+          <w:right w:w="120" w:type="dxa"/>
+        </w:tblCellMar>
         <w:tblLook w:val="04A0" w:firstRow="1" w:lastRow="0" w:firstColumn="1" w:lastColumn="0" w:noHBand="0" w:noVBand="1"/>
       </w:tblPr>
       <w:tblGrid>
-        <w:gridCol w:w="3324"/>
-        <w:gridCol w:w="3326"/>
-        <w:gridCol w:w="3326"/>
+        <w:gridCol w:w="3120"/>
+        <w:gridCol w:w="3120"/>
+        <w:gridCol w:w="3120"/>
       </w:tblGrid>
       <w:tr>
-        <w:tc>
-          <w:tcPr>
-            <w:tcW w:w="1666" w:type="pct"/>
+        <w:trPr>
+          <w:tblHeader/>
+        </w:trPr>
+        <w:tc>
+          <w:tcPr>
+            <w:tcW w:w="3120" w:type="dxa"/>
             <w:shd w:val="clear" w:color="auto" w:fill="E6E6E6"/>
           </w:tcPr>
           <w:p>
             <w:pPr>
               <w:rPr>
+                <w:rFonts w:ascii="Aptos" w:hAnsi="Aptos"/>
                 <w:b/>
                 <w:sz w:val="15"/>
               </w:rPr>
             </w:pPr>
             <w:r>
               <w:rPr>
+                <w:rFonts w:ascii="Aptos" w:hAnsi="Aptos"/>
                 <w:b/>
                 <w:sz w:val="15"/>
               </w:rPr>
@@ -1519,18 +1757,20 @@
         </w:tc>
         <w:tc>
           <w:tcPr>
-            <w:tcW w:w="1667" w:type="pct"/>
+            <w:tcW w:w="3120" w:type="dxa"/>
             <w:shd w:val="clear" w:color="auto" w:fill="E6E6E6"/>
           </w:tcPr>
           <w:p>
             <w:pPr>
               <w:rPr>
+                <w:rFonts w:ascii="Aptos" w:hAnsi="Aptos"/>
                 <w:b/>
                 <w:sz w:val="15"/>
               </w:rPr>
             </w:pPr>
             <w:r>
               <w:rPr>
+                <w:rFonts w:ascii="Aptos" w:hAnsi="Aptos"/>
                 <w:b/>
                 <w:sz w:val="15"/>
               </w:rPr>
@@ -1540,18 +1780,20 @@
         </w:tc>
         <w:tc>
           <w:tcPr>
-            <w:tcW w:w="1667" w:type="pct"/>
+            <w:tcW w:w="3120" w:type="dxa"/>
             <w:shd w:val="clear" w:color="auto" w:fill="E6E6E6"/>
           </w:tcPr>
           <w:p>
             <w:pPr>
               <w:rPr>
+                <w:rFonts w:ascii="Aptos" w:hAnsi="Aptos"/>
                 <w:b/>
                 <w:sz w:val="15"/>
               </w:rPr>
             </w:pPr>
             <w:r>
               <w:rPr>
+                <w:rFonts w:ascii="Aptos" w:hAnsi="Aptos"/>
                 <w:b/>
                 <w:sz w:val="15"/>
               </w:rPr>
@@ -1563,16 +1805,18 @@
       <w:tr>
         <w:tc>
           <w:tcPr>
-            <w:tcW w:w="1666" w:type="pct"/>
-          </w:tcPr>
-          <w:p>
-            <w:pPr>
-              <w:rPr>
-                <w:sz w:val="15"/>
-              </w:rPr>
-            </w:pPr>
-            <w:r>
-              <w:rPr>
+            <w:tcW w:w="3120" w:type="dxa"/>
+          </w:tcPr>
+          <w:p>
+            <w:pPr>
+              <w:rPr>
+                <w:rFonts w:ascii="Aptos" w:hAnsi="Aptos"/>
+                <w:sz w:val="15"/>
+              </w:rPr>
+            </w:pPr>
+            <w:r>
+              <w:rPr>
+                <w:rFonts w:ascii="Aptos" w:hAnsi="Aptos"/>
                 <w:sz w:val="15"/>
               </w:rPr>
               <w:t>CDB</w:t>
@@ -1581,16 +1825,18 @@
         </w:tc>
         <w:tc>
           <w:tcPr>
-            <w:tcW w:w="1667" w:type="pct"/>
-          </w:tcPr>
-          <w:p>
-            <w:pPr>
-              <w:rPr>
-                <w:sz w:val="15"/>
-              </w:rPr>
-            </w:pPr>
-            <w:r>
-              <w:rPr>
+            <w:tcW w:w="3120" w:type="dxa"/>
+          </w:tcPr>
+          <w:p>
+            <w:pPr>
+              <w:rPr>
+                <w:rFonts w:ascii="Aptos" w:hAnsi="Aptos"/>
+                <w:sz w:val="15"/>
+              </w:rPr>
+            </w:pPr>
+            <w:r>
+              <w:rPr>
+                <w:rFonts w:ascii="Aptos" w:hAnsi="Aptos"/>
                 <w:sz w:val="15"/>
               </w:rPr>
               <w:t>NO</w:t>
@@ -1599,16 +1845,18 @@
         </w:tc>
         <w:tc>
           <w:tcPr>
-            <w:tcW w:w="1667" w:type="pct"/>
-          </w:tcPr>
-          <w:p>
-            <w:pPr>
-              <w:rPr>
-                <w:sz w:val="15"/>
-              </w:rPr>
-            </w:pPr>
-            <w:r>
-              <w:rPr>
+            <w:tcW w:w="3120" w:type="dxa"/>
+          </w:tcPr>
+          <w:p>
+            <w:pPr>
+              <w:rPr>
+                <w:rFonts w:ascii="Aptos" w:hAnsi="Aptos"/>
+                <w:sz w:val="15"/>
+              </w:rPr>
+            </w:pPr>
+            <w:r>
+              <w:rPr>
+                <w:rFonts w:ascii="Aptos" w:hAnsi="Aptos"/>
                 <w:sz w:val="15"/>
               </w:rPr>
               <w:t>YES</w:t>
@@ -1619,34 +1867,39 @@
       <w:tr>
         <w:tc>
           <w:tcPr>
-            <w:tcW w:w="1666" w:type="pct"/>
-          </w:tcPr>
-          <w:p>
-            <w:pPr>
-              <w:rPr>
-                <w:sz w:val="15"/>
-              </w:rPr>
-            </w:pPr>
-            <w:r>
-              <w:rPr>
-                <w:sz w:val="15"/>
-              </w:rPr>
+            <w:tcW w:w="3120" w:type="dxa"/>
+          </w:tcPr>
+          <w:p>
+            <w:pPr>
+              <w:rPr>
+                <w:rFonts w:ascii="Aptos" w:hAnsi="Aptos"/>
+                <w:sz w:val="15"/>
+              </w:rPr>
+            </w:pPr>
+            <w:r>
+              <w:rPr>
+                <w:rFonts w:ascii="Aptos" w:hAnsi="Aptos"/>
+                <w:sz w:val="15"/>
+              </w:rPr>
+              <w:lastRenderedPageBreak/>
               <w:t>PDB</w:t>
             </w:r>
           </w:p>
         </w:tc>
         <w:tc>
           <w:tcPr>
-            <w:tcW w:w="1667" w:type="pct"/>
-          </w:tcPr>
-          <w:p>
-            <w:pPr>
-              <w:rPr>
-                <w:sz w:val="15"/>
-              </w:rPr>
-            </w:pPr>
-            <w:r>
-              <w:rPr>
+            <w:tcW w:w="3120" w:type="dxa"/>
+          </w:tcPr>
+          <w:p>
+            <w:pPr>
+              <w:rPr>
+                <w:rFonts w:ascii="Aptos" w:hAnsi="Aptos"/>
+                <w:sz w:val="15"/>
+              </w:rPr>
+            </w:pPr>
+            <w:r>
+              <w:rPr>
+                <w:rFonts w:ascii="Aptos" w:hAnsi="Aptos"/>
                 <w:sz w:val="15"/>
               </w:rPr>
               <w:t>N/A</w:t>
@@ -1655,16 +1908,18 @@
         </w:tc>
         <w:tc>
           <w:tcPr>
-            <w:tcW w:w="1667" w:type="pct"/>
-          </w:tcPr>
-          <w:p>
-            <w:pPr>
-              <w:rPr>
-                <w:sz w:val="15"/>
-              </w:rPr>
-            </w:pPr>
-            <w:r>
-              <w:rPr>
+            <w:tcW w:w="3120" w:type="dxa"/>
+          </w:tcPr>
+          <w:p>
+            <w:pPr>
+              <w:rPr>
+                <w:rFonts w:ascii="Aptos" w:hAnsi="Aptos"/>
+                <w:sz w:val="15"/>
+              </w:rPr>
+            </w:pPr>
+            <w:r>
+              <w:rPr>
+                <w:rFonts w:ascii="Aptos" w:hAnsi="Aptos"/>
                 <w:sz w:val="15"/>
               </w:rPr>
               <w:t>M24SHAMSC_APP</w:t>
@@ -1675,16 +1930,18 @@
       <w:tr>
         <w:tc>
           <w:tcPr>
-            <w:tcW w:w="1666" w:type="pct"/>
-          </w:tcPr>
-          <w:p>
-            <w:pPr>
-              <w:rPr>
-                <w:sz w:val="15"/>
-              </w:rPr>
-            </w:pPr>
-            <w:r>
-              <w:rPr>
+            <w:tcW w:w="3120" w:type="dxa"/>
+          </w:tcPr>
+          <w:p>
+            <w:pPr>
+              <w:rPr>
+                <w:rFonts w:ascii="Aptos" w:hAnsi="Aptos"/>
+                <w:sz w:val="15"/>
+              </w:rPr>
+            </w:pPr>
+            <w:r>
+              <w:rPr>
+                <w:rFonts w:ascii="Aptos" w:hAnsi="Aptos"/>
                 <w:sz w:val="15"/>
               </w:rPr>
               <w:t>service applicativo</w:t>
@@ -1693,16 +1950,18 @@
         </w:tc>
         <w:tc>
           <w:tcPr>
-            <w:tcW w:w="1667" w:type="pct"/>
-          </w:tcPr>
-          <w:p>
-            <w:pPr>
-              <w:rPr>
-                <w:sz w:val="15"/>
-              </w:rPr>
-            </w:pPr>
-            <w:r>
-              <w:rPr>
+            <w:tcW w:w="3120" w:type="dxa"/>
+          </w:tcPr>
+          <w:p>
+            <w:pPr>
+              <w:rPr>
+                <w:rFonts w:ascii="Aptos" w:hAnsi="Aptos"/>
+                <w:sz w:val="15"/>
+              </w:rPr>
+            </w:pPr>
+            <w:r>
+              <w:rPr>
+                <w:rFonts w:ascii="Aptos" w:hAnsi="Aptos"/>
                 <w:sz w:val="15"/>
               </w:rPr>
               <w:t>database</w:t>
@@ -1711,16 +1970,18 @@
         </w:tc>
         <w:tc>
           <w:tcPr>
-            <w:tcW w:w="1667" w:type="pct"/>
-          </w:tcPr>
-          <w:p>
-            <w:pPr>
-              <w:rPr>
-                <w:sz w:val="15"/>
-              </w:rPr>
-            </w:pPr>
-            <w:r>
-              <w:rPr>
+            <w:tcW w:w="3120" w:type="dxa"/>
+          </w:tcPr>
+          <w:p>
+            <w:pPr>
+              <w:rPr>
+                <w:rFonts w:ascii="Aptos" w:hAnsi="Aptos"/>
+                <w:sz w:val="15"/>
+              </w:rPr>
+            </w:pPr>
+            <w:r>
+              <w:rPr>
+                <w:rFonts w:ascii="Aptos" w:hAnsi="Aptos"/>
                 <w:sz w:val="15"/>
               </w:rPr>
               <w:t>PDB</w:t>
@@ -1731,16 +1992,18 @@
       <w:tr>
         <w:tc>
           <w:tcPr>
-            <w:tcW w:w="1666" w:type="pct"/>
-          </w:tcPr>
-          <w:p>
-            <w:pPr>
-              <w:rPr>
-                <w:sz w:val="15"/>
-              </w:rPr>
-            </w:pPr>
-            <w:r>
-              <w:rPr>
+            <w:tcW w:w="3120" w:type="dxa"/>
+          </w:tcPr>
+          <w:p>
+            <w:pPr>
+              <w:rPr>
+                <w:rFonts w:ascii="Aptos" w:hAnsi="Aptos"/>
+                <w:sz w:val="15"/>
+              </w:rPr>
+            </w:pPr>
+            <w:r>
+              <w:rPr>
+                <w:rFonts w:ascii="Aptos" w:hAnsi="Aptos"/>
                 <w:sz w:val="15"/>
               </w:rPr>
               <w:t>role transition</w:t>
@@ -1749,16 +2012,18 @@
         </w:tc>
         <w:tc>
           <w:tcPr>
-            <w:tcW w:w="1667" w:type="pct"/>
-          </w:tcPr>
-          <w:p>
-            <w:pPr>
-              <w:rPr>
-                <w:sz w:val="15"/>
-              </w:rPr>
-            </w:pPr>
-            <w:r>
-              <w:rPr>
+            <w:tcW w:w="3120" w:type="dxa"/>
+          </w:tcPr>
+          <w:p>
+            <w:pPr>
+              <w:rPr>
+                <w:rFonts w:ascii="Aptos" w:hAnsi="Aptos"/>
+                <w:sz w:val="15"/>
+              </w:rPr>
+            </w:pPr>
+            <w:r>
+              <w:rPr>
+                <w:rFonts w:ascii="Aptos" w:hAnsi="Aptos"/>
                 <w:sz w:val="15"/>
               </w:rPr>
               <w:t>database</w:t>
@@ -1767,16 +2032,18 @@
         </w:tc>
         <w:tc>
           <w:tcPr>
-            <w:tcW w:w="1667" w:type="pct"/>
-          </w:tcPr>
-          <w:p>
-            <w:pPr>
-              <w:rPr>
-                <w:sz w:val="15"/>
-              </w:rPr>
-            </w:pPr>
-            <w:r>
-              <w:rPr>
+            <w:tcW w:w="3120" w:type="dxa"/>
+          </w:tcPr>
+          <w:p>
+            <w:pPr>
+              <w:rPr>
+                <w:rFonts w:ascii="Aptos" w:hAnsi="Aptos"/>
+                <w:sz w:val="15"/>
+              </w:rPr>
+            </w:pPr>
+            <w:r>
+              <w:rPr>
+                <w:rFonts w:ascii="Aptos" w:hAnsi="Aptos"/>
                 <w:sz w:val="15"/>
               </w:rPr>
               <w:t>intera CDB</w:t>
@@ -1827,43 +2094,99 @@
       </w:r>
     </w:p>
     <w:p>
-      <w:r>
-        <w:t>• redo transport;</w:t>
-      </w:r>
-    </w:p>
-    <w:p>
-      <w:r>
-        <w:t>• apply;</w:t>
-      </w:r>
-    </w:p>
-    <w:p>
-      <w:r>
-        <w:t>• lag;</w:t>
-      </w:r>
-    </w:p>
-    <w:p>
-      <w:r>
-        <w:t>• SRL;</w:t>
-      </w:r>
-    </w:p>
-    <w:p>
-      <w:r>
-        <w:t>• TDE;</w:t>
-      </w:r>
-    </w:p>
-    <w:p>
-      <w:r>
-        <w:t>• servizi role-based;</w:t>
-      </w:r>
-    </w:p>
-    <w:p>
-      <w:r>
-        <w:t>• backup RMAN standby;</w:t>
-      </w:r>
-    </w:p>
-    <w:p>
-      <w:r>
-        <w:t>• switchover e switchback.</w:t>
+      <w:pPr>
+        <w:pStyle w:val="ListParagraph"/>
+        <w:numPr>
+          <w:ilvl w:val="0"/>
+          <w:numId w:val="1"/>
+        </w:numPr>
+      </w:pPr>
+      <w:r>
+        <w:t>redo transport;</w:t>
+      </w:r>
+    </w:p>
+    <w:p>
+      <w:pPr>
+        <w:pStyle w:val="ListParagraph"/>
+        <w:numPr>
+          <w:ilvl w:val="0"/>
+          <w:numId w:val="1"/>
+        </w:numPr>
+      </w:pPr>
+      <w:r>
+        <w:t>apply;</w:t>
+      </w:r>
+    </w:p>
+    <w:p>
+      <w:pPr>
+        <w:pStyle w:val="ListParagraph"/>
+        <w:numPr>
+          <w:ilvl w:val="0"/>
+          <w:numId w:val="1"/>
+        </w:numPr>
+      </w:pPr>
+      <w:r>
+        <w:t>lag;</w:t>
+      </w:r>
+    </w:p>
+    <w:p>
+      <w:pPr>
+        <w:pStyle w:val="ListParagraph"/>
+        <w:numPr>
+          <w:ilvl w:val="0"/>
+          <w:numId w:val="1"/>
+        </w:numPr>
+      </w:pPr>
+      <w:r>
+        <w:t>SRL;</w:t>
+      </w:r>
+    </w:p>
+    <w:p>
+      <w:pPr>
+        <w:pStyle w:val="ListParagraph"/>
+        <w:numPr>
+          <w:ilvl w:val="0"/>
+          <w:numId w:val="1"/>
+        </w:numPr>
+      </w:pPr>
+      <w:r>
+        <w:t>TDE;</w:t>
+      </w:r>
+    </w:p>
+    <w:p>
+      <w:pPr>
+        <w:pStyle w:val="ListParagraph"/>
+        <w:numPr>
+          <w:ilvl w:val="0"/>
+          <w:numId w:val="1"/>
+        </w:numPr>
+      </w:pPr>
+      <w:r>
+        <w:t>servizi role-based; _RO solo se ADG autorizzato;</w:t>
+      </w:r>
+    </w:p>
+    <w:p>
+      <w:pPr>
+        <w:pStyle w:val="ListParagraph"/>
+        <w:numPr>
+          <w:ilvl w:val="0"/>
+          <w:numId w:val="1"/>
+        </w:numPr>
+      </w:pPr>
+      <w:r>
+        <w:t>backup RMAN standby;</w:t>
+      </w:r>
+    </w:p>
+    <w:p>
+      <w:pPr>
+        <w:pStyle w:val="ListParagraph"/>
+        <w:numPr>
+          <w:ilvl w:val="0"/>
+          <w:numId w:val="1"/>
+        </w:numPr>
+      </w:pPr>
+      <w:r>
+        <w:t>switchover e switchback.</w:t>
       </w:r>
     </w:p>
     <w:p>
@@ -1926,34 +2249,48 @@
         <w:pStyle w:val="Heading1"/>
       </w:pPr>
       <w:r>
+        <w:lastRenderedPageBreak/>
         <w:t>Validazione finale</w:t>
       </w:r>
     </w:p>
     <w:tbl>
       <w:tblPr>
         <w:tblStyle w:val="TableGrid"/>
-        <w:tblW w:w="5000" w:type="pct"/>
+        <w:tblW w:w="9360" w:type="dxa"/>
+        <w:tblInd w:w="-5" w:type="dxa"/>
+        <w:tblLayout w:type="fixed"/>
+        <w:tblCellMar>
+          <w:top w:w="80" w:type="dxa"/>
+          <w:left w:w="120" w:type="dxa"/>
+          <w:bottom w:w="80" w:type="dxa"/>
+          <w:right w:w="120" w:type="dxa"/>
+        </w:tblCellMar>
         <w:tblLook w:val="04A0" w:firstRow="1" w:lastRow="0" w:firstColumn="1" w:lastColumn="0" w:noHBand="0" w:noVBand="1"/>
       </w:tblPr>
       <w:tblGrid>
-        <w:gridCol w:w="4988"/>
-        <w:gridCol w:w="4988"/>
+        <w:gridCol w:w="4680"/>
+        <w:gridCol w:w="4680"/>
       </w:tblGrid>
       <w:tr>
-        <w:tc>
-          <w:tcPr>
-            <w:tcW w:w="2500" w:type="pct"/>
+        <w:trPr>
+          <w:tblHeader/>
+        </w:trPr>
+        <w:tc>
+          <w:tcPr>
+            <w:tcW w:w="4680" w:type="dxa"/>
             <w:shd w:val="clear" w:color="auto" w:fill="E6E6E6"/>
           </w:tcPr>
           <w:p>
             <w:pPr>
               <w:rPr>
+                <w:rFonts w:ascii="Aptos" w:hAnsi="Aptos"/>
                 <w:b/>
                 <w:sz w:val="15"/>
               </w:rPr>
             </w:pPr>
             <w:r>
               <w:rPr>
+                <w:rFonts w:ascii="Aptos" w:hAnsi="Aptos"/>
                 <w:b/>
                 <w:sz w:val="15"/>
               </w:rPr>
@@ -1963,18 +2300,20 @@
         </w:tc>
         <w:tc>
           <w:tcPr>
-            <w:tcW w:w="2500" w:type="pct"/>
+            <w:tcW w:w="4680" w:type="dxa"/>
             <w:shd w:val="clear" w:color="auto" w:fill="E6E6E6"/>
           </w:tcPr>
           <w:p>
             <w:pPr>
               <w:rPr>
+                <w:rFonts w:ascii="Aptos" w:hAnsi="Aptos"/>
                 <w:b/>
                 <w:sz w:val="15"/>
               </w:rPr>
             </w:pPr>
             <w:r>
               <w:rPr>
+                <w:rFonts w:ascii="Aptos" w:hAnsi="Aptos"/>
                 <w:b/>
                 <w:sz w:val="15"/>
               </w:rPr>
@@ -1986,16 +2325,18 @@
       <w:tr>
         <w:tc>
           <w:tcPr>
-            <w:tcW w:w="2500" w:type="pct"/>
-          </w:tcPr>
-          <w:p>
-            <w:pPr>
-              <w:rPr>
-                <w:sz w:val="15"/>
-              </w:rPr>
-            </w:pPr>
-            <w:r>
-              <w:rPr>
+            <w:tcW w:w="4680" w:type="dxa"/>
+          </w:tcPr>
+          <w:p>
+            <w:pPr>
+              <w:rPr>
+                <w:rFonts w:ascii="Aptos" w:hAnsi="Aptos"/>
+                <w:sz w:val="15"/>
+              </w:rPr>
+            </w:pPr>
+            <w:r>
+              <w:rPr>
+                <w:rFonts w:ascii="Aptos" w:hAnsi="Aptos"/>
                 <w:sz w:val="15"/>
               </w:rPr>
               <w:t>blueprint univoco selezionato</w:t>
@@ -2004,16 +2345,18 @@
         </w:tc>
         <w:tc>
           <w:tcPr>
-            <w:tcW w:w="2500" w:type="pct"/>
-          </w:tcPr>
-          <w:p>
-            <w:pPr>
-              <w:rPr>
-                <w:sz w:val="15"/>
-              </w:rPr>
-            </w:pPr>
-            <w:r>
-              <w:rPr>
+            <w:tcW w:w="4680" w:type="dxa"/>
+          </w:tcPr>
+          <w:p>
+            <w:pPr>
+              <w:rPr>
+                <w:rFonts w:ascii="Aptos" w:hAnsi="Aptos"/>
+                <w:sz w:val="15"/>
+              </w:rPr>
+            </w:pPr>
+            <w:r>
+              <w:rPr>
+                <w:rFonts w:ascii="Aptos" w:hAnsi="Aptos"/>
                 <w:sz w:val="15"/>
               </w:rPr>
               <w:t>&lt;OK/KO&gt;</w:t>
@@ -2024,16 +2367,18 @@
       <w:tr>
         <w:tc>
           <w:tcPr>
-            <w:tcW w:w="2500" w:type="pct"/>
-          </w:tcPr>
-          <w:p>
-            <w:pPr>
-              <w:rPr>
-                <w:sz w:val="15"/>
-              </w:rPr>
-            </w:pPr>
-            <w:r>
-              <w:rPr>
+            <w:tcW w:w="4680" w:type="dxa"/>
+          </w:tcPr>
+          <w:p>
+            <w:pPr>
+              <w:rPr>
+                <w:rFonts w:ascii="Aptos" w:hAnsi="Aptos"/>
+                <w:sz w:val="15"/>
+              </w:rPr>
+            </w:pPr>
+            <w:r>
+              <w:rPr>
+                <w:rFonts w:ascii="Aptos" w:hAnsi="Aptos"/>
                 <w:sz w:val="15"/>
               </w:rPr>
               <w:t>host checklist chiusa</w:t>
@@ -2042,16 +2387,18 @@
         </w:tc>
         <w:tc>
           <w:tcPr>
-            <w:tcW w:w="2500" w:type="pct"/>
-          </w:tcPr>
-          <w:p>
-            <w:pPr>
-              <w:rPr>
-                <w:sz w:val="15"/>
-              </w:rPr>
-            </w:pPr>
-            <w:r>
-              <w:rPr>
+            <w:tcW w:w="4680" w:type="dxa"/>
+          </w:tcPr>
+          <w:p>
+            <w:pPr>
+              <w:rPr>
+                <w:rFonts w:ascii="Aptos" w:hAnsi="Aptos"/>
+                <w:sz w:val="15"/>
+              </w:rPr>
+            </w:pPr>
+            <w:r>
+              <w:rPr>
+                <w:rFonts w:ascii="Aptos" w:hAnsi="Aptos"/>
                 <w:sz w:val="15"/>
               </w:rPr>
               <w:t>&lt;OK/KO&gt;</w:t>
@@ -2062,16 +2409,18 @@
       <w:tr>
         <w:tc>
           <w:tcPr>
-            <w:tcW w:w="2500" w:type="pct"/>
-          </w:tcPr>
-          <w:p>
-            <w:pPr>
-              <w:rPr>
-                <w:sz w:val="15"/>
-              </w:rPr>
-            </w:pPr>
-            <w:r>
-              <w:rPr>
+            <w:tcW w:w="4680" w:type="dxa"/>
+          </w:tcPr>
+          <w:p>
+            <w:pPr>
+              <w:rPr>
+                <w:rFonts w:ascii="Aptos" w:hAnsi="Aptos"/>
+                <w:sz w:val="15"/>
+              </w:rPr>
+            </w:pPr>
+            <w:r>
+              <w:rPr>
+                <w:rFonts w:ascii="Aptos" w:hAnsi="Aptos"/>
                 <w:sz w:val="15"/>
               </w:rPr>
               <w:t>database checklist chiusa</w:t>
@@ -2080,16 +2429,18 @@
         </w:tc>
         <w:tc>
           <w:tcPr>
-            <w:tcW w:w="2500" w:type="pct"/>
-          </w:tcPr>
-          <w:p>
-            <w:pPr>
-              <w:rPr>
-                <w:sz w:val="15"/>
-              </w:rPr>
-            </w:pPr>
-            <w:r>
-              <w:rPr>
+            <w:tcW w:w="4680" w:type="dxa"/>
+          </w:tcPr>
+          <w:p>
+            <w:pPr>
+              <w:rPr>
+                <w:rFonts w:ascii="Aptos" w:hAnsi="Aptos"/>
+                <w:sz w:val="15"/>
+              </w:rPr>
+            </w:pPr>
+            <w:r>
+              <w:rPr>
+                <w:rFonts w:ascii="Aptos" w:hAnsi="Aptos"/>
                 <w:sz w:val="15"/>
               </w:rPr>
               <w:t>&lt;OK/KO&gt;</w:t>
@@ -2100,16 +2451,18 @@
       <w:tr>
         <w:tc>
           <w:tcPr>
-            <w:tcW w:w="2500" w:type="pct"/>
-          </w:tcPr>
-          <w:p>
-            <w:pPr>
-              <w:rPr>
-                <w:sz w:val="15"/>
-              </w:rPr>
-            </w:pPr>
-            <w:r>
-              <w:rPr>
+            <w:tcW w:w="4680" w:type="dxa"/>
+          </w:tcPr>
+          <w:p>
+            <w:pPr>
+              <w:rPr>
+                <w:rFonts w:ascii="Aptos" w:hAnsi="Aptos"/>
+                <w:sz w:val="15"/>
+              </w:rPr>
+            </w:pPr>
+            <w:r>
+              <w:rPr>
+                <w:rFonts w:ascii="Aptos" w:hAnsi="Aptos"/>
                 <w:sz w:val="15"/>
               </w:rPr>
               <w:t>Broker SUCCESS</w:t>
@@ -2118,16 +2471,18 @@
         </w:tc>
         <w:tc>
           <w:tcPr>
-            <w:tcW w:w="2500" w:type="pct"/>
-          </w:tcPr>
-          <w:p>
-            <w:pPr>
-              <w:rPr>
-                <w:sz w:val="15"/>
-              </w:rPr>
-            </w:pPr>
-            <w:r>
-              <w:rPr>
+            <w:tcW w:w="4680" w:type="dxa"/>
+          </w:tcPr>
+          <w:p>
+            <w:pPr>
+              <w:rPr>
+                <w:rFonts w:ascii="Aptos" w:hAnsi="Aptos"/>
+                <w:sz w:val="15"/>
+              </w:rPr>
+            </w:pPr>
+            <w:r>
+              <w:rPr>
+                <w:rFonts w:ascii="Aptos" w:hAnsi="Aptos"/>
                 <w:sz w:val="15"/>
               </w:rPr>
               <w:t>&lt;OK/KO&gt;</w:t>
@@ -2138,16 +2493,18 @@
       <w:tr>
         <w:tc>
           <w:tcPr>
-            <w:tcW w:w="2500" w:type="pct"/>
-          </w:tcPr>
-          <w:p>
-            <w:pPr>
-              <w:rPr>
-                <w:sz w:val="15"/>
-              </w:rPr>
-            </w:pPr>
-            <w:r>
-              <w:rPr>
+            <w:tcW w:w="4680" w:type="dxa"/>
+          </w:tcPr>
+          <w:p>
+            <w:pPr>
+              <w:rPr>
+                <w:rFonts w:ascii="Aptos" w:hAnsi="Aptos"/>
+                <w:sz w:val="15"/>
+              </w:rPr>
+            </w:pPr>
+            <w:r>
+              <w:rPr>
+                <w:rFonts w:ascii="Aptos" w:hAnsi="Aptos"/>
                 <w:sz w:val="15"/>
               </w:rPr>
               <w:t>RMAN standby e restore test</w:t>
@@ -2156,16 +2513,18 @@
         </w:tc>
         <w:tc>
           <w:tcPr>
-            <w:tcW w:w="2500" w:type="pct"/>
-          </w:tcPr>
-          <w:p>
-            <w:pPr>
-              <w:rPr>
-                <w:sz w:val="15"/>
-              </w:rPr>
-            </w:pPr>
-            <w:r>
-              <w:rPr>
+            <w:tcW w:w="4680" w:type="dxa"/>
+          </w:tcPr>
+          <w:p>
+            <w:pPr>
+              <w:rPr>
+                <w:rFonts w:ascii="Aptos" w:hAnsi="Aptos"/>
+                <w:sz w:val="15"/>
+              </w:rPr>
+            </w:pPr>
+            <w:r>
+              <w:rPr>
+                <w:rFonts w:ascii="Aptos" w:hAnsi="Aptos"/>
                 <w:sz w:val="15"/>
               </w:rPr>
               <w:t>&lt;OK/KO&gt;</w:t>
@@ -2176,16 +2535,18 @@
       <w:tr>
         <w:tc>
           <w:tcPr>
-            <w:tcW w:w="2500" w:type="pct"/>
-          </w:tcPr>
-          <w:p>
-            <w:pPr>
-              <w:rPr>
-                <w:sz w:val="15"/>
-              </w:rPr>
-            </w:pPr>
-            <w:r>
-              <w:rPr>
+            <w:tcW w:w="4680" w:type="dxa"/>
+          </w:tcPr>
+          <w:p>
+            <w:pPr>
+              <w:rPr>
+                <w:rFonts w:ascii="Aptos" w:hAnsi="Aptos"/>
+                <w:sz w:val="15"/>
+              </w:rPr>
+            </w:pPr>
+            <w:r>
+              <w:rPr>
+                <w:rFonts w:ascii="Aptos" w:hAnsi="Aptos"/>
                 <w:sz w:val="15"/>
               </w:rPr>
               <w:t>switchover e switchback</w:t>
@@ -2194,16 +2555,18 @@
         </w:tc>
         <w:tc>
           <w:tcPr>
-            <w:tcW w:w="2500" w:type="pct"/>
-          </w:tcPr>
-          <w:p>
-            <w:pPr>
-              <w:rPr>
-                <w:sz w:val="15"/>
-              </w:rPr>
-            </w:pPr>
-            <w:r>
-              <w:rPr>
+            <w:tcW w:w="4680" w:type="dxa"/>
+          </w:tcPr>
+          <w:p>
+            <w:pPr>
+              <w:rPr>
+                <w:rFonts w:ascii="Aptos" w:hAnsi="Aptos"/>
+                <w:sz w:val="15"/>
+              </w:rPr>
+            </w:pPr>
+            <w:r>
+              <w:rPr>
+                <w:rFonts w:ascii="Aptos" w:hAnsi="Aptos"/>
                 <w:sz w:val="15"/>
               </w:rPr>
               <w:t>&lt;OK/KO&gt;</w:t>
@@ -2214,16 +2577,18 @@
       <w:tr>
         <w:tc>
           <w:tcPr>
-            <w:tcW w:w="2500" w:type="pct"/>
-          </w:tcPr>
-          <w:p>
-            <w:pPr>
-              <w:rPr>
-                <w:sz w:val="15"/>
-              </w:rPr>
-            </w:pPr>
-            <w:r>
-              <w:rPr>
+            <w:tcW w:w="4680" w:type="dxa"/>
+          </w:tcPr>
+          <w:p>
+            <w:pPr>
+              <w:rPr>
+                <w:rFonts w:ascii="Aptos" w:hAnsi="Aptos"/>
+                <w:sz w:val="15"/>
+              </w:rPr>
+            </w:pPr>
+            <w:r>
+              <w:rPr>
+                <w:rFonts w:ascii="Aptos" w:hAnsi="Aptos"/>
                 <w:sz w:val="15"/>
               </w:rPr>
               <w:t>Observer wallet-backed</w:t>
@@ -2232,16 +2597,18 @@
         </w:tc>
         <w:tc>
           <w:tcPr>
-            <w:tcW w:w="2500" w:type="pct"/>
-          </w:tcPr>
-          <w:p>
-            <w:pPr>
-              <w:rPr>
-                <w:sz w:val="15"/>
-              </w:rPr>
-            </w:pPr>
-            <w:r>
-              <w:rPr>
+            <w:tcW w:w="4680" w:type="dxa"/>
+          </w:tcPr>
+          <w:p>
+            <w:pPr>
+              <w:rPr>
+                <w:rFonts w:ascii="Aptos" w:hAnsi="Aptos"/>
+                <w:sz w:val="15"/>
+              </w:rPr>
+            </w:pPr>
+            <w:r>
+              <w:rPr>
+                <w:rFonts w:ascii="Aptos" w:hAnsi="Aptos"/>
                 <w:sz w:val="15"/>
               </w:rPr>
               <w:t>&lt;OK/KO&gt;</w:t>
@@ -2252,16 +2619,18 @@
       <w:tr>
         <w:tc>
           <w:tcPr>
-            <w:tcW w:w="2500" w:type="pct"/>
-          </w:tcPr>
-          <w:p>
-            <w:pPr>
-              <w:rPr>
-                <w:sz w:val="15"/>
-              </w:rPr>
-            </w:pPr>
-            <w:r>
-              <w:rPr>
+            <w:tcW w:w="4680" w:type="dxa"/>
+          </w:tcPr>
+          <w:p>
+            <w:pPr>
+              <w:rPr>
+                <w:rFonts w:ascii="Aptos" w:hAnsi="Aptos"/>
+                <w:sz w:val="15"/>
+              </w:rPr>
+            </w:pPr>
+            <w:r>
+              <w:rPr>
+                <w:rFonts w:ascii="Aptos" w:hAnsi="Aptos"/>
                 <w:sz w:val="15"/>
               </w:rPr>
               <w:t>drill FSFO autorizzato</w:t>
@@ -2270,16 +2639,18 @@
         </w:tc>
         <w:tc>
           <w:tcPr>
-            <w:tcW w:w="2500" w:type="pct"/>
-          </w:tcPr>
-          <w:p>
-            <w:pPr>
-              <w:rPr>
-                <w:sz w:val="15"/>
-              </w:rPr>
-            </w:pPr>
-            <w:r>
-              <w:rPr>
+            <w:tcW w:w="4680" w:type="dxa"/>
+          </w:tcPr>
+          <w:p>
+            <w:pPr>
+              <w:rPr>
+                <w:rFonts w:ascii="Aptos" w:hAnsi="Aptos"/>
+                <w:sz w:val="15"/>
+              </w:rPr>
+            </w:pPr>
+            <w:r>
+              <w:rPr>
+                <w:rFonts w:ascii="Aptos" w:hAnsi="Aptos"/>
                 <w:sz w:val="15"/>
               </w:rPr>
               <w:t>&lt;OK/KO&gt;</w:t>
@@ -2345,28 +2716,41 @@
     <w:tbl>
       <w:tblPr>
         <w:tblStyle w:val="TableGrid"/>
-        <w:tblW w:w="5000" w:type="pct"/>
+        <w:tblW w:w="9360" w:type="dxa"/>
+        <w:tblInd w:w="-5" w:type="dxa"/>
+        <w:tblLayout w:type="fixed"/>
+        <w:tblCellMar>
+          <w:top w:w="80" w:type="dxa"/>
+          <w:left w:w="120" w:type="dxa"/>
+          <w:bottom w:w="80" w:type="dxa"/>
+          <w:right w:w="120" w:type="dxa"/>
+        </w:tblCellMar>
         <w:tblLook w:val="04A0" w:firstRow="1" w:lastRow="0" w:firstColumn="1" w:lastColumn="0" w:noHBand="0" w:noVBand="1"/>
       </w:tblPr>
       <w:tblGrid>
-        <w:gridCol w:w="4988"/>
-        <w:gridCol w:w="4988"/>
+        <w:gridCol w:w="4680"/>
+        <w:gridCol w:w="4680"/>
       </w:tblGrid>
       <w:tr>
-        <w:tc>
-          <w:tcPr>
-            <w:tcW w:w="2500" w:type="pct"/>
+        <w:trPr>
+          <w:tblHeader/>
+        </w:trPr>
+        <w:tc>
+          <w:tcPr>
+            <w:tcW w:w="4680" w:type="dxa"/>
             <w:shd w:val="clear" w:color="auto" w:fill="E6E6E6"/>
           </w:tcPr>
           <w:p>
             <w:pPr>
               <w:rPr>
+                <w:rFonts w:ascii="Aptos" w:hAnsi="Aptos"/>
                 <w:b/>
                 <w:sz w:val="15"/>
               </w:rPr>
             </w:pPr>
             <w:r>
               <w:rPr>
+                <w:rFonts w:ascii="Aptos" w:hAnsi="Aptos"/>
                 <w:b/>
                 <w:sz w:val="15"/>
               </w:rPr>
@@ -2376,18 +2760,20 @@
         </w:tc>
         <w:tc>
           <w:tcPr>
-            <w:tcW w:w="2500" w:type="pct"/>
+            <w:tcW w:w="4680" w:type="dxa"/>
             <w:shd w:val="clear" w:color="auto" w:fill="E6E6E6"/>
           </w:tcPr>
           <w:p>
             <w:pPr>
               <w:rPr>
+                <w:rFonts w:ascii="Aptos" w:hAnsi="Aptos"/>
                 <w:b/>
                 <w:sz w:val="15"/>
               </w:rPr>
             </w:pPr>
             <w:r>
               <w:rPr>
+                <w:rFonts w:ascii="Aptos" w:hAnsi="Aptos"/>
                 <w:b/>
                 <w:sz w:val="15"/>
               </w:rPr>
@@ -2399,16 +2785,18 @@
       <w:tr>
         <w:tc>
           <w:tcPr>
-            <w:tcW w:w="2500" w:type="pct"/>
-          </w:tcPr>
-          <w:p>
-            <w:pPr>
-              <w:rPr>
-                <w:sz w:val="15"/>
-              </w:rPr>
-            </w:pPr>
-            <w:r>
-              <w:rPr>
+            <w:tcW w:w="4680" w:type="dxa"/>
+          </w:tcPr>
+          <w:p>
+            <w:pPr>
+              <w:rPr>
+                <w:rFonts w:ascii="Aptos" w:hAnsi="Aptos"/>
+                <w:sz w:val="15"/>
+              </w:rPr>
+            </w:pPr>
+            <w:r>
+              <w:rPr>
+                <w:rFonts w:ascii="Aptos" w:hAnsi="Aptos"/>
                 <w:sz w:val="15"/>
               </w:rPr>
               <w:t>comandi RAC su server single</w:t>
@@ -2417,16 +2805,18 @@
         </w:tc>
         <w:tc>
           <w:tcPr>
-            <w:tcW w:w="2500" w:type="pct"/>
-          </w:tcPr>
-          <w:p>
-            <w:pPr>
-              <w:rPr>
-                <w:sz w:val="15"/>
-              </w:rPr>
-            </w:pPr>
-            <w:r>
-              <w:rPr>
+            <w:tcW w:w="4680" w:type="dxa"/>
+          </w:tcPr>
+          <w:p>
+            <w:pPr>
+              <w:rPr>
+                <w:rFonts w:ascii="Aptos" w:hAnsi="Aptos"/>
+                <w:sz w:val="15"/>
+              </w:rPr>
+            </w:pPr>
+            <w:r>
+              <w:rPr>
+                <w:rFonts w:ascii="Aptos" w:hAnsi="Aptos"/>
                 <w:sz w:val="15"/>
               </w:rPr>
               <w:t>torna alla matrice e scegli il blueprint corretto</w:t>
@@ -2437,16 +2827,18 @@
       <w:tr>
         <w:tc>
           <w:tcPr>
-            <w:tcW w:w="2500" w:type="pct"/>
-          </w:tcPr>
-          <w:p>
-            <w:pPr>
-              <w:rPr>
-                <w:sz w:val="15"/>
-              </w:rPr>
-            </w:pPr>
-            <w:r>
-              <w:rPr>
+            <w:tcW w:w="4680" w:type="dxa"/>
+          </w:tcPr>
+          <w:p>
+            <w:pPr>
+              <w:rPr>
+                <w:rFonts w:ascii="Aptos" w:hAnsi="Aptos"/>
+                <w:sz w:val="15"/>
+              </w:rPr>
+            </w:pPr>
+            <w:r>
+              <w:rPr>
+                <w:rFonts w:ascii="Aptos" w:hAnsi="Aptos"/>
                 <w:sz w:val="15"/>
               </w:rPr>
               <w:t>PDB non disponibile</w:t>
@@ -2455,16 +2847,18 @@
         </w:tc>
         <w:tc>
           <w:tcPr>
-            <w:tcW w:w="2500" w:type="pct"/>
-          </w:tcPr>
-          <w:p>
-            <w:pPr>
-              <w:rPr>
-                <w:sz w:val="15"/>
-              </w:rPr>
-            </w:pPr>
-            <w:r>
-              <w:rPr>
+            <w:tcW w:w="4680" w:type="dxa"/>
+          </w:tcPr>
+          <w:p>
+            <w:pPr>
+              <w:rPr>
+                <w:rFonts w:ascii="Aptos" w:hAnsi="Aptos"/>
+                <w:sz w:val="15"/>
+              </w:rPr>
+            </w:pPr>
+            <w:r>
+              <w:rPr>
+                <w:rFonts w:ascii="Aptos" w:hAnsi="Aptos"/>
                 <w:sz w:val="15"/>
               </w:rPr>
               <w:t>usa solo guida S2 o S4, controlla PDB e service</w:t>
@@ -2475,16 +2869,18 @@
       <w:tr>
         <w:tc>
           <w:tcPr>
-            <w:tcW w:w="2500" w:type="pct"/>
-          </w:tcPr>
-          <w:p>
-            <w:pPr>
-              <w:rPr>
-                <w:sz w:val="15"/>
-              </w:rPr>
-            </w:pPr>
-            <w:r>
-              <w:rPr>
+            <w:tcW w:w="4680" w:type="dxa"/>
+          </w:tcPr>
+          <w:p>
+            <w:pPr>
+              <w:rPr>
+                <w:rFonts w:ascii="Aptos" w:hAnsi="Aptos"/>
+                <w:sz w:val="15"/>
+              </w:rPr>
+            </w:pPr>
+            <w:r>
+              <w:rPr>
+                <w:rFonts w:ascii="Aptos" w:hAnsi="Aptos"/>
                 <w:sz w:val="15"/>
               </w:rPr>
               <w:t>thread 2 assente</w:t>
@@ -2493,16 +2889,18 @@
         </w:tc>
         <w:tc>
           <w:tcPr>
-            <w:tcW w:w="2500" w:type="pct"/>
-          </w:tcPr>
-          <w:p>
-            <w:pPr>
-              <w:rPr>
-                <w:sz w:val="15"/>
-              </w:rPr>
-            </w:pPr>
-            <w:r>
-              <w:rPr>
+            <w:tcW w:w="4680" w:type="dxa"/>
+          </w:tcPr>
+          <w:p>
+            <w:pPr>
+              <w:rPr>
+                <w:rFonts w:ascii="Aptos" w:hAnsi="Aptos"/>
+                <w:sz w:val="15"/>
+              </w:rPr>
+            </w:pPr>
+            <w:r>
+              <w:rPr>
+                <w:rFonts w:ascii="Aptos" w:hAnsi="Aptos"/>
                 <w:sz w:val="15"/>
               </w:rPr>
               <w:t>atteso su single; errore su RAC</w:t>
@@ -2513,16 +2911,18 @@
       <w:tr>
         <w:tc>
           <w:tcPr>
-            <w:tcW w:w="2500" w:type="pct"/>
-          </w:tcPr>
-          <w:p>
-            <w:pPr>
-              <w:rPr>
-                <w:sz w:val="15"/>
-              </w:rPr>
-            </w:pPr>
-            <w:r>
-              <w:rPr>
+            <w:tcW w:w="4680" w:type="dxa"/>
+          </w:tcPr>
+          <w:p>
+            <w:pPr>
+              <w:rPr>
+                <w:rFonts w:ascii="Aptos" w:hAnsi="Aptos"/>
+                <w:sz w:val="15"/>
+              </w:rPr>
+            </w:pPr>
+            <w:r>
+              <w:rPr>
+                <w:rFonts w:ascii="Aptos" w:hAnsi="Aptos"/>
                 <w:sz w:val="15"/>
               </w:rPr>
               <w:t>Observer non parte</w:t>
@@ -2531,16 +2931,18 @@
         </w:tc>
         <w:tc>
           <w:tcPr>
-            <w:tcW w:w="2500" w:type="pct"/>
-          </w:tcPr>
-          <w:p>
-            <w:pPr>
-              <w:rPr>
-                <w:sz w:val="15"/>
-              </w:rPr>
-            </w:pPr>
-            <w:r>
-              <w:rPr>
+            <w:tcW w:w="4680" w:type="dxa"/>
+          </w:tcPr>
+          <w:p>
+            <w:pPr>
+              <w:rPr>
+                <w:rFonts w:ascii="Aptos" w:hAnsi="Aptos"/>
+                <w:sz w:val="15"/>
+              </w:rPr>
+            </w:pPr>
+            <w:r>
+              <w:rPr>
+                <w:rFonts w:ascii="Aptos" w:hAnsi="Aptos"/>
                 <w:sz w:val="15"/>
               </w:rPr>
               <w:t>wallet SEPS, TNS, permessi, Broker</w:t>
@@ -2551,16 +2953,18 @@
       <w:tr>
         <w:tc>
           <w:tcPr>
-            <w:tcW w:w="2500" w:type="pct"/>
-          </w:tcPr>
-          <w:p>
-            <w:pPr>
-              <w:rPr>
-                <w:sz w:val="15"/>
-              </w:rPr>
-            </w:pPr>
-            <w:r>
-              <w:rPr>
+            <w:tcW w:w="4680" w:type="dxa"/>
+          </w:tcPr>
+          <w:p>
+            <w:pPr>
+              <w:rPr>
+                <w:rFonts w:ascii="Aptos" w:hAnsi="Aptos"/>
+                <w:sz w:val="15"/>
+              </w:rPr>
+            </w:pPr>
+            <w:r>
+              <w:rPr>
+                <w:rFonts w:ascii="Aptos" w:hAnsi="Aptos"/>
                 <w:sz w:val="15"/>
               </w:rPr>
               <w:t>FRA piena con lag</w:t>
@@ -2569,16 +2973,18 @@
         </w:tc>
         <w:tc>
           <w:tcPr>
-            <w:tcW w:w="2500" w:type="pct"/>
-          </w:tcPr>
-          <w:p>
-            <w:pPr>
-              <w:rPr>
-                <w:sz w:val="15"/>
-              </w:rPr>
-            </w:pPr>
-            <w:r>
-              <w:rPr>
+            <w:tcW w:w="4680" w:type="dxa"/>
+          </w:tcPr>
+          <w:p>
+            <w:pPr>
+              <w:rPr>
+                <w:rFonts w:ascii="Aptos" w:hAnsi="Aptos"/>
+                <w:sz w:val="15"/>
+              </w:rPr>
+            </w:pPr>
+            <w:r>
+              <w:rPr>
+                <w:rFonts w:ascii="Aptos" w:hAnsi="Aptos"/>
                 <w:sz w:val="15"/>
               </w:rPr>
               <w:t>usa DG-061</w:t>
@@ -2590,14 +2996,14 @@
     <w:p/>
     <w:p/>
     <w:sectPr>
-      <w:headerReference w:type="even" r:id="rId6"/>
-      <w:headerReference w:type="default" r:id="rId7"/>
-      <w:footerReference w:type="even" r:id="rId8"/>
-      <w:footerReference w:type="default" r:id="rId9"/>
-      <w:headerReference w:type="first" r:id="rId10"/>
-      <w:footerReference w:type="first" r:id="rId11"/>
-      <w:pgSz w:w="11906" w:h="16838"/>
-      <w:pgMar w:top="840" w:right="960" w:bottom="840" w:left="960" w:header="708" w:footer="708" w:gutter="0"/>
+      <w:headerReference w:type="even" r:id="rId7"/>
+      <w:headerReference w:type="default" r:id="rId8"/>
+      <w:footerReference w:type="even" r:id="rId9"/>
+      <w:footerReference w:type="default" r:id="rId10"/>
+      <w:headerReference w:type="first" r:id="rId11"/>
+      <w:footerReference w:type="first" r:id="rId12"/>
+      <w:pgSz w:w="12240" w:h="15840"/>
+      <w:pgMar w:top="1440" w:right="1440" w:bottom="1440" w:left="1440" w:header="700" w:footer="700" w:gutter="0"/>
       <w:cols w:space="708"/>
       <w:docGrid w:linePitch="360"/>
     </w:sectPr>
@@ -2646,15 +3052,18 @@
     <w:pPr>
       <w:pStyle w:val="Footer"/>
       <w:jc w:val="center"/>
-      <w:rPr>
-        <w:sz w:val="16"/>
-      </w:rPr>
     </w:pPr>
     <w:r>
-      <w:rPr>
-        <w:sz w:val="16"/>
-      </w:rPr>
-      <w:t>SHAMS PROJECT | Oracle 19c Data Guard | Documento operativo</w:t>
+      <w:t xml:space="preserve">SHAMS PROJECT | Oracle 19c Data Guard | Documento operativo | Pagina </w:t>
+    </w:r>
+    <w:r>
+      <w:fldChar w:fldCharType="begin"/>
+    </w:r>
+    <w:r>
+      <w:instrText xml:space="preserve">  \* MERGEFORMAT </w:instrText>
+    </w:r>
+    <w:r>
+      <w:fldChar w:fldCharType="end"/>
     </w:r>
   </w:p>
 </w:ftr>
@@ -2712,11 +3121,13 @@
       <w:pStyle w:val="Header"/>
       <w:jc w:val="center"/>
       <w:rPr>
+        <w:rFonts w:cs="Calibri"/>
         <w:sz w:val="16"/>
       </w:rPr>
     </w:pPr>
     <w:r>
       <w:rPr>
+        <w:rFonts w:cs="Calibri"/>
         <w:sz w:val="16"/>
       </w:rPr>
       <w:t>SHAMS PROJECT | Run Sheet Scelta Blueprint</w:t>
@@ -2733,6 +3144,31 @@
     </w:pPr>
   </w:p>
 </w:hdr>
+</file>
+
+<file path=word/numbering.xml><?xml version="1.0" encoding="utf-8"?>
+<w:numbering xmlns:wpc="http://schemas.microsoft.com/office/word/2010/wordprocessingCanvas" xmlns:cx="http://schemas.microsoft.com/office/drawing/2014/chartex" xmlns:cx1="http://schemas.microsoft.com/office/drawing/2015/9/8/chartex" xmlns:cx2="http://schemas.microsoft.com/office/drawing/2015/10/21/chartex" xmlns:cx3="http://schemas.microsoft.com/office/drawing/2016/5/9/chartex" xmlns:cx4="http://schemas.microsoft.com/office/drawing/2016/5/10/chartex" xmlns:cx5="http://schemas.microsoft.com/office/drawing/2016/5/11/chartex" xmlns:cx6="http://schemas.microsoft.com/office/drawing/2016/5/12/chartex" xmlns:cx7="http://schemas.microsoft.com/office/drawing/2016/5/13/chartex" xmlns:cx8="http://schemas.microsoft.com/office/drawing/2016/5/14/chartex" xmlns:mc="http://schemas.openxmlformats.org/markup-compatibility/2006" xmlns:aink="http://schemas.microsoft.com/office/drawing/2016/ink" xmlns:am3d="http://schemas.microsoft.com/office/drawing/2017/model3d" xmlns:o="urn:schemas-microsoft-com:office:office" xmlns:oel="http://schemas.microsoft.com/office/2019/extlst" xmlns:r="http://schemas.openxmlformats.org/officeDocument/2006/relationships" xmlns:m="http://schemas.openxmlformats.org/officeDocument/2006/math" xmlns:v="urn:schemas-microsoft-com:vml" xmlns:wp14="http://schemas.microsoft.com/office/word/2010/wordprocessingDrawing" xmlns:wp="http://schemas.openxmlformats.org/drawingml/2006/wordprocessingDrawing" xmlns:w10="urn:schemas-microsoft-com:office:word" xmlns:w="http://schemas.openxmlformats.org/wordprocessingml/2006/main" xmlns:w14="http://schemas.microsoft.com/office/word/2010/wordml" xmlns:w15="http://schemas.microsoft.com/office/word/2012/wordml" xmlns:w16cex="http://schemas.microsoft.com/office/word/2018/wordml/cex" xmlns:w16cid="http://schemas.microsoft.com/office/word/2016/wordml/cid" xmlns:w16="http://schemas.microsoft.com/office/word/2018/wordml" xmlns:w16du="http://schemas.microsoft.com/office/word/2023/wordml/word16du" xmlns:w16sdtdh="http://schemas.microsoft.com/office/word/2020/wordml/sdtdatahash" xmlns:w16sdtfl="http://schemas.microsoft.com/office/word/2024/wordml/sdtformatlock" xmlns:w16se="http://schemas.microsoft.com/office/word/2015/wordml/symex" xmlns:wpg="http://schemas.microsoft.com/office/word/2010/wordprocessingGroup" xmlns:wpi="http://schemas.microsoft.com/office/word/2010/wordprocessingInk" xmlns:wne="http://schemas.microsoft.com/office/word/2006/wordml" xmlns:wps="http://schemas.microsoft.com/office/word/2010/wordprocessingShape" mc:Ignorable="w14 w15 w16se w16cid w16 w16cex w16sdtdh w16sdtfl w16du wp14">
+  <w:abstractNum w:abstractNumId="0" w15:restartNumberingAfterBreak="0">
+    <w:nsid w:val="14B3451A"/>
+    <w:multiLevelType w:val="singleLevel"/>
+    <w:tmpl w:val="04100001"/>
+    <w:lvl w:ilvl="0">
+      <w:start w:val="1"/>
+      <w:numFmt w:val="bullet"/>
+      <w:lvlText w:val=""/>
+      <w:lvlJc w:val="left"/>
+      <w:pPr>
+        <w:ind w:left="720" w:hanging="360"/>
+      </w:pPr>
+      <w:rPr>
+        <w:rFonts w:ascii="Symbol" w:hAnsi="Symbol" w:hint="default"/>
+      </w:rPr>
+    </w:lvl>
+  </w:abstractNum>
+  <w:num w:numId="1" w16cid:durableId="1822429255">
+    <w:abstractNumId w:val="0"/>
+  </w:num>
+</w:numbering>
 </file>
 
 <file path=word/styles.xml><?xml version="1.0" encoding="utf-8"?>
@@ -3136,11 +3572,11 @@
     <w:name w:val="Normal"/>
     <w:qFormat/>
     <w:pPr>
-      <w:spacing w:after="60"/>
+      <w:spacing w:after="120" w:line="300" w:lineRule="auto"/>
     </w:pPr>
     <w:rPr>
-      <w:rFonts w:ascii="Aptos" w:hAnsi="Aptos"/>
-      <w:sz w:val="18"/>
+      <w:rFonts w:ascii="Calibri" w:hAnsi="Calibri"/>
+      <w:sz w:val="22"/>
     </w:rPr>
   </w:style>
   <w:style w:type="paragraph" w:styleId="Heading1">
@@ -3150,17 +3586,17 @@
     <w:link w:val="Heading1Char"/>
     <w:uiPriority w:val="9"/>
     <w:qFormat/>
-    <w:rsid w:val="006247D2"/>
+    <w:rsid w:val="00E57496"/>
     <w:pPr>
       <w:keepNext/>
       <w:keepLines/>
-      <w:spacing w:before="120"/>
+      <w:spacing w:before="360" w:after="200"/>
       <w:outlineLvl w:val="0"/>
     </w:pPr>
     <w:rPr>
-      <w:rFonts w:ascii="Aptos Display" w:eastAsiaTheme="majorEastAsia" w:hAnsi="Aptos Display" w:cstheme="majorBidi"/>
-      <w:color w:val="003B75"/>
-      <w:sz w:val="30"/>
+      <w:rFonts w:eastAsiaTheme="majorEastAsia" w:cstheme="majorBidi"/>
+      <w:color w:val="2E74B5"/>
+      <w:sz w:val="32"/>
       <w:szCs w:val="40"/>
     </w:rPr>
   </w:style>
@@ -3172,17 +3608,17 @@
     <w:uiPriority w:val="9"/>
     <w:unhideWhenUsed/>
     <w:qFormat/>
-    <w:rsid w:val="006247D2"/>
+    <w:rsid w:val="00E57496"/>
     <w:pPr>
       <w:keepNext/>
       <w:keepLines/>
-      <w:spacing w:before="120"/>
+      <w:spacing w:before="280" w:after="140"/>
       <w:outlineLvl w:val="1"/>
     </w:pPr>
     <w:rPr>
-      <w:rFonts w:ascii="Aptos Display" w:eastAsiaTheme="majorEastAsia" w:hAnsi="Aptos Display" w:cstheme="majorBidi"/>
-      <w:color w:val="003B75"/>
-      <w:sz w:val="24"/>
+      <w:rFonts w:eastAsiaTheme="majorEastAsia" w:cstheme="majorBidi"/>
+      <w:color w:val="2E74B5"/>
+      <w:sz w:val="26"/>
       <w:szCs w:val="32"/>
     </w:rPr>
   </w:style>
@@ -3195,17 +3631,17 @@
     <w:semiHidden/>
     <w:unhideWhenUsed/>
     <w:qFormat/>
-    <w:rsid w:val="006247D2"/>
+    <w:rsid w:val="00E57496"/>
     <w:pPr>
       <w:keepNext/>
       <w:keepLines/>
-      <w:spacing w:before="120"/>
+      <w:spacing w:before="200" w:after="100"/>
       <w:outlineLvl w:val="2"/>
     </w:pPr>
     <w:rPr>
-      <w:rFonts w:ascii="Aptos Display" w:eastAsiaTheme="majorEastAsia" w:hAnsi="Aptos Display" w:cstheme="majorBidi"/>
-      <w:color w:val="003B75"/>
-      <w:sz w:val="20"/>
+      <w:rFonts w:eastAsiaTheme="majorEastAsia" w:cstheme="majorBidi"/>
+      <w:color w:val="2E74B5"/>
+      <w:sz w:val="24"/>
       <w:szCs w:val="28"/>
     </w:rPr>
   </w:style>
@@ -3218,7 +3654,7 @@
     <w:semiHidden/>
     <w:unhideWhenUsed/>
     <w:qFormat/>
-    <w:rsid w:val="006247D2"/>
+    <w:rsid w:val="00E57496"/>
     <w:pPr>
       <w:keepNext/>
       <w:keepLines/>
@@ -3241,7 +3677,7 @@
     <w:semiHidden/>
     <w:unhideWhenUsed/>
     <w:qFormat/>
-    <w:rsid w:val="006247D2"/>
+    <w:rsid w:val="00E57496"/>
     <w:pPr>
       <w:keepNext/>
       <w:keepLines/>
@@ -3262,7 +3698,7 @@
     <w:semiHidden/>
     <w:unhideWhenUsed/>
     <w:qFormat/>
-    <w:rsid w:val="006247D2"/>
+    <w:rsid w:val="00E57496"/>
     <w:pPr>
       <w:keepNext/>
       <w:keepLines/>
@@ -3285,7 +3721,7 @@
     <w:semiHidden/>
     <w:unhideWhenUsed/>
     <w:qFormat/>
-    <w:rsid w:val="006247D2"/>
+    <w:rsid w:val="00E57496"/>
     <w:pPr>
       <w:keepNext/>
       <w:keepLines/>
@@ -3306,7 +3742,7 @@
     <w:semiHidden/>
     <w:unhideWhenUsed/>
     <w:qFormat/>
-    <w:rsid w:val="006247D2"/>
+    <w:rsid w:val="00E57496"/>
     <w:pPr>
       <w:keepNext/>
       <w:keepLines/>
@@ -3329,7 +3765,7 @@
     <w:semiHidden/>
     <w:unhideWhenUsed/>
     <w:qFormat/>
-    <w:rsid w:val="006247D2"/>
+    <w:rsid w:val="00E57496"/>
     <w:pPr>
       <w:keepNext/>
       <w:keepLines/>
@@ -3373,11 +3809,11 @@
     <w:basedOn w:val="DefaultParagraphFont"/>
     <w:link w:val="Heading1"/>
     <w:uiPriority w:val="9"/>
-    <w:rsid w:val="006247D2"/>
+    <w:rsid w:val="00E57496"/>
     <w:rPr>
-      <w:rFonts w:ascii="Aptos Display" w:eastAsiaTheme="majorEastAsia" w:hAnsi="Aptos Display" w:cstheme="majorBidi"/>
-      <w:color w:val="003B75"/>
-      <w:sz w:val="30"/>
+      <w:rFonts w:ascii="Calibri" w:eastAsiaTheme="majorEastAsia" w:hAnsi="Calibri" w:cstheme="majorBidi"/>
+      <w:color w:val="2E74B5"/>
+      <w:sz w:val="32"/>
       <w:szCs w:val="40"/>
     </w:rPr>
   </w:style>
@@ -3386,10 +3822,11 @@
     <w:basedOn w:val="DefaultParagraphFont"/>
     <w:link w:val="Heading2"/>
     <w:uiPriority w:val="9"/>
-    <w:rsid w:val="006247D2"/>
+    <w:rsid w:val="00E57496"/>
     <w:rPr>
-      <w:rFonts w:ascii="Aptos Display" w:eastAsiaTheme="majorEastAsia" w:hAnsi="Aptos Display" w:cstheme="majorBidi"/>
-      <w:color w:val="003B75"/>
+      <w:rFonts w:ascii="Calibri" w:eastAsiaTheme="majorEastAsia" w:hAnsi="Calibri" w:cstheme="majorBidi"/>
+      <w:color w:val="2E74B5"/>
+      <w:sz w:val="26"/>
       <w:szCs w:val="32"/>
     </w:rPr>
   </w:style>
@@ -3399,11 +3836,10 @@
     <w:link w:val="Heading3"/>
     <w:uiPriority w:val="9"/>
     <w:semiHidden/>
-    <w:rsid w:val="006247D2"/>
+    <w:rsid w:val="00E57496"/>
     <w:rPr>
-      <w:rFonts w:ascii="Aptos Display" w:eastAsiaTheme="majorEastAsia" w:hAnsi="Aptos Display" w:cstheme="majorBidi"/>
-      <w:color w:val="003B75"/>
-      <w:sz w:val="20"/>
+      <w:rFonts w:ascii="Calibri" w:eastAsiaTheme="majorEastAsia" w:hAnsi="Calibri" w:cstheme="majorBidi"/>
+      <w:color w:val="2E74B5"/>
       <w:szCs w:val="28"/>
     </w:rPr>
   </w:style>
@@ -3413,7 +3849,7 @@
     <w:link w:val="Heading4"/>
     <w:uiPriority w:val="9"/>
     <w:semiHidden/>
-    <w:rsid w:val="006247D2"/>
+    <w:rsid w:val="00E57496"/>
     <w:rPr>
       <w:rFonts w:eastAsiaTheme="majorEastAsia" w:cstheme="majorBidi"/>
       <w:i/>
@@ -3427,7 +3863,7 @@
     <w:link w:val="Heading5"/>
     <w:uiPriority w:val="9"/>
     <w:semiHidden/>
-    <w:rsid w:val="006247D2"/>
+    <w:rsid w:val="00E57496"/>
     <w:rPr>
       <w:rFonts w:eastAsiaTheme="majorEastAsia" w:cstheme="majorBidi"/>
       <w:color w:val="0F4761" w:themeColor="accent1" w:themeShade="BF"/>
@@ -3439,7 +3875,7 @@
     <w:link w:val="Heading6"/>
     <w:uiPriority w:val="9"/>
     <w:semiHidden/>
-    <w:rsid w:val="006247D2"/>
+    <w:rsid w:val="00E57496"/>
     <w:rPr>
       <w:rFonts w:eastAsiaTheme="majorEastAsia" w:cstheme="majorBidi"/>
       <w:i/>
@@ -3453,7 +3889,7 @@
     <w:link w:val="Heading7"/>
     <w:uiPriority w:val="9"/>
     <w:semiHidden/>
-    <w:rsid w:val="006247D2"/>
+    <w:rsid w:val="00E57496"/>
     <w:rPr>
       <w:rFonts w:eastAsiaTheme="majorEastAsia" w:cstheme="majorBidi"/>
       <w:color w:val="595959" w:themeColor="text1" w:themeTint="A6"/>
@@ -3465,7 +3901,7 @@
     <w:link w:val="Heading8"/>
     <w:uiPriority w:val="9"/>
     <w:semiHidden/>
-    <w:rsid w:val="006247D2"/>
+    <w:rsid w:val="00E57496"/>
     <w:rPr>
       <w:rFonts w:eastAsiaTheme="majorEastAsia" w:cstheme="majorBidi"/>
       <w:i/>
@@ -3479,7 +3915,7 @@
     <w:link w:val="Heading9"/>
     <w:uiPriority w:val="9"/>
     <w:semiHidden/>
-    <w:rsid w:val="006247D2"/>
+    <w:rsid w:val="00E57496"/>
     <w:rPr>
       <w:rFonts w:eastAsiaTheme="majorEastAsia" w:cstheme="majorBidi"/>
       <w:color w:val="272727" w:themeColor="text1" w:themeTint="D8"/>
@@ -3492,17 +3928,17 @@
     <w:link w:val="TitleChar"/>
     <w:uiPriority w:val="10"/>
     <w:qFormat/>
-    <w:rsid w:val="006247D2"/>
+    <w:rsid w:val="00E57496"/>
     <w:pPr>
-      <w:spacing w:before="120" w:line="240" w:lineRule="auto"/>
+      <w:spacing w:after="240" w:line="240" w:lineRule="auto"/>
       <w:contextualSpacing/>
     </w:pPr>
     <w:rPr>
-      <w:rFonts w:ascii="Aptos Display" w:eastAsiaTheme="majorEastAsia" w:hAnsi="Aptos Display" w:cstheme="majorBidi"/>
-      <w:color w:val="003B75"/>
+      <w:rFonts w:eastAsiaTheme="majorEastAsia" w:cstheme="majorBidi"/>
+      <w:color w:val="2E74B5"/>
       <w:spacing w:val="-10"/>
       <w:kern w:val="28"/>
-      <w:sz w:val="40"/>
+      <w:sz w:val="46"/>
       <w:szCs w:val="56"/>
     </w:rPr>
   </w:style>
@@ -3511,13 +3947,13 @@
     <w:basedOn w:val="DefaultParagraphFont"/>
     <w:link w:val="Title"/>
     <w:uiPriority w:val="10"/>
-    <w:rsid w:val="006247D2"/>
+    <w:rsid w:val="00E57496"/>
     <w:rPr>
-      <w:rFonts w:ascii="Aptos Display" w:eastAsiaTheme="majorEastAsia" w:hAnsi="Aptos Display" w:cstheme="majorBidi"/>
-      <w:color w:val="003B75"/>
+      <w:rFonts w:ascii="Calibri" w:eastAsiaTheme="majorEastAsia" w:hAnsi="Calibri" w:cstheme="majorBidi"/>
+      <w:color w:val="2E74B5"/>
       <w:spacing w:val="-10"/>
       <w:kern w:val="28"/>
-      <w:sz w:val="40"/>
+      <w:sz w:val="46"/>
       <w:szCs w:val="56"/>
     </w:rPr>
   </w:style>
@@ -3528,7 +3964,7 @@
     <w:link w:val="SubtitleChar"/>
     <w:uiPriority w:val="11"/>
     <w:qFormat/>
-    <w:rsid w:val="006247D2"/>
+    <w:rsid w:val="00E57496"/>
     <w:pPr>
       <w:numPr>
         <w:ilvl w:val="1"/>
@@ -3547,7 +3983,7 @@
     <w:basedOn w:val="DefaultParagraphFont"/>
     <w:link w:val="Subtitle"/>
     <w:uiPriority w:val="11"/>
-    <w:rsid w:val="006247D2"/>
+    <w:rsid w:val="00E57496"/>
     <w:rPr>
       <w:rFonts w:eastAsiaTheme="majorEastAsia" w:cstheme="majorBidi"/>
       <w:color w:val="595959" w:themeColor="text1" w:themeTint="A6"/>
@@ -3563,7 +3999,7 @@
     <w:link w:val="QuoteChar"/>
     <w:uiPriority w:val="29"/>
     <w:qFormat/>
-    <w:rsid w:val="006247D2"/>
+    <w:rsid w:val="00E57496"/>
     <w:pPr>
       <w:spacing w:before="160"/>
       <w:jc w:val="center"/>
@@ -3579,7 +4015,7 @@
     <w:basedOn w:val="DefaultParagraphFont"/>
     <w:link w:val="Quote"/>
     <w:uiPriority w:val="29"/>
-    <w:rsid w:val="006247D2"/>
+    <w:rsid w:val="00E57496"/>
     <w:rPr>
       <w:i/>
       <w:iCs/>
@@ -3591,7 +4027,7 @@
     <w:basedOn w:val="Normal"/>
     <w:uiPriority w:val="34"/>
     <w:qFormat/>
-    <w:rsid w:val="006247D2"/>
+    <w:rsid w:val="00E57496"/>
     <w:pPr>
       <w:ind w:left="720"/>
       <w:contextualSpacing/>
@@ -3602,7 +4038,7 @@
     <w:basedOn w:val="DefaultParagraphFont"/>
     <w:uiPriority w:val="21"/>
     <w:qFormat/>
-    <w:rsid w:val="006247D2"/>
+    <w:rsid w:val="00E57496"/>
     <w:rPr>
       <w:i/>
       <w:iCs/>
@@ -3616,7 +4052,7 @@
     <w:link w:val="IntenseQuoteChar"/>
     <w:uiPriority w:val="30"/>
     <w:qFormat/>
-    <w:rsid w:val="006247D2"/>
+    <w:rsid w:val="00E57496"/>
     <w:pPr>
       <w:pBdr>
         <w:top w:val="single" w:sz="4" w:space="10" w:color="0F4761" w:themeColor="accent1" w:themeShade="BF"/>
@@ -3637,7 +4073,7 @@
     <w:basedOn w:val="DefaultParagraphFont"/>
     <w:link w:val="IntenseQuote"/>
     <w:uiPriority w:val="30"/>
-    <w:rsid w:val="006247D2"/>
+    <w:rsid w:val="00E57496"/>
     <w:rPr>
       <w:i/>
       <w:iCs/>
@@ -3649,7 +4085,7 @@
     <w:basedOn w:val="DefaultParagraphFont"/>
     <w:uiPriority w:val="32"/>
     <w:qFormat/>
-    <w:rsid w:val="006247D2"/>
+    <w:rsid w:val="00E57496"/>
     <w:rPr>
       <w:b/>
       <w:bCs/>
@@ -3664,7 +4100,7 @@
     <w:link w:val="HeaderChar"/>
     <w:uiPriority w:val="99"/>
     <w:unhideWhenUsed/>
-    <w:rsid w:val="006247D2"/>
+    <w:rsid w:val="00E57496"/>
     <w:pPr>
       <w:tabs>
         <w:tab w:val="center" w:pos="4513"/>
@@ -3678,10 +4114,10 @@
     <w:basedOn w:val="DefaultParagraphFont"/>
     <w:link w:val="Header"/>
     <w:uiPriority w:val="99"/>
-    <w:rsid w:val="006247D2"/>
+    <w:rsid w:val="00E57496"/>
     <w:rPr>
-      <w:rFonts w:ascii="Aptos" w:hAnsi="Aptos"/>
-      <w:sz w:val="18"/>
+      <w:rFonts w:ascii="Calibri" w:hAnsi="Calibri"/>
+      <w:sz w:val="22"/>
     </w:rPr>
   </w:style>
   <w:style w:type="paragraph" w:styleId="Footer">
@@ -3690,7 +4126,7 @@
     <w:link w:val="FooterChar"/>
     <w:uiPriority w:val="99"/>
     <w:unhideWhenUsed/>
-    <w:rsid w:val="006247D2"/>
+    <w:rsid w:val="00E57496"/>
     <w:pPr>
       <w:tabs>
         <w:tab w:val="center" w:pos="4513"/>
@@ -3704,17 +4140,17 @@
     <w:basedOn w:val="DefaultParagraphFont"/>
     <w:link w:val="Footer"/>
     <w:uiPriority w:val="99"/>
-    <w:rsid w:val="006247D2"/>
+    <w:rsid w:val="00E57496"/>
     <w:rPr>
-      <w:rFonts w:ascii="Aptos" w:hAnsi="Aptos"/>
-      <w:sz w:val="18"/>
+      <w:rFonts w:ascii="Calibri" w:hAnsi="Calibri"/>
+      <w:sz w:val="22"/>
     </w:rPr>
   </w:style>
   <w:style w:type="table" w:styleId="TableGrid">
     <w:name w:val="Table Grid"/>
     <w:basedOn w:val="TableNormal"/>
     <w:uiPriority w:val="39"/>
-    <w:rsid w:val="006247D2"/>
+    <w:rsid w:val="00E57496"/>
     <w:pPr>
       <w:spacing w:after="0" w:line="240" w:lineRule="auto"/>
     </w:pPr>

</xml_diff>

<commit_message>
ops: harden Data Guard core and SHAMS enterprise workflows
</commit_message>
<xml_diff>
--- a/artifacts/shams_project/SHAMS_PROJECT_RUN_SHEET_VARIANTI.docx
+++ b/artifacts/shams_project/SHAMS_PROJECT_RUN_SHEET_VARIANTI.docx
@@ -47,7 +47,6 @@
         <w:pStyle w:val="Title"/>
       </w:pPr>
       <w:r>
-        <w:lastRenderedPageBreak/>
         <w:t>SHAMS PROJECT: Run Sheet Scelta Blueprint</w:t>
       </w:r>
     </w:p>
@@ -91,19 +90,16 @@
         <w:tblLook w:val="04A0" w:firstRow="1" w:lastRow="0" w:firstColumn="1" w:lastColumn="0" w:noHBand="0" w:noVBand="1"/>
       </w:tblPr>
       <w:tblGrid>
-        <w:gridCol w:w="2340"/>
-        <w:gridCol w:w="2340"/>
-        <w:gridCol w:w="2340"/>
-        <w:gridCol w:w="2340"/>
+        <w:gridCol w:w="1440"/>
+        <w:gridCol w:w="3600"/>
+        <w:gridCol w:w="2520"/>
+        <w:gridCol w:w="1800"/>
       </w:tblGrid>
       <w:tr>
-        <w:trPr>
-          <w:tblHeader/>
-        </w:trPr>
-        <w:tc>
-          <w:tcPr>
-            <w:tcW w:w="2340" w:type="dxa"/>
-            <w:shd w:val="clear" w:color="auto" w:fill="E6E6E6"/>
+        <w:tc>
+          <w:tcPr>
+            <w:tcW w:w="1440" w:type="dxa"/>
+            <w:shd w:val="clear" w:color="auto" w:fill="E8EEF5"/>
           </w:tcPr>
           <w:p>
             <w:pPr>
@@ -125,8 +121,8 @@
         </w:tc>
         <w:tc>
           <w:tcPr>
-            <w:tcW w:w="2340" w:type="dxa"/>
-            <w:shd w:val="clear" w:color="auto" w:fill="E6E6E6"/>
+            <w:tcW w:w="3600" w:type="dxa"/>
+            <w:shd w:val="clear" w:color="auto" w:fill="E8EEF5"/>
           </w:tcPr>
           <w:p>
             <w:pPr>
@@ -148,8 +144,8 @@
         </w:tc>
         <w:tc>
           <w:tcPr>
-            <w:tcW w:w="2340" w:type="dxa"/>
-            <w:shd w:val="clear" w:color="auto" w:fill="E6E6E6"/>
+            <w:tcW w:w="2520" w:type="dxa"/>
+            <w:shd w:val="clear" w:color="auto" w:fill="E8EEF5"/>
           </w:tcPr>
           <w:p>
             <w:pPr>
@@ -171,8 +167,8 @@
         </w:tc>
         <w:tc>
           <w:tcPr>
-            <w:tcW w:w="2340" w:type="dxa"/>
-            <w:shd w:val="clear" w:color="auto" w:fill="E6E6E6"/>
+            <w:tcW w:w="1800" w:type="dxa"/>
+            <w:shd w:val="clear" w:color="auto" w:fill="E8EEF5"/>
           </w:tcPr>
           <w:p>
             <w:pPr>
@@ -196,7 +192,7 @@
       <w:tr>
         <w:tc>
           <w:tcPr>
-            <w:tcW w:w="2340" w:type="dxa"/>
+            <w:tcW w:w="1440" w:type="dxa"/>
           </w:tcPr>
           <w:p>
             <w:pPr>
@@ -216,7 +212,7 @@
         </w:tc>
         <w:tc>
           <w:tcPr>
-            <w:tcW w:w="2340" w:type="dxa"/>
+            <w:tcW w:w="3600" w:type="dxa"/>
           </w:tcPr>
           <w:p>
             <w:pPr>
@@ -236,7 +232,7 @@
         </w:tc>
         <w:tc>
           <w:tcPr>
-            <w:tcW w:w="2340" w:type="dxa"/>
+            <w:tcW w:w="2520" w:type="dxa"/>
           </w:tcPr>
           <w:p>
             <w:pPr>
@@ -256,7 +252,7 @@
         </w:tc>
         <w:tc>
           <w:tcPr>
-            <w:tcW w:w="2340" w:type="dxa"/>
+            <w:tcW w:w="1800" w:type="dxa"/>
           </w:tcPr>
           <w:p>
             <w:pPr>
@@ -278,7 +274,7 @@
       <w:tr>
         <w:tc>
           <w:tcPr>
-            <w:tcW w:w="2340" w:type="dxa"/>
+            <w:tcW w:w="1440" w:type="dxa"/>
           </w:tcPr>
           <w:p>
             <w:pPr>
@@ -298,7 +294,7 @@
         </w:tc>
         <w:tc>
           <w:tcPr>
-            <w:tcW w:w="2340" w:type="dxa"/>
+            <w:tcW w:w="3600" w:type="dxa"/>
           </w:tcPr>
           <w:p>
             <w:pPr>
@@ -318,7 +314,7 @@
         </w:tc>
         <w:tc>
           <w:tcPr>
-            <w:tcW w:w="2340" w:type="dxa"/>
+            <w:tcW w:w="2520" w:type="dxa"/>
           </w:tcPr>
           <w:p>
             <w:pPr>
@@ -338,7 +334,7 @@
         </w:tc>
         <w:tc>
           <w:tcPr>
-            <w:tcW w:w="2340" w:type="dxa"/>
+            <w:tcW w:w="1800" w:type="dxa"/>
           </w:tcPr>
           <w:p>
             <w:pPr>
@@ -360,7 +356,7 @@
       <w:tr>
         <w:tc>
           <w:tcPr>
-            <w:tcW w:w="2340" w:type="dxa"/>
+            <w:tcW w:w="1440" w:type="dxa"/>
           </w:tcPr>
           <w:p>
             <w:pPr>
@@ -380,7 +376,7 @@
         </w:tc>
         <w:tc>
           <w:tcPr>
-            <w:tcW w:w="2340" w:type="dxa"/>
+            <w:tcW w:w="3600" w:type="dxa"/>
           </w:tcPr>
           <w:p>
             <w:pPr>
@@ -400,7 +396,7 @@
         </w:tc>
         <w:tc>
           <w:tcPr>
-            <w:tcW w:w="2340" w:type="dxa"/>
+            <w:tcW w:w="2520" w:type="dxa"/>
           </w:tcPr>
           <w:p>
             <w:pPr>
@@ -420,7 +416,7 @@
         </w:tc>
         <w:tc>
           <w:tcPr>
-            <w:tcW w:w="2340" w:type="dxa"/>
+            <w:tcW w:w="1800" w:type="dxa"/>
           </w:tcPr>
           <w:p>
             <w:pPr>
@@ -442,7 +438,7 @@
       <w:tr>
         <w:tc>
           <w:tcPr>
-            <w:tcW w:w="2340" w:type="dxa"/>
+            <w:tcW w:w="1440" w:type="dxa"/>
           </w:tcPr>
           <w:p>
             <w:pPr>
@@ -462,7 +458,7 @@
         </w:tc>
         <w:tc>
           <w:tcPr>
-            <w:tcW w:w="2340" w:type="dxa"/>
+            <w:tcW w:w="3600" w:type="dxa"/>
           </w:tcPr>
           <w:p>
             <w:pPr>
@@ -482,7 +478,7 @@
         </w:tc>
         <w:tc>
           <w:tcPr>
-            <w:tcW w:w="2340" w:type="dxa"/>
+            <w:tcW w:w="2520" w:type="dxa"/>
           </w:tcPr>
           <w:p>
             <w:pPr>
@@ -502,7 +498,7 @@
         </w:tc>
         <w:tc>
           <w:tcPr>
-            <w:tcW w:w="2340" w:type="dxa"/>
+            <w:tcW w:w="1800" w:type="dxa"/>
           </w:tcPr>
           <w:p>
             <w:pPr>
@@ -557,6 +553,546 @@
     <w:p>
       <w:r>
         <w:t>compila:</w:t>
+      </w:r>
+    </w:p>
+    <w:tbl>
+      <w:tblPr>
+        <w:tblStyle w:val="TableGrid"/>
+        <w:tblW w:w="9360" w:type="dxa"/>
+        <w:tblLayout w:type="fixed"/>
+        <w:tblCellMar>
+          <w:top w:w="80" w:type="dxa"/>
+          <w:left w:w="120" w:type="dxa"/>
+          <w:bottom w:w="80" w:type="dxa"/>
+          <w:right w:w="120" w:type="dxa"/>
+        </w:tblCellMar>
+        <w:tblLook w:val="04A0" w:firstRow="1" w:lastRow="0" w:firstColumn="1" w:lastColumn="0" w:noHBand="0" w:noVBand="1"/>
+      </w:tblPr>
+      <w:tblGrid>
+        <w:gridCol w:w="2700"/>
+        <w:gridCol w:w="6660"/>
+      </w:tblGrid>
+      <w:tr>
+        <w:trPr>
+          <w:tblHeader/>
+        </w:trPr>
+        <w:tc>
+          <w:tcPr>
+            <w:tcW w:w="2700" w:type="dxa"/>
+            <w:shd w:val="clear" w:color="auto" w:fill="E8EEF5"/>
+          </w:tcPr>
+          <w:p>
+            <w:pPr>
+              <w:rPr>
+                <w:rFonts w:ascii="Aptos" w:hAnsi="Aptos"/>
+                <w:b/>
+                <w:sz w:val="15"/>
+              </w:rPr>
+            </w:pPr>
+            <w:r>
+              <w:rPr>
+                <w:rFonts w:ascii="Aptos" w:hAnsi="Aptos"/>
+                <w:b/>
+                <w:sz w:val="15"/>
+              </w:rPr>
+              <w:t>Gate</w:t>
+            </w:r>
+          </w:p>
+        </w:tc>
+        <w:tc>
+          <w:tcPr>
+            <w:tcW w:w="6660" w:type="dxa"/>
+            <w:shd w:val="clear" w:color="auto" w:fill="E8EEF5"/>
+          </w:tcPr>
+          <w:p>
+            <w:pPr>
+              <w:rPr>
+                <w:rFonts w:ascii="Aptos" w:hAnsi="Aptos"/>
+                <w:b/>
+                <w:sz w:val="15"/>
+              </w:rPr>
+            </w:pPr>
+            <w:r>
+              <w:rPr>
+                <w:rFonts w:ascii="Aptos" w:hAnsi="Aptos"/>
+                <w:b/>
+                <w:sz w:val="15"/>
+              </w:rPr>
+              <w:t>Esito</w:t>
+            </w:r>
+          </w:p>
+        </w:tc>
+      </w:tr>
+      <w:tr>
+        <w:tc>
+          <w:tcPr>
+            <w:tcW w:w="2700" w:type="dxa"/>
+          </w:tcPr>
+          <w:p>
+            <w:pPr>
+              <w:rPr>
+                <w:rFonts w:ascii="Aptos" w:hAnsi="Aptos"/>
+                <w:sz w:val="15"/>
+              </w:rPr>
+            </w:pPr>
+            <w:r>
+              <w:rPr>
+                <w:rFonts w:ascii="Aptos" w:hAnsi="Aptos"/>
+                <w:sz w:val="15"/>
+              </w:rPr>
+              <w:t>naming PE/SE e ambiente C</w:t>
+            </w:r>
+          </w:p>
+        </w:tc>
+        <w:tc>
+          <w:tcPr>
+            <w:tcW w:w="6660" w:type="dxa"/>
+          </w:tcPr>
+          <w:p>
+            <w:pPr>
+              <w:rPr>
+                <w:rFonts w:ascii="Aptos" w:hAnsi="Aptos"/>
+                <w:sz w:val="15"/>
+              </w:rPr>
+            </w:pPr>
+            <w:r>
+              <w:rPr>
+                <w:rFonts w:ascii="Aptos" w:hAnsi="Aptos"/>
+                <w:sz w:val="15"/>
+              </w:rPr>
+              <w:t>&lt;OK/KO&gt;</w:t>
+            </w:r>
+          </w:p>
+        </w:tc>
+      </w:tr>
+      <w:tr>
+        <w:tc>
+          <w:tcPr>
+            <w:tcW w:w="2700" w:type="dxa"/>
+          </w:tcPr>
+          <w:p>
+            <w:pPr>
+              <w:rPr>
+                <w:rFonts w:ascii="Aptos" w:hAnsi="Aptos"/>
+                <w:sz w:val="15"/>
+              </w:rPr>
+            </w:pPr>
+            <w:r>
+              <w:rPr>
+                <w:rFonts w:ascii="Aptos" w:hAnsi="Aptos"/>
+                <w:sz w:val="15"/>
+              </w:rPr>
+              <w:t>Broker configuration name DR_M24SHAMSC_CONF</w:t>
+            </w:r>
+          </w:p>
+        </w:tc>
+        <w:tc>
+          <w:tcPr>
+            <w:tcW w:w="6660" w:type="dxa"/>
+          </w:tcPr>
+          <w:p>
+            <w:pPr>
+              <w:rPr>
+                <w:rFonts w:ascii="Aptos" w:hAnsi="Aptos"/>
+                <w:sz w:val="15"/>
+              </w:rPr>
+            </w:pPr>
+            <w:r>
+              <w:rPr>
+                <w:rFonts w:ascii="Aptos" w:hAnsi="Aptos"/>
+                <w:sz w:val="15"/>
+              </w:rPr>
+              <w:t>&lt;OK/KO&gt;</w:t>
+            </w:r>
+          </w:p>
+        </w:tc>
+      </w:tr>
+      <w:tr>
+        <w:tc>
+          <w:tcPr>
+            <w:tcW w:w="2700" w:type="dxa"/>
+          </w:tcPr>
+          <w:p>
+            <w:pPr>
+              <w:rPr>
+                <w:rFonts w:ascii="Aptos" w:hAnsi="Aptos"/>
+                <w:sz w:val="15"/>
+              </w:rPr>
+            </w:pPr>
+            <w:r>
+              <w:rPr>
+                <w:rFonts w:ascii="Aptos" w:hAnsi="Aptos"/>
+                <w:sz w:val="15"/>
+              </w:rPr>
+              <w:t>Global Database Name primary M24SHAMSPEC[.&lt;DB_DOMAIN&gt;]</w:t>
+            </w:r>
+          </w:p>
+        </w:tc>
+        <w:tc>
+          <w:tcPr>
+            <w:tcW w:w="6660" w:type="dxa"/>
+          </w:tcPr>
+          <w:p>
+            <w:pPr>
+              <w:rPr>
+                <w:rFonts w:ascii="Aptos" w:hAnsi="Aptos"/>
+                <w:sz w:val="15"/>
+              </w:rPr>
+            </w:pPr>
+            <w:r>
+              <w:rPr>
+                <w:rFonts w:ascii="Aptos" w:hAnsi="Aptos"/>
+                <w:sz w:val="15"/>
+              </w:rPr>
+              <w:t>&lt;OK/KO&gt;</w:t>
+            </w:r>
+          </w:p>
+        </w:tc>
+      </w:tr>
+      <w:tr>
+        <w:tc>
+          <w:tcPr>
+            <w:tcW w:w="2700" w:type="dxa"/>
+          </w:tcPr>
+          <w:p>
+            <w:pPr>
+              <w:rPr>
+                <w:rFonts w:ascii="Aptos" w:hAnsi="Aptos"/>
+                <w:sz w:val="15"/>
+              </w:rPr>
+            </w:pPr>
+            <w:r>
+              <w:rPr>
+                <w:rFonts w:ascii="Aptos" w:hAnsi="Aptos"/>
+                <w:sz w:val="15"/>
+              </w:rPr>
+              <w:t>DB_NAME=M24SHAMS, DB_UNIQUE_NAME=M24SHAMSPEC</w:t>
+            </w:r>
+          </w:p>
+        </w:tc>
+        <w:tc>
+          <w:tcPr>
+            <w:tcW w:w="6660" w:type="dxa"/>
+          </w:tcPr>
+          <w:p>
+            <w:pPr>
+              <w:rPr>
+                <w:rFonts w:ascii="Aptos" w:hAnsi="Aptos"/>
+                <w:sz w:val="15"/>
+              </w:rPr>
+            </w:pPr>
+            <w:r>
+              <w:rPr>
+                <w:rFonts w:ascii="Aptos" w:hAnsi="Aptos"/>
+                <w:sz w:val="15"/>
+              </w:rPr>
+              <w:t>&lt;OK/KO&gt;</w:t>
+            </w:r>
+          </w:p>
+        </w:tc>
+      </w:tr>
+      <w:tr>
+        <w:tc>
+          <w:tcPr>
+            <w:tcW w:w="2700" w:type="dxa"/>
+          </w:tcPr>
+          <w:p>
+            <w:pPr>
+              <w:rPr>
+                <w:rFonts w:ascii="Aptos" w:hAnsi="Aptos"/>
+                <w:sz w:val="15"/>
+              </w:rPr>
+            </w:pPr>
+            <w:r>
+              <w:rPr>
+                <w:rFonts w:ascii="Aptos" w:hAnsi="Aptos"/>
+                <w:sz w:val="15"/>
+              </w:rPr>
+              <w:t>RPO, RTO e latenza</w:t>
+            </w:r>
+          </w:p>
+        </w:tc>
+        <w:tc>
+          <w:tcPr>
+            <w:tcW w:w="6660" w:type="dxa"/>
+          </w:tcPr>
+          <w:p>
+            <w:pPr>
+              <w:rPr>
+                <w:rFonts w:ascii="Aptos" w:hAnsi="Aptos"/>
+                <w:sz w:val="15"/>
+              </w:rPr>
+            </w:pPr>
+            <w:r>
+              <w:rPr>
+                <w:rFonts w:ascii="Aptos" w:hAnsi="Aptos"/>
+                <w:sz w:val="15"/>
+              </w:rPr>
+              <w:t>&lt;OK/KO&gt;</w:t>
+            </w:r>
+          </w:p>
+        </w:tc>
+      </w:tr>
+      <w:tr>
+        <w:tc>
+          <w:tcPr>
+            <w:tcW w:w="2700" w:type="dxa"/>
+          </w:tcPr>
+          <w:p>
+            <w:pPr>
+              <w:rPr>
+                <w:rFonts w:ascii="Aptos" w:hAnsi="Aptos"/>
+                <w:sz w:val="15"/>
+              </w:rPr>
+            </w:pPr>
+            <w:r>
+              <w:rPr>
+                <w:rFonts w:ascii="Aptos" w:hAnsi="Aptos"/>
+                <w:sz w:val="15"/>
+              </w:rPr>
+              <w:t>storage DATA/FRA</w:t>
+            </w:r>
+          </w:p>
+        </w:tc>
+        <w:tc>
+          <w:tcPr>
+            <w:tcW w:w="6660" w:type="dxa"/>
+          </w:tcPr>
+          <w:p>
+            <w:pPr>
+              <w:rPr>
+                <w:rFonts w:ascii="Aptos" w:hAnsi="Aptos"/>
+                <w:sz w:val="15"/>
+              </w:rPr>
+            </w:pPr>
+            <w:r>
+              <w:rPr>
+                <w:rFonts w:ascii="Aptos" w:hAnsi="Aptos"/>
+                <w:sz w:val="15"/>
+              </w:rPr>
+              <w:t>&lt;OK/KO&gt;</w:t>
+            </w:r>
+          </w:p>
+        </w:tc>
+      </w:tr>
+      <w:tr>
+        <w:tc>
+          <w:tcPr>
+            <w:tcW w:w="2700" w:type="dxa"/>
+          </w:tcPr>
+          <w:p>
+            <w:pPr>
+              <w:rPr>
+                <w:rFonts w:ascii="Aptos" w:hAnsi="Aptos"/>
+                <w:sz w:val="15"/>
+              </w:rPr>
+            </w:pPr>
+            <w:r>
+              <w:rPr>
+                <w:rFonts w:ascii="Aptos" w:hAnsi="Aptos"/>
+                <w:sz w:val="15"/>
+              </w:rPr>
+              <w:t>RU Grid e DB Home</w:t>
+            </w:r>
+          </w:p>
+        </w:tc>
+        <w:tc>
+          <w:tcPr>
+            <w:tcW w:w="6660" w:type="dxa"/>
+          </w:tcPr>
+          <w:p>
+            <w:pPr>
+              <w:rPr>
+                <w:rFonts w:ascii="Aptos" w:hAnsi="Aptos"/>
+                <w:sz w:val="15"/>
+              </w:rPr>
+            </w:pPr>
+            <w:r>
+              <w:rPr>
+                <w:rFonts w:ascii="Aptos" w:hAnsi="Aptos"/>
+                <w:sz w:val="15"/>
+              </w:rPr>
+              <w:t>&lt;OK/KO&gt;</w:t>
+            </w:r>
+          </w:p>
+        </w:tc>
+      </w:tr>
+      <w:tr>
+        <w:tc>
+          <w:tcPr>
+            <w:tcW w:w="2700" w:type="dxa"/>
+          </w:tcPr>
+          <w:p>
+            <w:pPr>
+              <w:rPr>
+                <w:rFonts w:ascii="Aptos" w:hAnsi="Aptos"/>
+                <w:sz w:val="15"/>
+              </w:rPr>
+            </w:pPr>
+            <w:r>
+              <w:rPr>
+                <w:rFonts w:ascii="Aptos" w:hAnsi="Aptos"/>
+                <w:sz w:val="15"/>
+              </w:rPr>
+              <w:t>ADG disattivo oppure gate licenza/lab personale</w:t>
+            </w:r>
+          </w:p>
+        </w:tc>
+        <w:tc>
+          <w:tcPr>
+            <w:tcW w:w="6660" w:type="dxa"/>
+          </w:tcPr>
+          <w:p>
+            <w:pPr>
+              <w:rPr>
+                <w:rFonts w:ascii="Aptos" w:hAnsi="Aptos"/>
+                <w:sz w:val="15"/>
+              </w:rPr>
+            </w:pPr>
+            <w:r>
+              <w:rPr>
+                <w:rFonts w:ascii="Aptos" w:hAnsi="Aptos"/>
+                <w:sz w:val="15"/>
+              </w:rPr>
+              <w:t>&lt;OK/KO&gt;</w:t>
+            </w:r>
+          </w:p>
+        </w:tc>
+      </w:tr>
+      <w:tr>
+        <w:tc>
+          <w:tcPr>
+            <w:tcW w:w="2700" w:type="dxa"/>
+          </w:tcPr>
+          <w:p>
+            <w:pPr>
+              <w:rPr>
+                <w:rFonts w:ascii="Aptos" w:hAnsi="Aptos"/>
+                <w:sz w:val="15"/>
+              </w:rPr>
+            </w:pPr>
+            <w:r>
+              <w:rPr>
+                <w:rFonts w:ascii="Aptos" w:hAnsi="Aptos"/>
+                <w:sz w:val="15"/>
+              </w:rPr>
+              <w:t>decisione TDE</w:t>
+            </w:r>
+          </w:p>
+        </w:tc>
+        <w:tc>
+          <w:tcPr>
+            <w:tcW w:w="6660" w:type="dxa"/>
+          </w:tcPr>
+          <w:p>
+            <w:pPr>
+              <w:rPr>
+                <w:rFonts w:ascii="Aptos" w:hAnsi="Aptos"/>
+                <w:sz w:val="15"/>
+              </w:rPr>
+            </w:pPr>
+            <w:r>
+              <w:rPr>
+                <w:rFonts w:ascii="Aptos" w:hAnsi="Aptos"/>
+                <w:sz w:val="15"/>
+              </w:rPr>
+              <w:t>&lt;OK/KO&gt;</w:t>
+            </w:r>
+          </w:p>
+        </w:tc>
+      </w:tr>
+      <w:tr>
+        <w:tc>
+          <w:tcPr>
+            <w:tcW w:w="2700" w:type="dxa"/>
+          </w:tcPr>
+          <w:p>
+            <w:pPr>
+              <w:rPr>
+                <w:rFonts w:ascii="Aptos" w:hAnsi="Aptos"/>
+                <w:sz w:val="15"/>
+              </w:rPr>
+            </w:pPr>
+            <w:r>
+              <w:rPr>
+                <w:rFonts w:ascii="Aptos" w:hAnsi="Aptos"/>
+                <w:sz w:val="15"/>
+              </w:rPr>
+              <w:t>recovery catalog RMAN</w:t>
+            </w:r>
+          </w:p>
+        </w:tc>
+        <w:tc>
+          <w:tcPr>
+            <w:tcW w:w="6660" w:type="dxa"/>
+          </w:tcPr>
+          <w:p>
+            <w:pPr>
+              <w:rPr>
+                <w:rFonts w:ascii="Aptos" w:hAnsi="Aptos"/>
+                <w:sz w:val="15"/>
+              </w:rPr>
+            </w:pPr>
+            <w:r>
+              <w:rPr>
+                <w:rFonts w:ascii="Aptos" w:hAnsi="Aptos"/>
+                <w:sz w:val="15"/>
+              </w:rPr>
+              <w:t>&lt;OK/KO&gt;</w:t>
+            </w:r>
+          </w:p>
+        </w:tc>
+      </w:tr>
+      <w:tr>
+        <w:tc>
+          <w:tcPr>
+            <w:tcW w:w="2700" w:type="dxa"/>
+          </w:tcPr>
+          <w:p>
+            <w:pPr>
+              <w:rPr>
+                <w:rFonts w:ascii="Aptos" w:hAnsi="Aptos"/>
+                <w:sz w:val="15"/>
+              </w:rPr>
+            </w:pPr>
+            <w:r>
+              <w:rPr>
+                <w:rFonts w:ascii="Aptos" w:hAnsi="Aptos"/>
+                <w:sz w:val="15"/>
+              </w:rPr>
+              <w:t>share /backup/rman/&lt;DB_UNIQUE_NAME&gt; PE/SE</w:t>
+            </w:r>
+          </w:p>
+        </w:tc>
+        <w:tc>
+          <w:tcPr>
+            <w:tcW w:w="6660" w:type="dxa"/>
+          </w:tcPr>
+          <w:p>
+            <w:pPr>
+              <w:rPr>
+                <w:rFonts w:ascii="Aptos" w:hAnsi="Aptos"/>
+                <w:sz w:val="15"/>
+              </w:rPr>
+            </w:pPr>
+            <w:r>
+              <w:rPr>
+                <w:rFonts w:ascii="Aptos" w:hAnsi="Aptos"/>
+                <w:sz w:val="15"/>
+              </w:rPr>
+              <w:t>&lt;OK/KO&gt;</w:t>
+            </w:r>
+          </w:p>
+        </w:tc>
+      </w:tr>
+    </w:tbl>
+    <w:p/>
+    <w:p>
+      <w:pPr>
+        <w:pStyle w:val="Heading2"/>
+      </w:pPr>
+      <w:r>
+        <w:t>2. Gate host</w:t>
       </w:r>
     </w:p>
     <w:tbl>
@@ -574,17 +1110,14 @@
         <w:tblLook w:val="04A0" w:firstRow="1" w:lastRow="0" w:firstColumn="1" w:lastColumn="0" w:noHBand="0" w:noVBand="1"/>
       </w:tblPr>
       <w:tblGrid>
-        <w:gridCol w:w="4680"/>
-        <w:gridCol w:w="4680"/>
+        <w:gridCol w:w="2700"/>
+        <w:gridCol w:w="6660"/>
       </w:tblGrid>
       <w:tr>
-        <w:trPr>
-          <w:tblHeader/>
-        </w:trPr>
-        <w:tc>
-          <w:tcPr>
-            <w:tcW w:w="4680" w:type="dxa"/>
-            <w:shd w:val="clear" w:color="auto" w:fill="E6E6E6"/>
+        <w:tc>
+          <w:tcPr>
+            <w:tcW w:w="2700" w:type="dxa"/>
+            <w:shd w:val="clear" w:color="auto" w:fill="E8EEF5"/>
           </w:tcPr>
           <w:p>
             <w:pPr>
@@ -600,14 +1133,14 @@
                 <w:b/>
                 <w:sz w:val="15"/>
               </w:rPr>
-              <w:t>Gate</w:t>
-            </w:r>
-          </w:p>
-        </w:tc>
-        <w:tc>
-          <w:tcPr>
-            <w:tcW w:w="4680" w:type="dxa"/>
-            <w:shd w:val="clear" w:color="auto" w:fill="E6E6E6"/>
+              <w:t>Blueprint</w:t>
+            </w:r>
+          </w:p>
+        </w:tc>
+        <w:tc>
+          <w:tcPr>
+            <w:tcW w:w="6660" w:type="dxa"/>
+            <w:shd w:val="clear" w:color="auto" w:fill="E8EEF5"/>
           </w:tcPr>
           <w:p>
             <w:pPr>
@@ -623,386 +1156,91 @@
                 <w:b/>
                 <w:sz w:val="15"/>
               </w:rPr>
-              <w:t>Esito</w:t>
-            </w:r>
-          </w:p>
-        </w:tc>
-      </w:tr>
-      <w:tr>
-        <w:tc>
-          <w:tcPr>
-            <w:tcW w:w="4680" w:type="dxa"/>
-          </w:tcPr>
-          <w:p>
-            <w:pPr>
-              <w:rPr>
-                <w:rFonts w:ascii="Aptos" w:hAnsi="Aptos"/>
-                <w:sz w:val="15"/>
-              </w:rPr>
-            </w:pPr>
-            <w:r>
-              <w:rPr>
-                <w:rFonts w:ascii="Aptos" w:hAnsi="Aptos"/>
-                <w:sz w:val="15"/>
-              </w:rPr>
-              <w:t>naming PE/SE e ambiente C</w:t>
-            </w:r>
-          </w:p>
-        </w:tc>
-        <w:tc>
-          <w:tcPr>
-            <w:tcW w:w="4680" w:type="dxa"/>
-          </w:tcPr>
-          <w:p>
-            <w:pPr>
-              <w:rPr>
-                <w:rFonts w:ascii="Aptos" w:hAnsi="Aptos"/>
-                <w:sz w:val="15"/>
-              </w:rPr>
-            </w:pPr>
-            <w:r>
-              <w:rPr>
-                <w:rFonts w:ascii="Aptos" w:hAnsi="Aptos"/>
-                <w:sz w:val="15"/>
-              </w:rPr>
-              <w:t>&lt;OK/KO&gt;</w:t>
-            </w:r>
-          </w:p>
-        </w:tc>
-      </w:tr>
-      <w:tr>
-        <w:tc>
-          <w:tcPr>
-            <w:tcW w:w="4680" w:type="dxa"/>
-          </w:tcPr>
-          <w:p>
-            <w:pPr>
-              <w:rPr>
-                <w:rFonts w:ascii="Aptos" w:hAnsi="Aptos"/>
-                <w:sz w:val="15"/>
-              </w:rPr>
-            </w:pPr>
-            <w:r>
-              <w:rPr>
-                <w:rFonts w:ascii="Aptos" w:hAnsi="Aptos"/>
-                <w:sz w:val="15"/>
-              </w:rPr>
-              <w:t>Global Database Name primary M24SHAMSPEC[.&lt;DB_DOMAIN&gt;]</w:t>
-            </w:r>
-          </w:p>
-        </w:tc>
-        <w:tc>
-          <w:tcPr>
-            <w:tcW w:w="4680" w:type="dxa"/>
-          </w:tcPr>
-          <w:p>
-            <w:pPr>
-              <w:rPr>
-                <w:rFonts w:ascii="Aptos" w:hAnsi="Aptos"/>
-                <w:sz w:val="15"/>
-              </w:rPr>
-            </w:pPr>
-            <w:r>
-              <w:rPr>
-                <w:rFonts w:ascii="Aptos" w:hAnsi="Aptos"/>
-                <w:sz w:val="15"/>
-              </w:rPr>
-              <w:t>&lt;OK/KO&gt;</w:t>
-            </w:r>
-          </w:p>
-        </w:tc>
-      </w:tr>
-      <w:tr>
-        <w:tc>
-          <w:tcPr>
-            <w:tcW w:w="4680" w:type="dxa"/>
-          </w:tcPr>
-          <w:p>
-            <w:pPr>
-              <w:rPr>
-                <w:rFonts w:ascii="Aptos" w:hAnsi="Aptos"/>
-                <w:sz w:val="15"/>
-              </w:rPr>
-            </w:pPr>
-            <w:r>
-              <w:rPr>
-                <w:rFonts w:ascii="Aptos" w:hAnsi="Aptos"/>
-                <w:sz w:val="15"/>
-              </w:rPr>
-              <w:t>DB_NAME=M24SHAMS, DB_UNIQUE_NAME=M24SHAMSPEC</w:t>
-            </w:r>
-          </w:p>
-        </w:tc>
-        <w:tc>
-          <w:tcPr>
-            <w:tcW w:w="4680" w:type="dxa"/>
-          </w:tcPr>
-          <w:p>
-            <w:pPr>
-              <w:rPr>
-                <w:rFonts w:ascii="Aptos" w:hAnsi="Aptos"/>
-                <w:sz w:val="15"/>
-              </w:rPr>
-            </w:pPr>
-            <w:r>
-              <w:rPr>
-                <w:rFonts w:ascii="Aptos" w:hAnsi="Aptos"/>
-                <w:sz w:val="15"/>
-              </w:rPr>
-              <w:t>&lt;OK/KO&gt;</w:t>
-            </w:r>
-          </w:p>
-        </w:tc>
-      </w:tr>
-      <w:tr>
-        <w:tc>
-          <w:tcPr>
-            <w:tcW w:w="4680" w:type="dxa"/>
-          </w:tcPr>
-          <w:p>
-            <w:pPr>
-              <w:rPr>
-                <w:rFonts w:ascii="Aptos" w:hAnsi="Aptos"/>
-                <w:sz w:val="15"/>
-              </w:rPr>
-            </w:pPr>
-            <w:r>
-              <w:rPr>
-                <w:rFonts w:ascii="Aptos" w:hAnsi="Aptos"/>
-                <w:sz w:val="15"/>
-              </w:rPr>
-              <w:t>RPO, RTO e latenza</w:t>
-            </w:r>
-          </w:p>
-        </w:tc>
-        <w:tc>
-          <w:tcPr>
-            <w:tcW w:w="4680" w:type="dxa"/>
-          </w:tcPr>
-          <w:p>
-            <w:pPr>
-              <w:rPr>
-                <w:rFonts w:ascii="Aptos" w:hAnsi="Aptos"/>
-                <w:sz w:val="15"/>
-              </w:rPr>
-            </w:pPr>
-            <w:r>
-              <w:rPr>
-                <w:rFonts w:ascii="Aptos" w:hAnsi="Aptos"/>
-                <w:sz w:val="15"/>
-              </w:rPr>
-              <w:t>&lt;OK/KO&gt;</w:t>
-            </w:r>
-          </w:p>
-        </w:tc>
-      </w:tr>
-      <w:tr>
-        <w:tc>
-          <w:tcPr>
-            <w:tcW w:w="4680" w:type="dxa"/>
-          </w:tcPr>
-          <w:p>
-            <w:pPr>
-              <w:rPr>
-                <w:rFonts w:ascii="Aptos" w:hAnsi="Aptos"/>
-                <w:sz w:val="15"/>
-              </w:rPr>
-            </w:pPr>
-            <w:r>
-              <w:rPr>
-                <w:rFonts w:ascii="Aptos" w:hAnsi="Aptos"/>
-                <w:sz w:val="15"/>
-              </w:rPr>
-              <w:lastRenderedPageBreak/>
-              <w:t>storage DATA/FRA</w:t>
-            </w:r>
-          </w:p>
-        </w:tc>
-        <w:tc>
-          <w:tcPr>
-            <w:tcW w:w="4680" w:type="dxa"/>
-          </w:tcPr>
-          <w:p>
-            <w:pPr>
-              <w:rPr>
-                <w:rFonts w:ascii="Aptos" w:hAnsi="Aptos"/>
-                <w:sz w:val="15"/>
-              </w:rPr>
-            </w:pPr>
-            <w:r>
-              <w:rPr>
-                <w:rFonts w:ascii="Aptos" w:hAnsi="Aptos"/>
-                <w:sz w:val="15"/>
-              </w:rPr>
-              <w:t>&lt;OK/KO&gt;</w:t>
-            </w:r>
-          </w:p>
-        </w:tc>
-      </w:tr>
-      <w:tr>
-        <w:tc>
-          <w:tcPr>
-            <w:tcW w:w="4680" w:type="dxa"/>
-          </w:tcPr>
-          <w:p>
-            <w:pPr>
-              <w:rPr>
-                <w:rFonts w:ascii="Aptos" w:hAnsi="Aptos"/>
-                <w:sz w:val="15"/>
-              </w:rPr>
-            </w:pPr>
-            <w:r>
-              <w:rPr>
-                <w:rFonts w:ascii="Aptos" w:hAnsi="Aptos"/>
-                <w:sz w:val="15"/>
-              </w:rPr>
-              <w:t>RU Grid e DB Home</w:t>
-            </w:r>
-          </w:p>
-        </w:tc>
-        <w:tc>
-          <w:tcPr>
-            <w:tcW w:w="4680" w:type="dxa"/>
-          </w:tcPr>
-          <w:p>
-            <w:pPr>
-              <w:rPr>
-                <w:rFonts w:ascii="Aptos" w:hAnsi="Aptos"/>
-                <w:sz w:val="15"/>
-              </w:rPr>
-            </w:pPr>
-            <w:r>
-              <w:rPr>
-                <w:rFonts w:ascii="Aptos" w:hAnsi="Aptos"/>
-                <w:sz w:val="15"/>
-              </w:rPr>
-              <w:t>&lt;OK/KO&gt;</w:t>
-            </w:r>
-          </w:p>
-        </w:tc>
-      </w:tr>
-      <w:tr>
-        <w:tc>
-          <w:tcPr>
-            <w:tcW w:w="4680" w:type="dxa"/>
-          </w:tcPr>
-          <w:p>
-            <w:pPr>
-              <w:rPr>
-                <w:rFonts w:ascii="Aptos" w:hAnsi="Aptos"/>
-                <w:sz w:val="15"/>
-              </w:rPr>
-            </w:pPr>
-            <w:r>
-              <w:rPr>
-                <w:rFonts w:ascii="Aptos" w:hAnsi="Aptos"/>
-                <w:sz w:val="15"/>
-              </w:rPr>
-              <w:t>ADG disattivo oppure gate licenza/lab personale</w:t>
-            </w:r>
-          </w:p>
-        </w:tc>
-        <w:tc>
-          <w:tcPr>
-            <w:tcW w:w="4680" w:type="dxa"/>
-          </w:tcPr>
-          <w:p>
-            <w:pPr>
-              <w:rPr>
-                <w:rFonts w:ascii="Aptos" w:hAnsi="Aptos"/>
-                <w:sz w:val="15"/>
-              </w:rPr>
-            </w:pPr>
-            <w:r>
-              <w:rPr>
-                <w:rFonts w:ascii="Aptos" w:hAnsi="Aptos"/>
-                <w:sz w:val="15"/>
-              </w:rPr>
-              <w:t>&lt;OK/KO&gt;</w:t>
-            </w:r>
-          </w:p>
-        </w:tc>
-      </w:tr>
-      <w:tr>
-        <w:tc>
-          <w:tcPr>
-            <w:tcW w:w="4680" w:type="dxa"/>
-          </w:tcPr>
-          <w:p>
-            <w:pPr>
-              <w:rPr>
-                <w:rFonts w:ascii="Aptos" w:hAnsi="Aptos"/>
-                <w:sz w:val="15"/>
-              </w:rPr>
-            </w:pPr>
-            <w:r>
-              <w:rPr>
-                <w:rFonts w:ascii="Aptos" w:hAnsi="Aptos"/>
-                <w:sz w:val="15"/>
-              </w:rPr>
-              <w:t>decisione TDE</w:t>
-            </w:r>
-          </w:p>
-        </w:tc>
-        <w:tc>
-          <w:tcPr>
-            <w:tcW w:w="4680" w:type="dxa"/>
-          </w:tcPr>
-          <w:p>
-            <w:pPr>
-              <w:rPr>
-                <w:rFonts w:ascii="Aptos" w:hAnsi="Aptos"/>
-                <w:sz w:val="15"/>
-              </w:rPr>
-            </w:pPr>
-            <w:r>
-              <w:rPr>
-                <w:rFonts w:ascii="Aptos" w:hAnsi="Aptos"/>
-                <w:sz w:val="15"/>
-              </w:rPr>
-              <w:t>&lt;OK/KO&gt;</w:t>
-            </w:r>
-          </w:p>
-        </w:tc>
-      </w:tr>
-      <w:tr>
-        <w:tc>
-          <w:tcPr>
-            <w:tcW w:w="4680" w:type="dxa"/>
-          </w:tcPr>
-          <w:p>
-            <w:pPr>
-              <w:rPr>
-                <w:rFonts w:ascii="Aptos" w:hAnsi="Aptos"/>
-                <w:sz w:val="15"/>
-              </w:rPr>
-            </w:pPr>
-            <w:r>
-              <w:rPr>
-                <w:rFonts w:ascii="Aptos" w:hAnsi="Aptos"/>
-                <w:sz w:val="15"/>
-              </w:rPr>
-              <w:t>recovery catalog RMAN</w:t>
-            </w:r>
-          </w:p>
-        </w:tc>
-        <w:tc>
-          <w:tcPr>
-            <w:tcW w:w="4680" w:type="dxa"/>
-          </w:tcPr>
-          <w:p>
-            <w:pPr>
-              <w:rPr>
-                <w:rFonts w:ascii="Aptos" w:hAnsi="Aptos"/>
-                <w:sz w:val="15"/>
-              </w:rPr>
-            </w:pPr>
-            <w:r>
-              <w:rPr>
-                <w:rFonts w:ascii="Aptos" w:hAnsi="Aptos"/>
-                <w:sz w:val="15"/>
-              </w:rPr>
-              <w:t>&lt;OK/KO&gt;</w:t>
+              <w:t>Allegato</w:t>
+            </w:r>
+          </w:p>
+        </w:tc>
+      </w:tr>
+      <w:tr>
+        <w:tc>
+          <w:tcPr>
+            <w:tcW w:w="2700" w:type="dxa"/>
+          </w:tcPr>
+          <w:p>
+            <w:pPr>
+              <w:rPr>
+                <w:rFonts w:ascii="Aptos" w:hAnsi="Aptos"/>
+                <w:sz w:val="15"/>
+              </w:rPr>
+            </w:pPr>
+            <w:r>
+              <w:rPr>
+                <w:rFonts w:ascii="Aptos" w:hAnsi="Aptos"/>
+                <w:sz w:val="15"/>
+              </w:rPr>
+              <w:t>S1, S2</w:t>
+            </w:r>
+          </w:p>
+        </w:tc>
+        <w:tc>
+          <w:tcPr>
+            <w:tcW w:w="6660" w:type="dxa"/>
+          </w:tcPr>
+          <w:p>
+            <w:pPr>
+              <w:rPr>
+                <w:rFonts w:ascii="Aptos" w:hAnsi="Aptos"/>
+                <w:sz w:val="15"/>
+              </w:rPr>
+            </w:pPr>
+            <w:r>
+              <w:rPr>
+                <w:rFonts w:ascii="Aptos" w:hAnsi="Aptos"/>
+                <w:sz w:val="15"/>
+              </w:rPr>
+              <w:t>Host single</w:t>
+            </w:r>
+          </w:p>
+        </w:tc>
+      </w:tr>
+      <w:tr>
+        <w:tc>
+          <w:tcPr>
+            <w:tcW w:w="2700" w:type="dxa"/>
+          </w:tcPr>
+          <w:p>
+            <w:pPr>
+              <w:rPr>
+                <w:rFonts w:ascii="Aptos" w:hAnsi="Aptos"/>
+                <w:sz w:val="15"/>
+              </w:rPr>
+            </w:pPr>
+            <w:r>
+              <w:rPr>
+                <w:rFonts w:ascii="Aptos" w:hAnsi="Aptos"/>
+                <w:sz w:val="15"/>
+              </w:rPr>
+              <w:t>S3, S4</w:t>
+            </w:r>
+          </w:p>
+        </w:tc>
+        <w:tc>
+          <w:tcPr>
+            <w:tcW w:w="6660" w:type="dxa"/>
+          </w:tcPr>
+          <w:p>
+            <w:pPr>
+              <w:rPr>
+                <w:rFonts w:ascii="Aptos" w:hAnsi="Aptos"/>
+                <w:sz w:val="15"/>
+              </w:rPr>
+            </w:pPr>
+            <w:r>
+              <w:rPr>
+                <w:rFonts w:ascii="Aptos" w:hAnsi="Aptos"/>
+                <w:sz w:val="15"/>
+              </w:rPr>
+              <w:t>Host RAC</w:t>
             </w:r>
           </w:p>
         </w:tc>
@@ -1014,7 +1252,7 @@
         <w:pStyle w:val="Heading2"/>
       </w:pPr>
       <w:r>
-        <w:t>2. Gate host</w:t>
+        <w:t>3. Gate database</w:t>
       </w:r>
     </w:p>
     <w:tbl>
@@ -1032,17 +1270,15 @@
         <w:tblLook w:val="04A0" w:firstRow="1" w:lastRow="0" w:firstColumn="1" w:lastColumn="0" w:noHBand="0" w:noVBand="1"/>
       </w:tblPr>
       <w:tblGrid>
-        <w:gridCol w:w="4680"/>
-        <w:gridCol w:w="4680"/>
+        <w:gridCol w:w="2160"/>
+        <w:gridCol w:w="5040"/>
+        <w:gridCol w:w="2160"/>
       </w:tblGrid>
       <w:tr>
-        <w:trPr>
-          <w:tblHeader/>
-        </w:trPr>
-        <w:tc>
-          <w:tcPr>
-            <w:tcW w:w="4680" w:type="dxa"/>
-            <w:shd w:val="clear" w:color="auto" w:fill="E6E6E6"/>
+        <w:tc>
+          <w:tcPr>
+            <w:tcW w:w="2160" w:type="dxa"/>
+            <w:shd w:val="clear" w:color="auto" w:fill="E8EEF5"/>
           </w:tcPr>
           <w:p>
             <w:pPr>
@@ -1058,14 +1294,14 @@
                 <w:b/>
                 <w:sz w:val="15"/>
               </w:rPr>
-              <w:t>Blueprint</w:t>
-            </w:r>
-          </w:p>
-        </w:tc>
-        <w:tc>
-          <w:tcPr>
-            <w:tcW w:w="4680" w:type="dxa"/>
-            <w:shd w:val="clear" w:color="auto" w:fill="E6E6E6"/>
+              <w:t>Check</w:t>
+            </w:r>
+          </w:p>
+        </w:tc>
+        <w:tc>
+          <w:tcPr>
+            <w:tcW w:w="5040" w:type="dxa"/>
+            <w:shd w:val="clear" w:color="auto" w:fill="E8EEF5"/>
           </w:tcPr>
           <w:p>
             <w:pPr>
@@ -1081,132 +1317,14 @@
                 <w:b/>
                 <w:sz w:val="15"/>
               </w:rPr>
-              <w:t>Allegato</w:t>
-            </w:r>
-          </w:p>
-        </w:tc>
-      </w:tr>
-      <w:tr>
-        <w:tc>
-          <w:tcPr>
-            <w:tcW w:w="4680" w:type="dxa"/>
-          </w:tcPr>
-          <w:p>
-            <w:pPr>
-              <w:rPr>
-                <w:rFonts w:ascii="Aptos" w:hAnsi="Aptos"/>
-                <w:sz w:val="15"/>
-              </w:rPr>
-            </w:pPr>
-            <w:r>
-              <w:rPr>
-                <w:rFonts w:ascii="Aptos" w:hAnsi="Aptos"/>
-                <w:sz w:val="15"/>
-              </w:rPr>
-              <w:t>S1, S2</w:t>
-            </w:r>
-          </w:p>
-        </w:tc>
-        <w:tc>
-          <w:tcPr>
-            <w:tcW w:w="4680" w:type="dxa"/>
-          </w:tcPr>
-          <w:p>
-            <w:pPr>
-              <w:rPr>
-                <w:rFonts w:ascii="Aptos" w:hAnsi="Aptos"/>
-                <w:sz w:val="15"/>
-              </w:rPr>
-            </w:pPr>
-            <w:r>
-              <w:rPr>
-                <w:rFonts w:ascii="Aptos" w:hAnsi="Aptos"/>
-                <w:sz w:val="15"/>
-              </w:rPr>
-              <w:t>Host single</w:t>
-            </w:r>
-          </w:p>
-        </w:tc>
-      </w:tr>
-      <w:tr>
-        <w:tc>
-          <w:tcPr>
-            <w:tcW w:w="4680" w:type="dxa"/>
-          </w:tcPr>
-          <w:p>
-            <w:pPr>
-              <w:rPr>
-                <w:rFonts w:ascii="Aptos" w:hAnsi="Aptos"/>
-                <w:sz w:val="15"/>
-              </w:rPr>
-            </w:pPr>
-            <w:r>
-              <w:rPr>
-                <w:rFonts w:ascii="Aptos" w:hAnsi="Aptos"/>
-                <w:sz w:val="15"/>
-              </w:rPr>
-              <w:t>S3, S4</w:t>
-            </w:r>
-          </w:p>
-        </w:tc>
-        <w:tc>
-          <w:tcPr>
-            <w:tcW w:w="4680" w:type="dxa"/>
-          </w:tcPr>
-          <w:p>
-            <w:pPr>
-              <w:rPr>
-                <w:rFonts w:ascii="Aptos" w:hAnsi="Aptos"/>
-                <w:sz w:val="15"/>
-              </w:rPr>
-            </w:pPr>
-            <w:r>
-              <w:rPr>
-                <w:rFonts w:ascii="Aptos" w:hAnsi="Aptos"/>
-                <w:sz w:val="15"/>
-              </w:rPr>
-              <w:t>Host RAC</w:t>
-            </w:r>
-          </w:p>
-        </w:tc>
-      </w:tr>
-    </w:tbl>
-    <w:p/>
-    <w:p>
-      <w:pPr>
-        <w:pStyle w:val="Heading2"/>
-      </w:pPr>
-      <w:r>
-        <w:t>3. Gate database</w:t>
-      </w:r>
-    </w:p>
-    <w:tbl>
-      <w:tblPr>
-        <w:tblStyle w:val="TableGrid"/>
-        <w:tblW w:w="9360" w:type="dxa"/>
-        <w:tblInd w:w="-5" w:type="dxa"/>
-        <w:tblLayout w:type="fixed"/>
-        <w:tblCellMar>
-          <w:top w:w="80" w:type="dxa"/>
-          <w:left w:w="120" w:type="dxa"/>
-          <w:bottom w:w="80" w:type="dxa"/>
-          <w:right w:w="120" w:type="dxa"/>
-        </w:tblCellMar>
-        <w:tblLook w:val="04A0" w:firstRow="1" w:lastRow="0" w:firstColumn="1" w:lastColumn="0" w:noHBand="0" w:noVBand="1"/>
-      </w:tblPr>
-      <w:tblGrid>
-        <w:gridCol w:w="3120"/>
-        <w:gridCol w:w="3120"/>
-        <w:gridCol w:w="3120"/>
-      </w:tblGrid>
-      <w:tr>
-        <w:trPr>
-          <w:tblHeader/>
-        </w:trPr>
-        <w:tc>
-          <w:tcPr>
-            <w:tcW w:w="3120" w:type="dxa"/>
-            <w:shd w:val="clear" w:color="auto" w:fill="E6E6E6"/>
+              <w:t>Single</w:t>
+            </w:r>
+          </w:p>
+        </w:tc>
+        <w:tc>
+          <w:tcPr>
+            <w:tcW w:w="2160" w:type="dxa"/>
+            <w:shd w:val="clear" w:color="auto" w:fill="E8EEF5"/>
           </w:tcPr>
           <w:p>
             <w:pPr>
@@ -1222,52 +1340,6 @@
                 <w:b/>
                 <w:sz w:val="15"/>
               </w:rPr>
-              <w:t>Check</w:t>
-            </w:r>
-          </w:p>
-        </w:tc>
-        <w:tc>
-          <w:tcPr>
-            <w:tcW w:w="3120" w:type="dxa"/>
-            <w:shd w:val="clear" w:color="auto" w:fill="E6E6E6"/>
-          </w:tcPr>
-          <w:p>
-            <w:pPr>
-              <w:rPr>
-                <w:rFonts w:ascii="Aptos" w:hAnsi="Aptos"/>
-                <w:b/>
-                <w:sz w:val="15"/>
-              </w:rPr>
-            </w:pPr>
-            <w:r>
-              <w:rPr>
-                <w:rFonts w:ascii="Aptos" w:hAnsi="Aptos"/>
-                <w:b/>
-                <w:sz w:val="15"/>
-              </w:rPr>
-              <w:t>Single</w:t>
-            </w:r>
-          </w:p>
-        </w:tc>
-        <w:tc>
-          <w:tcPr>
-            <w:tcW w:w="3120" w:type="dxa"/>
-            <w:shd w:val="clear" w:color="auto" w:fill="E6E6E6"/>
-          </w:tcPr>
-          <w:p>
-            <w:pPr>
-              <w:rPr>
-                <w:rFonts w:ascii="Aptos" w:hAnsi="Aptos"/>
-                <w:b/>
-                <w:sz w:val="15"/>
-              </w:rPr>
-            </w:pPr>
-            <w:r>
-              <w:rPr>
-                <w:rFonts w:ascii="Aptos" w:hAnsi="Aptos"/>
-                <w:b/>
-                <w:sz w:val="15"/>
-              </w:rPr>
               <w:t>RAC</w:t>
             </w:r>
           </w:p>
@@ -1276,7 +1348,7 @@
       <w:tr>
         <w:tc>
           <w:tcPr>
-            <w:tcW w:w="3120" w:type="dxa"/>
+            <w:tcW w:w="2160" w:type="dxa"/>
           </w:tcPr>
           <w:p>
             <w:pPr>
@@ -1296,7 +1368,7 @@
         </w:tc>
         <w:tc>
           <w:tcPr>
-            <w:tcW w:w="3120" w:type="dxa"/>
+            <w:tcW w:w="5040" w:type="dxa"/>
           </w:tcPr>
           <w:p>
             <w:pPr>
@@ -1316,7 +1388,7 @@
         </w:tc>
         <w:tc>
           <w:tcPr>
-            <w:tcW w:w="3120" w:type="dxa"/>
+            <w:tcW w:w="2160" w:type="dxa"/>
           </w:tcPr>
           <w:p>
             <w:pPr>
@@ -1338,7 +1410,7 @@
       <w:tr>
         <w:tc>
           <w:tcPr>
-            <w:tcW w:w="3120" w:type="dxa"/>
+            <w:tcW w:w="2160" w:type="dxa"/>
           </w:tcPr>
           <w:p>
             <w:pPr>
@@ -1358,7 +1430,7 @@
         </w:tc>
         <w:tc>
           <w:tcPr>
-            <w:tcW w:w="3120" w:type="dxa"/>
+            <w:tcW w:w="5040" w:type="dxa"/>
           </w:tcPr>
           <w:p>
             <w:pPr>
@@ -1378,7 +1450,7 @@
         </w:tc>
         <w:tc>
           <w:tcPr>
-            <w:tcW w:w="3120" w:type="dxa"/>
+            <w:tcW w:w="2160" w:type="dxa"/>
           </w:tcPr>
           <w:p>
             <w:pPr>
@@ -1400,7 +1472,7 @@
       <w:tr>
         <w:tc>
           <w:tcPr>
-            <w:tcW w:w="3120" w:type="dxa"/>
+            <w:tcW w:w="2160" w:type="dxa"/>
           </w:tcPr>
           <w:p>
             <w:pPr>
@@ -1420,7 +1492,7 @@
         </w:tc>
         <w:tc>
           <w:tcPr>
-            <w:tcW w:w="3120" w:type="dxa"/>
+            <w:tcW w:w="5040" w:type="dxa"/>
           </w:tcPr>
           <w:p>
             <w:pPr>
@@ -1440,7 +1512,7 @@
         </w:tc>
         <w:tc>
           <w:tcPr>
-            <w:tcW w:w="3120" w:type="dxa"/>
+            <w:tcW w:w="2160" w:type="dxa"/>
           </w:tcPr>
           <w:p>
             <w:pPr>
@@ -1462,7 +1534,7 @@
       <w:tr>
         <w:tc>
           <w:tcPr>
-            <w:tcW w:w="3120" w:type="dxa"/>
+            <w:tcW w:w="2160" w:type="dxa"/>
           </w:tcPr>
           <w:p>
             <w:pPr>
@@ -1482,7 +1554,7 @@
         </w:tc>
         <w:tc>
           <w:tcPr>
-            <w:tcW w:w="3120" w:type="dxa"/>
+            <w:tcW w:w="5040" w:type="dxa"/>
           </w:tcPr>
           <w:p>
             <w:pPr>
@@ -1502,7 +1574,7 @@
         </w:tc>
         <w:tc>
           <w:tcPr>
-            <w:tcW w:w="3120" w:type="dxa"/>
+            <w:tcW w:w="2160" w:type="dxa"/>
           </w:tcPr>
           <w:p>
             <w:pPr>
@@ -1524,7 +1596,7 @@
       <w:tr>
         <w:tc>
           <w:tcPr>
-            <w:tcW w:w="3120" w:type="dxa"/>
+            <w:tcW w:w="2160" w:type="dxa"/>
           </w:tcPr>
           <w:p>
             <w:pPr>
@@ -1544,7 +1616,7 @@
         </w:tc>
         <w:tc>
           <w:tcPr>
-            <w:tcW w:w="3120" w:type="dxa"/>
+            <w:tcW w:w="5040" w:type="dxa"/>
           </w:tcPr>
           <w:p>
             <w:pPr>
@@ -1564,7 +1636,7 @@
         </w:tc>
         <w:tc>
           <w:tcPr>
-            <w:tcW w:w="3120" w:type="dxa"/>
+            <w:tcW w:w="2160" w:type="dxa"/>
           </w:tcPr>
           <w:p>
             <w:pPr>
@@ -1586,7 +1658,7 @@
       <w:tr>
         <w:tc>
           <w:tcPr>
-            <w:tcW w:w="3120" w:type="dxa"/>
+            <w:tcW w:w="2160" w:type="dxa"/>
           </w:tcPr>
           <w:p>
             <w:pPr>
@@ -1606,7 +1678,7 @@
         </w:tc>
         <w:tc>
           <w:tcPr>
-            <w:tcW w:w="3120" w:type="dxa"/>
+            <w:tcW w:w="5040" w:type="dxa"/>
           </w:tcPr>
           <w:p>
             <w:pPr>
@@ -1626,7 +1698,7 @@
         </w:tc>
         <w:tc>
           <w:tcPr>
-            <w:tcW w:w="3120" w:type="dxa"/>
+            <w:tcW w:w="2160" w:type="dxa"/>
           </w:tcPr>
           <w:p>
             <w:pPr>
@@ -1648,7 +1720,7 @@
       <w:tr>
         <w:tc>
           <w:tcPr>
-            <w:tcW w:w="3120" w:type="dxa"/>
+            <w:tcW w:w="2160" w:type="dxa"/>
           </w:tcPr>
           <w:p>
             <w:pPr>
@@ -1668,7 +1740,7 @@
         </w:tc>
         <w:tc>
           <w:tcPr>
-            <w:tcW w:w="3120" w:type="dxa"/>
+            <w:tcW w:w="5040" w:type="dxa"/>
           </w:tcPr>
           <w:p>
             <w:pPr>
@@ -1688,7 +1760,7 @@
         </w:tc>
         <w:tc>
           <w:tcPr>
-            <w:tcW w:w="3120" w:type="dxa"/>
+            <w:tcW w:w="2160" w:type="dxa"/>
           </w:tcPr>
           <w:p>
             <w:pPr>
@@ -1724,18 +1796,15 @@
         <w:tblLook w:val="04A0" w:firstRow="1" w:lastRow="0" w:firstColumn="1" w:lastColumn="0" w:noHBand="0" w:noVBand="1"/>
       </w:tblPr>
       <w:tblGrid>
-        <w:gridCol w:w="3120"/>
-        <w:gridCol w:w="3120"/>
-        <w:gridCol w:w="3120"/>
+        <w:gridCol w:w="2160"/>
+        <w:gridCol w:w="5040"/>
+        <w:gridCol w:w="2160"/>
       </w:tblGrid>
       <w:tr>
-        <w:trPr>
-          <w:tblHeader/>
-        </w:trPr>
-        <w:tc>
-          <w:tcPr>
-            <w:tcW w:w="3120" w:type="dxa"/>
-            <w:shd w:val="clear" w:color="auto" w:fill="E6E6E6"/>
+        <w:tc>
+          <w:tcPr>
+            <w:tcW w:w="2160" w:type="dxa"/>
+            <w:shd w:val="clear" w:color="auto" w:fill="E8EEF5"/>
           </w:tcPr>
           <w:p>
             <w:pPr>
@@ -1757,8 +1826,8 @@
         </w:tc>
         <w:tc>
           <w:tcPr>
-            <w:tcW w:w="3120" w:type="dxa"/>
-            <w:shd w:val="clear" w:color="auto" w:fill="E6E6E6"/>
+            <w:tcW w:w="5040" w:type="dxa"/>
+            <w:shd w:val="clear" w:color="auto" w:fill="E8EEF5"/>
           </w:tcPr>
           <w:p>
             <w:pPr>
@@ -1780,8 +1849,8 @@
         </w:tc>
         <w:tc>
           <w:tcPr>
-            <w:tcW w:w="3120" w:type="dxa"/>
-            <w:shd w:val="clear" w:color="auto" w:fill="E6E6E6"/>
+            <w:tcW w:w="2160" w:type="dxa"/>
+            <w:shd w:val="clear" w:color="auto" w:fill="E8EEF5"/>
           </w:tcPr>
           <w:p>
             <w:pPr>
@@ -1805,7 +1874,7 @@
       <w:tr>
         <w:tc>
           <w:tcPr>
-            <w:tcW w:w="3120" w:type="dxa"/>
+            <w:tcW w:w="2160" w:type="dxa"/>
           </w:tcPr>
           <w:p>
             <w:pPr>
@@ -1825,7 +1894,7 @@
         </w:tc>
         <w:tc>
           <w:tcPr>
-            <w:tcW w:w="3120" w:type="dxa"/>
+            <w:tcW w:w="5040" w:type="dxa"/>
           </w:tcPr>
           <w:p>
             <w:pPr>
@@ -1845,7 +1914,7 @@
         </w:tc>
         <w:tc>
           <w:tcPr>
-            <w:tcW w:w="3120" w:type="dxa"/>
+            <w:tcW w:w="2160" w:type="dxa"/>
           </w:tcPr>
           <w:p>
             <w:pPr>
@@ -1867,28 +1936,27 @@
       <w:tr>
         <w:tc>
           <w:tcPr>
-            <w:tcW w:w="3120" w:type="dxa"/>
-          </w:tcPr>
-          <w:p>
-            <w:pPr>
-              <w:rPr>
-                <w:rFonts w:ascii="Aptos" w:hAnsi="Aptos"/>
-                <w:sz w:val="15"/>
-              </w:rPr>
-            </w:pPr>
-            <w:r>
-              <w:rPr>
-                <w:rFonts w:ascii="Aptos" w:hAnsi="Aptos"/>
-                <w:sz w:val="15"/>
-              </w:rPr>
-              <w:lastRenderedPageBreak/>
+            <w:tcW w:w="2160" w:type="dxa"/>
+          </w:tcPr>
+          <w:p>
+            <w:pPr>
+              <w:rPr>
+                <w:rFonts w:ascii="Aptos" w:hAnsi="Aptos"/>
+                <w:sz w:val="15"/>
+              </w:rPr>
+            </w:pPr>
+            <w:r>
+              <w:rPr>
+                <w:rFonts w:ascii="Aptos" w:hAnsi="Aptos"/>
+                <w:sz w:val="15"/>
+              </w:rPr>
               <w:t>PDB</w:t>
             </w:r>
           </w:p>
         </w:tc>
         <w:tc>
           <w:tcPr>
-            <w:tcW w:w="3120" w:type="dxa"/>
+            <w:tcW w:w="5040" w:type="dxa"/>
           </w:tcPr>
           <w:p>
             <w:pPr>
@@ -1908,7 +1976,7 @@
         </w:tc>
         <w:tc>
           <w:tcPr>
-            <w:tcW w:w="3120" w:type="dxa"/>
+            <w:tcW w:w="2160" w:type="dxa"/>
           </w:tcPr>
           <w:p>
             <w:pPr>
@@ -1930,7 +1998,7 @@
       <w:tr>
         <w:tc>
           <w:tcPr>
-            <w:tcW w:w="3120" w:type="dxa"/>
+            <w:tcW w:w="2160" w:type="dxa"/>
           </w:tcPr>
           <w:p>
             <w:pPr>
@@ -1950,7 +2018,7 @@
         </w:tc>
         <w:tc>
           <w:tcPr>
-            <w:tcW w:w="3120" w:type="dxa"/>
+            <w:tcW w:w="5040" w:type="dxa"/>
           </w:tcPr>
           <w:p>
             <w:pPr>
@@ -1970,7 +2038,7 @@
         </w:tc>
         <w:tc>
           <w:tcPr>
-            <w:tcW w:w="3120" w:type="dxa"/>
+            <w:tcW w:w="2160" w:type="dxa"/>
           </w:tcPr>
           <w:p>
             <w:pPr>
@@ -1992,7 +2060,7 @@
       <w:tr>
         <w:tc>
           <w:tcPr>
-            <w:tcW w:w="3120" w:type="dxa"/>
+            <w:tcW w:w="2160" w:type="dxa"/>
           </w:tcPr>
           <w:p>
             <w:pPr>
@@ -2012,7 +2080,7 @@
         </w:tc>
         <w:tc>
           <w:tcPr>
-            <w:tcW w:w="3120" w:type="dxa"/>
+            <w:tcW w:w="5040" w:type="dxa"/>
           </w:tcPr>
           <w:p>
             <w:pPr>
@@ -2032,7 +2100,7 @@
         </w:tc>
         <w:tc>
           <w:tcPr>
-            <w:tcW w:w="3120" w:type="dxa"/>
+            <w:tcW w:w="2160" w:type="dxa"/>
           </w:tcPr>
           <w:p>
             <w:pPr>
@@ -2059,16 +2127,6 @@
       </w:pPr>
       <w:r>
         <w:t>4. Gate Data Guard</w:t>
-      </w:r>
-    </w:p>
-    <w:p>
-      <w:r>
-        <w:t>SHOW CONFIGURATION;</w:t>
-      </w:r>
-    </w:p>
-    <w:p>
-      <w:r>
-        <w:t>VALIDATE DATABASE M24SHAMSPEC;</w:t>
       </w:r>
     </w:p>
     <w:p>
@@ -2085,7 +2143,71 @@
           <w:rFonts w:ascii="Consolas" w:hAnsi="Consolas"/>
           <w:sz w:val="14"/>
         </w:rPr>
-        <w:t>VALIDATE DATABASE M24SHAMSSEC;</w:t>
+        <w:t>SHOW CONFIGURATION;</w:t>
+      </w:r>
+      <w:r>
+        <w:rPr>
+          <w:rFonts w:ascii="Consolas" w:hAnsi="Consolas"/>
+          <w:sz w:val="14"/>
+        </w:rPr>
+        <w:br/>
+        <w:t>SHOW DATABASE VERBOSE 'M24SHAMSPEC';</w:t>
+      </w:r>
+      <w:r>
+        <w:rPr>
+          <w:rFonts w:ascii="Consolas" w:hAnsi="Consolas"/>
+          <w:sz w:val="14"/>
+        </w:rPr>
+        <w:br/>
+        <w:t>SHOW DATABASE VERBOSE 'M24SHAMSSEC';</w:t>
+      </w:r>
+      <w:r>
+        <w:rPr>
+          <w:rFonts w:ascii="Consolas" w:hAnsi="Consolas"/>
+          <w:sz w:val="14"/>
+        </w:rPr>
+        <w:br/>
+        <w:t>VALIDATE DATABASE 'M24SHAMSPEC';</w:t>
+      </w:r>
+      <w:r>
+        <w:rPr>
+          <w:rFonts w:ascii="Consolas" w:hAnsi="Consolas"/>
+          <w:sz w:val="14"/>
+        </w:rPr>
+        <w:br/>
+        <w:t>VALIDATE DATABASE 'M24SHAMSSEC';</w:t>
+      </w:r>
+      <w:r>
+        <w:rPr>
+          <w:rFonts w:ascii="Consolas" w:hAnsi="Consolas"/>
+          <w:sz w:val="14"/>
+        </w:rPr>
+        <w:br/>
+        <w:t>VALIDATE DATABASE 'M24SHAMSPEC' SPFILE;</w:t>
+      </w:r>
+      <w:r>
+        <w:rPr>
+          <w:rFonts w:ascii="Consolas" w:hAnsi="Consolas"/>
+          <w:sz w:val="14"/>
+        </w:rPr>
+        <w:br/>
+        <w:t>VALIDATE DATABASE 'M24SHAMSSEC' SPFILE;</w:t>
+      </w:r>
+      <w:r>
+        <w:rPr>
+          <w:rFonts w:ascii="Consolas" w:hAnsi="Consolas"/>
+          <w:sz w:val="14"/>
+        </w:rPr>
+        <w:br/>
+        <w:t>VALIDATE NETWORK CONFIGURATION FOR ALL;</w:t>
+      </w:r>
+      <w:r>
+        <w:rPr>
+          <w:rFonts w:ascii="Consolas" w:hAnsi="Consolas"/>
+          <w:sz w:val="14"/>
+        </w:rPr>
+        <w:br/>
+        <w:t>VALIDATE STATIC CONNECT IDENTIFIER FOR ALL;</w:t>
       </w:r>
     </w:p>
     <w:p>
@@ -2102,7 +2224,7 @@
         </w:numPr>
       </w:pPr>
       <w:r>
-        <w:t>redo transport;</w:t>
+        <w:t>nome Broker stabile DR_&lt;DB_NAME&gt;&lt;ENV&gt;_CONF, mai legato al sito PE o SE;</w:t>
       </w:r>
     </w:p>
     <w:p>
@@ -2114,7 +2236,7 @@
         </w:numPr>
       </w:pPr>
       <w:r>
-        <w:t>apply;</w:t>
+        <w:t>redo transport;</w:t>
       </w:r>
     </w:p>
     <w:p>
@@ -2126,7 +2248,7 @@
         </w:numPr>
       </w:pPr>
       <w:r>
-        <w:t>lag;</w:t>
+        <w:t>apply;</w:t>
       </w:r>
     </w:p>
     <w:p>
@@ -2138,7 +2260,7 @@
         </w:numPr>
       </w:pPr>
       <w:r>
-        <w:t>SRL;</w:t>
+        <w:t>lag;</w:t>
       </w:r>
     </w:p>
     <w:p>
@@ -2150,7 +2272,7 @@
         </w:numPr>
       </w:pPr>
       <w:r>
-        <w:t>TDE;</w:t>
+        <w:t>SRL;</w:t>
       </w:r>
     </w:p>
     <w:p>
@@ -2162,7 +2284,7 @@
         </w:numPr>
       </w:pPr>
       <w:r>
-        <w:t>servizi role-based; _RO solo se ADG autorizzato;</w:t>
+        <w:t>TDE;</w:t>
       </w:r>
     </w:p>
     <w:p>
@@ -2174,7 +2296,7 @@
         </w:numPr>
       </w:pPr>
       <w:r>
-        <w:t>backup RMAN standby;</w:t>
+        <w:t>servizi role-based; _RO solo se ADG autorizzato;</w:t>
       </w:r>
     </w:p>
     <w:p>
@@ -2186,6 +2308,18 @@
         </w:numPr>
       </w:pPr>
       <w:r>
+        <w:t>backup RMAN standby;</w:t>
+      </w:r>
+    </w:p>
+    <w:p>
+      <w:pPr>
+        <w:pStyle w:val="ListParagraph"/>
+        <w:numPr>
+          <w:ilvl w:val="0"/>
+          <w:numId w:val="1"/>
+        </w:numPr>
+      </w:pPr>
+      <w:r>
         <w:t>switchover e switchback.</w:t>
       </w:r>
     </w:p>
@@ -2205,21 +2339,6 @@
     <w:p>
       <w:r>
         <w:t>Observer FSFO PEYTECH:</w:t>
-      </w:r>
-    </w:p>
-    <w:p>
-      <w:r>
-        <w:t>ENABLE FAST_START FAILOVER OBSERVE ONLY;</w:t>
-      </w:r>
-    </w:p>
-    <w:p>
-      <w:r>
-        <w:t>VALIDATE FAST_START FAILOVER;</w:t>
-      </w:r>
-    </w:p>
-    <w:p>
-      <w:r>
-        <w:t>SHOW FAST_START FAILOVER;</w:t>
       </w:r>
     </w:p>
     <w:p>
@@ -2236,6 +2355,30 @@
           <w:rFonts w:ascii="Consolas" w:hAnsi="Consolas"/>
           <w:sz w:val="14"/>
         </w:rPr>
+        <w:t>ENABLE FAST_START FAILOVER OBSERVE ONLY;</w:t>
+      </w:r>
+      <w:r>
+        <w:rPr>
+          <w:rFonts w:ascii="Consolas" w:hAnsi="Consolas"/>
+          <w:sz w:val="14"/>
+        </w:rPr>
+        <w:br/>
+        <w:t>VALIDATE FAST_START FAILOVER;</w:t>
+      </w:r>
+      <w:r>
+        <w:rPr>
+          <w:rFonts w:ascii="Consolas" w:hAnsi="Consolas"/>
+          <w:sz w:val="14"/>
+        </w:rPr>
+        <w:br/>
+        <w:t>SHOW FAST_START FAILOVER;</w:t>
+      </w:r>
+      <w:r>
+        <w:rPr>
+          <w:rFonts w:ascii="Consolas" w:hAnsi="Consolas"/>
+          <w:sz w:val="14"/>
+        </w:rPr>
+        <w:br/>
         <w:t>SHOW OBSERVER;</w:t>
       </w:r>
     </w:p>
@@ -2249,7 +2392,6 @@
         <w:pStyle w:val="Heading1"/>
       </w:pPr>
       <w:r>
-        <w:lastRenderedPageBreak/>
         <w:t>Validazione finale</w:t>
       </w:r>
     </w:p>
@@ -2268,17 +2410,14 @@
         <w:tblLook w:val="04A0" w:firstRow="1" w:lastRow="0" w:firstColumn="1" w:lastColumn="0" w:noHBand="0" w:noVBand="1"/>
       </w:tblPr>
       <w:tblGrid>
-        <w:gridCol w:w="4680"/>
-        <w:gridCol w:w="4680"/>
+        <w:gridCol w:w="2700"/>
+        <w:gridCol w:w="6660"/>
       </w:tblGrid>
       <w:tr>
-        <w:trPr>
-          <w:tblHeader/>
-        </w:trPr>
-        <w:tc>
-          <w:tcPr>
-            <w:tcW w:w="4680" w:type="dxa"/>
-            <w:shd w:val="clear" w:color="auto" w:fill="E6E6E6"/>
+        <w:tc>
+          <w:tcPr>
+            <w:tcW w:w="2700" w:type="dxa"/>
+            <w:shd w:val="clear" w:color="auto" w:fill="E8EEF5"/>
           </w:tcPr>
           <w:p>
             <w:pPr>
@@ -2300,8 +2439,8 @@
         </w:tc>
         <w:tc>
           <w:tcPr>
-            <w:tcW w:w="4680" w:type="dxa"/>
-            <w:shd w:val="clear" w:color="auto" w:fill="E6E6E6"/>
+            <w:tcW w:w="6660" w:type="dxa"/>
+            <w:shd w:val="clear" w:color="auto" w:fill="E8EEF5"/>
           </w:tcPr>
           <w:p>
             <w:pPr>
@@ -2325,7 +2464,7 @@
       <w:tr>
         <w:tc>
           <w:tcPr>
-            <w:tcW w:w="4680" w:type="dxa"/>
+            <w:tcW w:w="2700" w:type="dxa"/>
           </w:tcPr>
           <w:p>
             <w:pPr>
@@ -2345,7 +2484,7 @@
         </w:tc>
         <w:tc>
           <w:tcPr>
-            <w:tcW w:w="4680" w:type="dxa"/>
+            <w:tcW w:w="6660" w:type="dxa"/>
           </w:tcPr>
           <w:p>
             <w:pPr>
@@ -2367,7 +2506,7 @@
       <w:tr>
         <w:tc>
           <w:tcPr>
-            <w:tcW w:w="4680" w:type="dxa"/>
+            <w:tcW w:w="2700" w:type="dxa"/>
           </w:tcPr>
           <w:p>
             <w:pPr>
@@ -2387,7 +2526,7 @@
         </w:tc>
         <w:tc>
           <w:tcPr>
-            <w:tcW w:w="4680" w:type="dxa"/>
+            <w:tcW w:w="6660" w:type="dxa"/>
           </w:tcPr>
           <w:p>
             <w:pPr>
@@ -2409,7 +2548,7 @@
       <w:tr>
         <w:tc>
           <w:tcPr>
-            <w:tcW w:w="4680" w:type="dxa"/>
+            <w:tcW w:w="2700" w:type="dxa"/>
           </w:tcPr>
           <w:p>
             <w:pPr>
@@ -2429,7 +2568,7 @@
         </w:tc>
         <w:tc>
           <w:tcPr>
-            <w:tcW w:w="4680" w:type="dxa"/>
+            <w:tcW w:w="6660" w:type="dxa"/>
           </w:tcPr>
           <w:p>
             <w:pPr>
@@ -2451,7 +2590,7 @@
       <w:tr>
         <w:tc>
           <w:tcPr>
-            <w:tcW w:w="4680" w:type="dxa"/>
+            <w:tcW w:w="2700" w:type="dxa"/>
           </w:tcPr>
           <w:p>
             <w:pPr>
@@ -2471,7 +2610,7 @@
         </w:tc>
         <w:tc>
           <w:tcPr>
-            <w:tcW w:w="4680" w:type="dxa"/>
+            <w:tcW w:w="6660" w:type="dxa"/>
           </w:tcPr>
           <w:p>
             <w:pPr>
@@ -2493,7 +2632,7 @@
       <w:tr>
         <w:tc>
           <w:tcPr>
-            <w:tcW w:w="4680" w:type="dxa"/>
+            <w:tcW w:w="2700" w:type="dxa"/>
           </w:tcPr>
           <w:p>
             <w:pPr>
@@ -2513,7 +2652,7 @@
         </w:tc>
         <w:tc>
           <w:tcPr>
-            <w:tcW w:w="4680" w:type="dxa"/>
+            <w:tcW w:w="6660" w:type="dxa"/>
           </w:tcPr>
           <w:p>
             <w:pPr>
@@ -2535,7 +2674,7 @@
       <w:tr>
         <w:tc>
           <w:tcPr>
-            <w:tcW w:w="4680" w:type="dxa"/>
+            <w:tcW w:w="2700" w:type="dxa"/>
           </w:tcPr>
           <w:p>
             <w:pPr>
@@ -2555,7 +2694,7 @@
         </w:tc>
         <w:tc>
           <w:tcPr>
-            <w:tcW w:w="4680" w:type="dxa"/>
+            <w:tcW w:w="6660" w:type="dxa"/>
           </w:tcPr>
           <w:p>
             <w:pPr>
@@ -2577,7 +2716,7 @@
       <w:tr>
         <w:tc>
           <w:tcPr>
-            <w:tcW w:w="4680" w:type="dxa"/>
+            <w:tcW w:w="2700" w:type="dxa"/>
           </w:tcPr>
           <w:p>
             <w:pPr>
@@ -2597,7 +2736,7 @@
         </w:tc>
         <w:tc>
           <w:tcPr>
-            <w:tcW w:w="4680" w:type="dxa"/>
+            <w:tcW w:w="6660" w:type="dxa"/>
           </w:tcPr>
           <w:p>
             <w:pPr>
@@ -2619,7 +2758,7 @@
       <w:tr>
         <w:tc>
           <w:tcPr>
-            <w:tcW w:w="4680" w:type="dxa"/>
+            <w:tcW w:w="2700" w:type="dxa"/>
           </w:tcPr>
           <w:p>
             <w:pPr>
@@ -2639,7 +2778,7 @@
         </w:tc>
         <w:tc>
           <w:tcPr>
-            <w:tcW w:w="4680" w:type="dxa"/>
+            <w:tcW w:w="6660" w:type="dxa"/>
           </w:tcPr>
           <w:p>
             <w:pPr>
@@ -2671,21 +2810,6 @@
     <w:p>
       <w:r>
         <w:t>Se la rete non supporta il profilo sincrono:</w:t>
-      </w:r>
-    </w:p>
-    <w:p>
-      <w:r>
-        <w:t>DISABLE FAST_START FAILOVER;</w:t>
-      </w:r>
-    </w:p>
-    <w:p>
-      <w:r>
-        <w:t>EDIT CONFIGURATION SET PROTECTION MODE AS MAXPERFORMANCE;</w:t>
-      </w:r>
-    </w:p>
-    <w:p>
-      <w:r>
-        <w:t>EDIT DATABASE M24SHAMSSEC SET PROPERTY LogXptMode='ASYNC';</w:t>
       </w:r>
     </w:p>
     <w:p>
@@ -2702,6 +2826,30 @@
           <w:rFonts w:ascii="Consolas" w:hAnsi="Consolas"/>
           <w:sz w:val="14"/>
         </w:rPr>
+        <w:t>DISABLE FAST_START FAILOVER;</w:t>
+      </w:r>
+      <w:r>
+        <w:rPr>
+          <w:rFonts w:ascii="Consolas" w:hAnsi="Consolas"/>
+          <w:sz w:val="14"/>
+        </w:rPr>
+        <w:br/>
+        <w:t>EDIT CONFIGURATION SET PROTECTION MODE AS MAXPERFORMANCE;</w:t>
+      </w:r>
+      <w:r>
+        <w:rPr>
+          <w:rFonts w:ascii="Consolas" w:hAnsi="Consolas"/>
+          <w:sz w:val="14"/>
+        </w:rPr>
+        <w:br/>
+        <w:t>EDIT DATABASE M24SHAMSSEC SET PROPERTY LogXptMode='ASYNC';</w:t>
+      </w:r>
+      <w:r>
+        <w:rPr>
+          <w:rFonts w:ascii="Consolas" w:hAnsi="Consolas"/>
+          <w:sz w:val="14"/>
+        </w:rPr>
+        <w:br/>
         <w:t>SHOW CONFIGURATION;</w:t>
       </w:r>
     </w:p>
@@ -2728,17 +2876,14 @@
         <w:tblLook w:val="04A0" w:firstRow="1" w:lastRow="0" w:firstColumn="1" w:lastColumn="0" w:noHBand="0" w:noVBand="1"/>
       </w:tblPr>
       <w:tblGrid>
-        <w:gridCol w:w="4680"/>
-        <w:gridCol w:w="4680"/>
+        <w:gridCol w:w="2700"/>
+        <w:gridCol w:w="6660"/>
       </w:tblGrid>
       <w:tr>
-        <w:trPr>
-          <w:tblHeader/>
-        </w:trPr>
-        <w:tc>
-          <w:tcPr>
-            <w:tcW w:w="4680" w:type="dxa"/>
-            <w:shd w:val="clear" w:color="auto" w:fill="E6E6E6"/>
+        <w:tc>
+          <w:tcPr>
+            <w:tcW w:w="2700" w:type="dxa"/>
+            <w:shd w:val="clear" w:color="auto" w:fill="E8EEF5"/>
           </w:tcPr>
           <w:p>
             <w:pPr>
@@ -2760,8 +2905,8 @@
         </w:tc>
         <w:tc>
           <w:tcPr>
-            <w:tcW w:w="4680" w:type="dxa"/>
-            <w:shd w:val="clear" w:color="auto" w:fill="E6E6E6"/>
+            <w:tcW w:w="6660" w:type="dxa"/>
+            <w:shd w:val="clear" w:color="auto" w:fill="E8EEF5"/>
           </w:tcPr>
           <w:p>
             <w:pPr>
@@ -2785,7 +2930,7 @@
       <w:tr>
         <w:tc>
           <w:tcPr>
-            <w:tcW w:w="4680" w:type="dxa"/>
+            <w:tcW w:w="2700" w:type="dxa"/>
           </w:tcPr>
           <w:p>
             <w:pPr>
@@ -2805,7 +2950,7 @@
         </w:tc>
         <w:tc>
           <w:tcPr>
-            <w:tcW w:w="4680" w:type="dxa"/>
+            <w:tcW w:w="6660" w:type="dxa"/>
           </w:tcPr>
           <w:p>
             <w:pPr>
@@ -2827,7 +2972,7 @@
       <w:tr>
         <w:tc>
           <w:tcPr>
-            <w:tcW w:w="4680" w:type="dxa"/>
+            <w:tcW w:w="2700" w:type="dxa"/>
           </w:tcPr>
           <w:p>
             <w:pPr>
@@ -2847,7 +2992,7 @@
         </w:tc>
         <w:tc>
           <w:tcPr>
-            <w:tcW w:w="4680" w:type="dxa"/>
+            <w:tcW w:w="6660" w:type="dxa"/>
           </w:tcPr>
           <w:p>
             <w:pPr>
@@ -2869,7 +3014,7 @@
       <w:tr>
         <w:tc>
           <w:tcPr>
-            <w:tcW w:w="4680" w:type="dxa"/>
+            <w:tcW w:w="2700" w:type="dxa"/>
           </w:tcPr>
           <w:p>
             <w:pPr>
@@ -2889,7 +3034,7 @@
         </w:tc>
         <w:tc>
           <w:tcPr>
-            <w:tcW w:w="4680" w:type="dxa"/>
+            <w:tcW w:w="6660" w:type="dxa"/>
           </w:tcPr>
           <w:p>
             <w:pPr>
@@ -2911,7 +3056,7 @@
       <w:tr>
         <w:tc>
           <w:tcPr>
-            <w:tcW w:w="4680" w:type="dxa"/>
+            <w:tcW w:w="2700" w:type="dxa"/>
           </w:tcPr>
           <w:p>
             <w:pPr>
@@ -2931,7 +3076,7 @@
         </w:tc>
         <w:tc>
           <w:tcPr>
-            <w:tcW w:w="4680" w:type="dxa"/>
+            <w:tcW w:w="6660" w:type="dxa"/>
           </w:tcPr>
           <w:p>
             <w:pPr>
@@ -2953,7 +3098,7 @@
       <w:tr>
         <w:tc>
           <w:tcPr>
-            <w:tcW w:w="4680" w:type="dxa"/>
+            <w:tcW w:w="2700" w:type="dxa"/>
           </w:tcPr>
           <w:p>
             <w:pPr>
@@ -2973,7 +3118,7 @@
         </w:tc>
         <w:tc>
           <w:tcPr>
-            <w:tcW w:w="4680" w:type="dxa"/>
+            <w:tcW w:w="6660" w:type="dxa"/>
           </w:tcPr>
           <w:p>
             <w:pPr>
@@ -2993,7 +3138,6 @@
         </w:tc>
       </w:tr>
     </w:tbl>
-    <w:p/>
     <w:p/>
     <w:sectPr>
       <w:headerReference w:type="even" r:id="rId7"/>
@@ -3060,7 +3204,16 @@
       <w:fldChar w:fldCharType="begin"/>
     </w:r>
     <w:r>
-      <w:instrText xml:space="preserve">  \* MERGEFORMAT </w:instrText>
+      <w:instrText xml:space="preserve"> PAGE  \* MERGEFORMAT </w:instrText>
+    </w:r>
+    <w:r>
+      <w:fldChar w:fldCharType="separate"/>
+    </w:r>
+    <w:r>
+      <w:rPr>
+        <w:noProof/>
+      </w:rPr>
+      <w:t>1</w:t>
     </w:r>
     <w:r>
       <w:fldChar w:fldCharType="end"/>
@@ -3149,7 +3302,7 @@
 <file path=word/numbering.xml><?xml version="1.0" encoding="utf-8"?>
 <w:numbering xmlns:wpc="http://schemas.microsoft.com/office/word/2010/wordprocessingCanvas" xmlns:cx="http://schemas.microsoft.com/office/drawing/2014/chartex" xmlns:cx1="http://schemas.microsoft.com/office/drawing/2015/9/8/chartex" xmlns:cx2="http://schemas.microsoft.com/office/drawing/2015/10/21/chartex" xmlns:cx3="http://schemas.microsoft.com/office/drawing/2016/5/9/chartex" xmlns:cx4="http://schemas.microsoft.com/office/drawing/2016/5/10/chartex" xmlns:cx5="http://schemas.microsoft.com/office/drawing/2016/5/11/chartex" xmlns:cx6="http://schemas.microsoft.com/office/drawing/2016/5/12/chartex" xmlns:cx7="http://schemas.microsoft.com/office/drawing/2016/5/13/chartex" xmlns:cx8="http://schemas.microsoft.com/office/drawing/2016/5/14/chartex" xmlns:mc="http://schemas.openxmlformats.org/markup-compatibility/2006" xmlns:aink="http://schemas.microsoft.com/office/drawing/2016/ink" xmlns:am3d="http://schemas.microsoft.com/office/drawing/2017/model3d" xmlns:o="urn:schemas-microsoft-com:office:office" xmlns:oel="http://schemas.microsoft.com/office/2019/extlst" xmlns:r="http://schemas.openxmlformats.org/officeDocument/2006/relationships" xmlns:m="http://schemas.openxmlformats.org/officeDocument/2006/math" xmlns:v="urn:schemas-microsoft-com:vml" xmlns:wp14="http://schemas.microsoft.com/office/word/2010/wordprocessingDrawing" xmlns:wp="http://schemas.openxmlformats.org/drawingml/2006/wordprocessingDrawing" xmlns:w10="urn:schemas-microsoft-com:office:word" xmlns:w="http://schemas.openxmlformats.org/wordprocessingml/2006/main" xmlns:w14="http://schemas.microsoft.com/office/word/2010/wordml" xmlns:w15="http://schemas.microsoft.com/office/word/2012/wordml" xmlns:w16cex="http://schemas.microsoft.com/office/word/2018/wordml/cex" xmlns:w16cid="http://schemas.microsoft.com/office/word/2016/wordml/cid" xmlns:w16="http://schemas.microsoft.com/office/word/2018/wordml" xmlns:w16du="http://schemas.microsoft.com/office/word/2023/wordml/word16du" xmlns:w16sdtdh="http://schemas.microsoft.com/office/word/2020/wordml/sdtdatahash" xmlns:w16sdtfl="http://schemas.microsoft.com/office/word/2024/wordml/sdtformatlock" xmlns:w16se="http://schemas.microsoft.com/office/word/2015/wordml/symex" xmlns:wpg="http://schemas.microsoft.com/office/word/2010/wordprocessingGroup" xmlns:wpi="http://schemas.microsoft.com/office/word/2010/wordprocessingInk" xmlns:wne="http://schemas.microsoft.com/office/word/2006/wordml" xmlns:wps="http://schemas.microsoft.com/office/word/2010/wordprocessingShape" mc:Ignorable="w14 w15 w16se w16cid w16 w16cex w16sdtdh w16sdtfl w16du wp14">
   <w:abstractNum w:abstractNumId="0" w15:restartNumberingAfterBreak="0">
-    <w:nsid w:val="14B3451A"/>
+    <w:nsid w:val="71187B4B"/>
     <w:multiLevelType w:val="singleLevel"/>
     <w:tmpl w:val="04100001"/>
     <w:lvl w:ilvl="0">
@@ -3165,7 +3318,7 @@
       </w:rPr>
     </w:lvl>
   </w:abstractNum>
-  <w:num w:numId="1" w16cid:durableId="1822429255">
+  <w:num w:numId="1" w16cid:durableId="737828872">
     <w:abstractNumId w:val="0"/>
   </w:num>
 </w:numbering>
@@ -3572,7 +3725,7 @@
     <w:name w:val="Normal"/>
     <w:qFormat/>
     <w:pPr>
-      <w:spacing w:after="120" w:line="300" w:lineRule="auto"/>
+      <w:spacing w:after="120" w:line="275" w:lineRule="auto"/>
     </w:pPr>
     <w:rPr>
       <w:rFonts w:ascii="Calibri" w:hAnsi="Calibri"/>
@@ -3586,7 +3739,7 @@
     <w:link w:val="Heading1Char"/>
     <w:uiPriority w:val="9"/>
     <w:qFormat/>
-    <w:rsid w:val="00E57496"/>
+    <w:rsid w:val="007F0000"/>
     <w:pPr>
       <w:keepNext/>
       <w:keepLines/>
@@ -3608,7 +3761,7 @@
     <w:uiPriority w:val="9"/>
     <w:unhideWhenUsed/>
     <w:qFormat/>
-    <w:rsid w:val="00E57496"/>
+    <w:rsid w:val="007F0000"/>
     <w:pPr>
       <w:keepNext/>
       <w:keepLines/>
@@ -3631,7 +3784,7 @@
     <w:semiHidden/>
     <w:unhideWhenUsed/>
     <w:qFormat/>
-    <w:rsid w:val="00E57496"/>
+    <w:rsid w:val="007F0000"/>
     <w:pPr>
       <w:keepNext/>
       <w:keepLines/>
@@ -3640,7 +3793,7 @@
     </w:pPr>
     <w:rPr>
       <w:rFonts w:eastAsiaTheme="majorEastAsia" w:cstheme="majorBidi"/>
-      <w:color w:val="2E74B5"/>
+      <w:color w:val="1F4D78"/>
       <w:sz w:val="24"/>
       <w:szCs w:val="28"/>
     </w:rPr>
@@ -3654,7 +3807,7 @@
     <w:semiHidden/>
     <w:unhideWhenUsed/>
     <w:qFormat/>
-    <w:rsid w:val="00E57496"/>
+    <w:rsid w:val="007F0000"/>
     <w:pPr>
       <w:keepNext/>
       <w:keepLines/>
@@ -3677,7 +3830,7 @@
     <w:semiHidden/>
     <w:unhideWhenUsed/>
     <w:qFormat/>
-    <w:rsid w:val="00E57496"/>
+    <w:rsid w:val="007F0000"/>
     <w:pPr>
       <w:keepNext/>
       <w:keepLines/>
@@ -3698,7 +3851,7 @@
     <w:semiHidden/>
     <w:unhideWhenUsed/>
     <w:qFormat/>
-    <w:rsid w:val="00E57496"/>
+    <w:rsid w:val="007F0000"/>
     <w:pPr>
       <w:keepNext/>
       <w:keepLines/>
@@ -3721,7 +3874,7 @@
     <w:semiHidden/>
     <w:unhideWhenUsed/>
     <w:qFormat/>
-    <w:rsid w:val="00E57496"/>
+    <w:rsid w:val="007F0000"/>
     <w:pPr>
       <w:keepNext/>
       <w:keepLines/>
@@ -3742,7 +3895,7 @@
     <w:semiHidden/>
     <w:unhideWhenUsed/>
     <w:qFormat/>
-    <w:rsid w:val="00E57496"/>
+    <w:rsid w:val="007F0000"/>
     <w:pPr>
       <w:keepNext/>
       <w:keepLines/>
@@ -3765,7 +3918,7 @@
     <w:semiHidden/>
     <w:unhideWhenUsed/>
     <w:qFormat/>
-    <w:rsid w:val="00E57496"/>
+    <w:rsid w:val="007F0000"/>
     <w:pPr>
       <w:keepNext/>
       <w:keepLines/>
@@ -3809,7 +3962,7 @@
     <w:basedOn w:val="DefaultParagraphFont"/>
     <w:link w:val="Heading1"/>
     <w:uiPriority w:val="9"/>
-    <w:rsid w:val="00E57496"/>
+    <w:rsid w:val="007F0000"/>
     <w:rPr>
       <w:rFonts w:ascii="Calibri" w:eastAsiaTheme="majorEastAsia" w:hAnsi="Calibri" w:cstheme="majorBidi"/>
       <w:color w:val="2E74B5"/>
@@ -3822,7 +3975,7 @@
     <w:basedOn w:val="DefaultParagraphFont"/>
     <w:link w:val="Heading2"/>
     <w:uiPriority w:val="9"/>
-    <w:rsid w:val="00E57496"/>
+    <w:rsid w:val="007F0000"/>
     <w:rPr>
       <w:rFonts w:ascii="Calibri" w:eastAsiaTheme="majorEastAsia" w:hAnsi="Calibri" w:cstheme="majorBidi"/>
       <w:color w:val="2E74B5"/>
@@ -3836,10 +3989,10 @@
     <w:link w:val="Heading3"/>
     <w:uiPriority w:val="9"/>
     <w:semiHidden/>
-    <w:rsid w:val="00E57496"/>
+    <w:rsid w:val="007F0000"/>
     <w:rPr>
       <w:rFonts w:ascii="Calibri" w:eastAsiaTheme="majorEastAsia" w:hAnsi="Calibri" w:cstheme="majorBidi"/>
-      <w:color w:val="2E74B5"/>
+      <w:color w:val="1F4D78"/>
       <w:szCs w:val="28"/>
     </w:rPr>
   </w:style>
@@ -3849,7 +4002,7 @@
     <w:link w:val="Heading4"/>
     <w:uiPriority w:val="9"/>
     <w:semiHidden/>
-    <w:rsid w:val="00E57496"/>
+    <w:rsid w:val="007F0000"/>
     <w:rPr>
       <w:rFonts w:eastAsiaTheme="majorEastAsia" w:cstheme="majorBidi"/>
       <w:i/>
@@ -3863,7 +4016,7 @@
     <w:link w:val="Heading5"/>
     <w:uiPriority w:val="9"/>
     <w:semiHidden/>
-    <w:rsid w:val="00E57496"/>
+    <w:rsid w:val="007F0000"/>
     <w:rPr>
       <w:rFonts w:eastAsiaTheme="majorEastAsia" w:cstheme="majorBidi"/>
       <w:color w:val="0F4761" w:themeColor="accent1" w:themeShade="BF"/>
@@ -3875,7 +4028,7 @@
     <w:link w:val="Heading6"/>
     <w:uiPriority w:val="9"/>
     <w:semiHidden/>
-    <w:rsid w:val="00E57496"/>
+    <w:rsid w:val="007F0000"/>
     <w:rPr>
       <w:rFonts w:eastAsiaTheme="majorEastAsia" w:cstheme="majorBidi"/>
       <w:i/>
@@ -3889,7 +4042,7 @@
     <w:link w:val="Heading7"/>
     <w:uiPriority w:val="9"/>
     <w:semiHidden/>
-    <w:rsid w:val="00E57496"/>
+    <w:rsid w:val="007F0000"/>
     <w:rPr>
       <w:rFonts w:eastAsiaTheme="majorEastAsia" w:cstheme="majorBidi"/>
       <w:color w:val="595959" w:themeColor="text1" w:themeTint="A6"/>
@@ -3901,7 +4054,7 @@
     <w:link w:val="Heading8"/>
     <w:uiPriority w:val="9"/>
     <w:semiHidden/>
-    <w:rsid w:val="00E57496"/>
+    <w:rsid w:val="007F0000"/>
     <w:rPr>
       <w:rFonts w:eastAsiaTheme="majorEastAsia" w:cstheme="majorBidi"/>
       <w:i/>
@@ -3915,7 +4068,7 @@
     <w:link w:val="Heading9"/>
     <w:uiPriority w:val="9"/>
     <w:semiHidden/>
-    <w:rsid w:val="00E57496"/>
+    <w:rsid w:val="007F0000"/>
     <w:rPr>
       <w:rFonts w:eastAsiaTheme="majorEastAsia" w:cstheme="majorBidi"/>
       <w:color w:val="272727" w:themeColor="text1" w:themeTint="D8"/>
@@ -3928,8 +4081,9 @@
     <w:link w:val="TitleChar"/>
     <w:uiPriority w:val="10"/>
     <w:qFormat/>
-    <w:rsid w:val="00E57496"/>
+    <w:rsid w:val="007F0000"/>
     <w:pPr>
+      <w:keepNext/>
       <w:spacing w:after="240" w:line="240" w:lineRule="auto"/>
       <w:contextualSpacing/>
     </w:pPr>
@@ -3947,7 +4101,7 @@
     <w:basedOn w:val="DefaultParagraphFont"/>
     <w:link w:val="Title"/>
     <w:uiPriority w:val="10"/>
-    <w:rsid w:val="00E57496"/>
+    <w:rsid w:val="007F0000"/>
     <w:rPr>
       <w:rFonts w:ascii="Calibri" w:eastAsiaTheme="majorEastAsia" w:hAnsi="Calibri" w:cstheme="majorBidi"/>
       <w:color w:val="2E74B5"/>
@@ -3964,7 +4118,7 @@
     <w:link w:val="SubtitleChar"/>
     <w:uiPriority w:val="11"/>
     <w:qFormat/>
-    <w:rsid w:val="00E57496"/>
+    <w:rsid w:val="007F0000"/>
     <w:pPr>
       <w:numPr>
         <w:ilvl w:val="1"/>
@@ -3983,7 +4137,7 @@
     <w:basedOn w:val="DefaultParagraphFont"/>
     <w:link w:val="Subtitle"/>
     <w:uiPriority w:val="11"/>
-    <w:rsid w:val="00E57496"/>
+    <w:rsid w:val="007F0000"/>
     <w:rPr>
       <w:rFonts w:eastAsiaTheme="majorEastAsia" w:cstheme="majorBidi"/>
       <w:color w:val="595959" w:themeColor="text1" w:themeTint="A6"/>
@@ -3999,7 +4153,7 @@
     <w:link w:val="QuoteChar"/>
     <w:uiPriority w:val="29"/>
     <w:qFormat/>
-    <w:rsid w:val="00E57496"/>
+    <w:rsid w:val="007F0000"/>
     <w:pPr>
       <w:spacing w:before="160"/>
       <w:jc w:val="center"/>
@@ -4015,7 +4169,7 @@
     <w:basedOn w:val="DefaultParagraphFont"/>
     <w:link w:val="Quote"/>
     <w:uiPriority w:val="29"/>
-    <w:rsid w:val="00E57496"/>
+    <w:rsid w:val="007F0000"/>
     <w:rPr>
       <w:i/>
       <w:iCs/>
@@ -4027,7 +4181,7 @@
     <w:basedOn w:val="Normal"/>
     <w:uiPriority w:val="34"/>
     <w:qFormat/>
-    <w:rsid w:val="00E57496"/>
+    <w:rsid w:val="007F0000"/>
     <w:pPr>
       <w:ind w:left="720"/>
       <w:contextualSpacing/>
@@ -4038,7 +4192,7 @@
     <w:basedOn w:val="DefaultParagraphFont"/>
     <w:uiPriority w:val="21"/>
     <w:qFormat/>
-    <w:rsid w:val="00E57496"/>
+    <w:rsid w:val="007F0000"/>
     <w:rPr>
       <w:i/>
       <w:iCs/>
@@ -4052,7 +4206,7 @@
     <w:link w:val="IntenseQuoteChar"/>
     <w:uiPriority w:val="30"/>
     <w:qFormat/>
-    <w:rsid w:val="00E57496"/>
+    <w:rsid w:val="007F0000"/>
     <w:pPr>
       <w:pBdr>
         <w:top w:val="single" w:sz="4" w:space="10" w:color="0F4761" w:themeColor="accent1" w:themeShade="BF"/>
@@ -4073,7 +4227,7 @@
     <w:basedOn w:val="DefaultParagraphFont"/>
     <w:link w:val="IntenseQuote"/>
     <w:uiPriority w:val="30"/>
-    <w:rsid w:val="00E57496"/>
+    <w:rsid w:val="007F0000"/>
     <w:rPr>
       <w:i/>
       <w:iCs/>
@@ -4085,7 +4239,7 @@
     <w:basedOn w:val="DefaultParagraphFont"/>
     <w:uiPriority w:val="32"/>
     <w:qFormat/>
-    <w:rsid w:val="00E57496"/>
+    <w:rsid w:val="007F0000"/>
     <w:rPr>
       <w:b/>
       <w:bCs/>
@@ -4100,7 +4254,7 @@
     <w:link w:val="HeaderChar"/>
     <w:uiPriority w:val="99"/>
     <w:unhideWhenUsed/>
-    <w:rsid w:val="00E57496"/>
+    <w:rsid w:val="007F0000"/>
     <w:pPr>
       <w:tabs>
         <w:tab w:val="center" w:pos="4513"/>
@@ -4114,7 +4268,7 @@
     <w:basedOn w:val="DefaultParagraphFont"/>
     <w:link w:val="Header"/>
     <w:uiPriority w:val="99"/>
-    <w:rsid w:val="00E57496"/>
+    <w:rsid w:val="007F0000"/>
     <w:rPr>
       <w:rFonts w:ascii="Calibri" w:hAnsi="Calibri"/>
       <w:sz w:val="22"/>
@@ -4126,7 +4280,7 @@
     <w:link w:val="FooterChar"/>
     <w:uiPriority w:val="99"/>
     <w:unhideWhenUsed/>
-    <w:rsid w:val="00E57496"/>
+    <w:rsid w:val="007F0000"/>
     <w:pPr>
       <w:tabs>
         <w:tab w:val="center" w:pos="4513"/>
@@ -4140,7 +4294,7 @@
     <w:basedOn w:val="DefaultParagraphFont"/>
     <w:link w:val="Footer"/>
     <w:uiPriority w:val="99"/>
-    <w:rsid w:val="00E57496"/>
+    <w:rsid w:val="007F0000"/>
     <w:rPr>
       <w:rFonts w:ascii="Calibri" w:hAnsi="Calibri"/>
       <w:sz w:val="22"/>
@@ -4150,7 +4304,7 @@
     <w:name w:val="Table Grid"/>
     <w:basedOn w:val="TableNormal"/>
     <w:uiPriority w:val="39"/>
-    <w:rsid w:val="00E57496"/>
+    <w:rsid w:val="007F0000"/>
     <w:pPr>
       <w:spacing w:after="0" w:line="240" w:lineRule="auto"/>
     </w:pPr>

</xml_diff>